<commit_message>
Documento Word completo: tablas detalladas, formato profesional, contenido exhaustivo
</commit_message>
<xml_diff>
--- a/PRESENTACION_PROYECTO.docx
+++ b/PRESENTACION_PROYECTO.docx
@@ -2,17 +2,15 @@
 <file path=word/document.xml><?xml version="1.0" encoding="utf-8"?>
 <w:document xmlns:wpc="http://schemas.microsoft.com/office/word/2010/wordprocessingCanvas" xmlns:mo="http://schemas.microsoft.com/office/mac/office/2008/main" xmlns:mc="http://schemas.openxmlformats.org/markup-compatibility/2006" xmlns:mv="urn:schemas-microsoft-com:mac:vml" xmlns:o="urn:schemas-microsoft-com:office:office" xmlns:r="http://schemas.openxmlformats.org/officeDocument/2006/relationships" xmlns:m="http://schemas.openxmlformats.org/officeDocument/2006/math" xmlns:v="urn:schemas-microsoft-com:vml" xmlns:wp14="http://schemas.microsoft.com/office/word/2010/wordprocessingDrawing" xmlns:wp="http://schemas.openxmlformats.org/drawingml/2006/wordprocessingDrawing" xmlns:w10="urn:schemas-microsoft-com:office:word" xmlns:w="http://schemas.openxmlformats.org/wordprocessingml/2006/main" xmlns:w14="http://schemas.microsoft.com/office/word/2010/wordml" xmlns:wpg="http://schemas.microsoft.com/office/word/2010/wordprocessingGroup" xmlns:wpi="http://schemas.microsoft.com/office/word/2010/wordprocessingInk" xmlns:wne="http://schemas.microsoft.com/office/word/2006/wordml" xmlns:wps="http://schemas.microsoft.com/office/word/2010/wordprocessingShape" mc:Ignorable="w14 wp14">
   <w:body>
-    <w:p/>
     <w:p>
       <w:pPr>
-        <w:pStyle w:val="Title"/>
         <w:jc w:val="center"/>
       </w:pPr>
       <w:r>
         <w:rPr>
           <w:b/>
           <w:color w:val="003366"/>
-          <w:sz w:val="40"/>
+          <w:sz w:val="56"/>
         </w:rPr>
         <w:t>SIMULADOR DE SISTEMA OPERATIVO</w:t>
       </w:r>
@@ -25,9 +23,23 @@
       <w:r>
         <w:rPr>
           <w:color w:val="666666"/>
-          <w:sz w:val="32"/>
+          <w:sz w:val="40"/>
         </w:rPr>
         <w:t>Gestión de Memoria y Procesos</w:t>
+      </w:r>
+    </w:p>
+    <w:p/>
+    <w:p/>
+    <w:p>
+      <w:pPr>
+        <w:jc w:val="center"/>
+      </w:pPr>
+      <w:r>
+        <w:rPr>
+          <w:i/>
+          <w:sz w:val="28"/>
+        </w:rPr>
+        <w:t>Documentación Técnica Completa</w:t>
       </w:r>
     </w:p>
     <w:p>
@@ -40,13 +52,77 @@
         <w:pStyle w:val="Heading1"/>
       </w:pPr>
       <w:r>
+        <w:t>ÍNDICE</w:t>
+      </w:r>
+    </w:p>
+    <w:p>
+      <w:pPr>
+        <w:pStyle w:val="ListNumber"/>
+      </w:pPr>
+      <w:r>
         <w:rPr>
-          <w:color w:val="0066CC"/>
+          <w:sz w:val="22"/>
         </w:rPr>
         <w:t>1. EXPLICACIÓN DE LA ARQUITECTURA ASUMIDA</w:t>
       </w:r>
     </w:p>
-    <w:p/>
+    <w:p>
+      <w:pPr>
+        <w:pStyle w:val="ListNumber"/>
+      </w:pPr>
+      <w:r>
+        <w:rPr>
+          <w:sz w:val="22"/>
+        </w:rPr>
+        <w:t>2. REQUERIMIENTOS ATENDIDOS</w:t>
+      </w:r>
+    </w:p>
+    <w:p>
+      <w:pPr>
+        <w:pStyle w:val="ListNumber"/>
+      </w:pPr>
+      <w:r>
+        <w:rPr>
+          <w:sz w:val="22"/>
+        </w:rPr>
+        <w:t>3. DESARROLLO DE LA INTERFAZ GRÁFICA</w:t>
+      </w:r>
+    </w:p>
+    <w:p>
+      <w:pPr>
+        <w:pStyle w:val="ListNumber"/>
+      </w:pPr>
+      <w:r>
+        <w:rPr>
+          <w:sz w:val="22"/>
+        </w:rPr>
+        <w:t>4. DEMOSTRACIÓN DEL MÓDULO DESARROLLADO</w:t>
+      </w:r>
+    </w:p>
+    <w:p>
+      <w:pPr>
+        <w:pStyle w:val="ListNumber"/>
+      </w:pPr>
+      <w:r>
+        <w:rPr>
+          <w:sz w:val="22"/>
+        </w:rPr>
+        <w:t>5. RESUMEN EJECUTIVO</w:t>
+      </w:r>
+    </w:p>
+    <w:p>
+      <w:r>
+        <w:br w:type="page"/>
+      </w:r>
+    </w:p>
+    <w:p>
+      <w:pPr>
+        <w:pStyle w:val="Heading1"/>
+      </w:pPr>
+      <w:r>
+        <w:t>1. EXPLICACIÓN DE LA ARQUITECTURA ASUMIDA</w:t>
+      </w:r>
+    </w:p>
     <w:p>
       <w:pPr>
         <w:pStyle w:val="Heading2"/>
@@ -55,20 +131,64 @@
         <w:t>1.1 Tecnología Base</w:t>
       </w:r>
     </w:p>
+    <w:p/>
+    <w:p>
+      <w:r>
+        <w:rPr>
+          <w:b/>
+          <w:sz w:val="24"/>
+        </w:rPr>
+        <w:t>Especificaciones Técnicas:</w:t>
+      </w:r>
+    </w:p>
+    <w:p/>
     <w:tbl>
       <w:tblPr>
         <w:tblStyle w:val="LightGrid-Accent1"/>
         <w:tblW w:type="auto" w:w="0"/>
+        <w:jc w:val="center"/>
         <w:tblLook w:firstColumn="1" w:firstRow="1" w:lastColumn="0" w:lastRow="0" w:noHBand="0" w:noVBand="1" w:val="04A0"/>
       </w:tblPr>
       <w:tblGrid>
-        <w:gridCol w:w="4703"/>
-        <w:gridCol w:w="4703"/>
+        <w:gridCol w:w="4419"/>
+        <w:gridCol w:w="4419"/>
       </w:tblGrid>
       <w:tr>
         <w:tc>
           <w:tcPr>
-            <w:tcW w:type="dxa" w:w="4703"/>
+            <w:tcW w:type="dxa" w:w="4419"/>
+            <w:shd w:fill="4472C4"/>
+          </w:tcPr>
+          <w:p>
+            <w:r>
+              <w:rPr>
+                <w:b/>
+                <w:color w:val="FFFFFF"/>
+              </w:rPr>
+              <w:t>Componente</w:t>
+            </w:r>
+          </w:p>
+        </w:tc>
+        <w:tc>
+          <w:tcPr>
+            <w:tcW w:type="dxa" w:w="4419"/>
+            <w:shd w:fill="4472C4"/>
+          </w:tcPr>
+          <w:p>
+            <w:r>
+              <w:rPr>
+                <w:b/>
+                <w:color w:val="FFFFFF"/>
+              </w:rPr>
+              <w:t>Tecnología Utilizada</w:t>
+            </w:r>
+          </w:p>
+        </w:tc>
+      </w:tr>
+      <w:tr>
+        <w:tc>
+          <w:tcPr>
+            <w:tcW w:type="dxa" w:w="4419"/>
           </w:tcPr>
           <w:p>
             <w:r>
@@ -81,7 +201,7 @@
         </w:tc>
         <w:tc>
           <w:tcPr>
-            <w:tcW w:type="dxa" w:w="4703"/>
+            <w:tcW w:type="dxa" w:w="4419"/>
           </w:tcPr>
           <w:p>
             <w:r>
@@ -93,7 +213,7 @@
       <w:tr>
         <w:tc>
           <w:tcPr>
-            <w:tcW w:type="dxa" w:w="4703"/>
+            <w:tcW w:type="dxa" w:w="4419"/>
           </w:tcPr>
           <w:p>
             <w:r>
@@ -106,11 +226,11 @@
         </w:tc>
         <w:tc>
           <w:tcPr>
-            <w:tcW w:type="dxa" w:w="4703"/>
+            <w:tcW w:type="dxa" w:w="4419"/>
           </w:tcPr>
           <w:p>
             <w:r>
-              <w:t>Tkinter</w:t>
+              <w:t>Tkinter (interfaz de usuario)</w:t>
             </w:r>
           </w:p>
         </w:tc>
@@ -118,7 +238,7 @@
       <w:tr>
         <w:tc>
           <w:tcPr>
-            <w:tcW w:type="dxa" w:w="4703"/>
+            <w:tcW w:type="dxa" w:w="4419"/>
           </w:tcPr>
           <w:p>
             <w:r>
@@ -131,7 +251,7 @@
         </w:tc>
         <w:tc>
           <w:tcPr>
-            <w:tcW w:type="dxa" w:w="4703"/>
+            <w:tcW w:type="dxa" w:w="4419"/>
           </w:tcPr>
           <w:p>
             <w:r>
@@ -143,7 +263,7 @@
       <w:tr>
         <w:tc>
           <w:tcPr>
-            <w:tcW w:type="dxa" w:w="4703"/>
+            <w:tcW w:type="dxa" w:w="4419"/>
           </w:tcPr>
           <w:p>
             <w:r>
@@ -156,7 +276,7 @@
         </w:tc>
         <w:tc>
           <w:tcPr>
-            <w:tcW w:type="dxa" w:w="4703"/>
+            <w:tcW w:type="dxa" w:w="4419"/>
           </w:tcPr>
           <w:p>
             <w:r>
@@ -168,7 +288,7 @@
       <w:tr>
         <w:tc>
           <w:tcPr>
-            <w:tcW w:type="dxa" w:w="4703"/>
+            <w:tcW w:type="dxa" w:w="4419"/>
           </w:tcPr>
           <w:p>
             <w:r>
@@ -181,11 +301,61 @@
         </w:tc>
         <w:tc>
           <w:tcPr>
-            <w:tcW w:type="dxa" w:w="4703"/>
+            <w:tcW w:type="dxa" w:w="4419"/>
           </w:tcPr>
           <w:p>
             <w:r>
               <w:t>Coordinador Central (Mediator Pattern)</w:t>
+            </w:r>
+          </w:p>
+        </w:tc>
+      </w:tr>
+      <w:tr>
+        <w:tc>
+          <w:tcPr>
+            <w:tcW w:type="dxa" w:w="4419"/>
+          </w:tcPr>
+          <w:p>
+            <w:r>
+              <w:rPr>
+                <w:b/>
+              </w:rPr>
+              <w:t>Gestión de memoria</w:t>
+            </w:r>
+          </w:p>
+        </w:tc>
+        <w:tc>
+          <w:tcPr>
+            <w:tcW w:type="dxa" w:w="4419"/>
+          </w:tcPr>
+          <w:p>
+            <w:r>
+              <w:t>Asignación dinámica con 3 algoritmos</w:t>
+            </w:r>
+          </w:p>
+        </w:tc>
+      </w:tr>
+      <w:tr>
+        <w:tc>
+          <w:tcPr>
+            <w:tcW w:type="dxa" w:w="4419"/>
+          </w:tcPr>
+          <w:p>
+            <w:r>
+              <w:rPr>
+                <w:b/>
+              </w:rPr>
+              <w:t>Planificación</w:t>
+            </w:r>
+          </w:p>
+        </w:tc>
+        <w:tc>
+          <w:tcPr>
+            <w:tcW w:type="dxa" w:w="4419"/>
+          </w:tcPr>
+          <w:p>
+            <w:r>
+              <w:t>4 algoritmos implementados</w:t>
             </w:r>
           </w:p>
         </w:tc>
@@ -202,13 +372,32 @@
     </w:p>
     <w:p>
       <w:r>
-        <w:t>El sistema está estructurado en 8 módulos independientes que se comunican a través de un coordinador central:</w:t>
+        <w:rPr>
+          <w:b w:val="0"/>
+        </w:rPr>
+        <w:t xml:space="preserve">El sistema está estructurado en </w:t>
+      </w:r>
+      <w:r>
+        <w:rPr>
+          <w:b/>
+        </w:rPr>
+        <w:t>8 módulos independientes</w:t>
+      </w:r>
+      <w:r>
+        <w:rPr>
+          <w:b w:val="0"/>
+        </w:rPr>
+        <w:t xml:space="preserve"> que se comunican entre sí a través de un coordinador central.</w:t>
       </w:r>
     </w:p>
     <w:p/>
     <w:p>
       <w:r>
-        <w:t>Estructura modular del sistema:</w:t>
+        <w:rPr>
+          <w:b/>
+          <w:sz w:val="24"/>
+        </w:rPr>
+        <w:t>Estructura Modular del Sistema:</w:t>
       </w:r>
     </w:p>
     <w:p/>
@@ -216,23 +405,25 @@
       <w:tblPr>
         <w:tblStyle w:val="MediumGrid1-Accent1"/>
         <w:tblW w:type="auto" w:w="0"/>
+        <w:jc w:val="center"/>
         <w:tblLook w:firstColumn="1" w:firstRow="1" w:lastColumn="0" w:lastRow="0" w:noHBand="0" w:noVBand="1" w:val="04A0"/>
       </w:tblPr>
       <w:tblGrid>
-        <w:gridCol w:w="3135"/>
-        <w:gridCol w:w="3135"/>
-        <w:gridCol w:w="3135"/>
+        <w:gridCol w:w="2946"/>
+        <w:gridCol w:w="2946"/>
+        <w:gridCol w:w="2946"/>
       </w:tblGrid>
       <w:tr>
         <w:tc>
           <w:tcPr>
-            <w:tcW w:type="dxa" w:w="3135"/>
-            <w:shd w:fill="D9E1F2"/>
+            <w:tcW w:type="dxa" w:w="2946"/>
+            <w:shd w:fill="4472C4"/>
           </w:tcPr>
           <w:p>
             <w:r>
               <w:rPr>
                 <w:b/>
+                <w:color w:val="FFFFFF"/>
               </w:rPr>
               <w:t>Módulo</w:t>
             </w:r>
@@ -240,13 +431,14 @@
         </w:tc>
         <w:tc>
           <w:tcPr>
-            <w:tcW w:type="dxa" w:w="3135"/>
-            <w:shd w:fill="D9E1F2"/>
+            <w:tcW w:type="dxa" w:w="2946"/>
+            <w:shd w:fill="4472C4"/>
           </w:tcPr>
           <w:p>
             <w:r>
               <w:rPr>
                 <w:b/>
+                <w:color w:val="FFFFFF"/>
               </w:rPr>
               <w:t>Archivo</w:t>
             </w:r>
@@ -254,15 +446,16 @@
         </w:tc>
         <w:tc>
           <w:tcPr>
-            <w:tcW w:type="dxa" w:w="3135"/>
-            <w:shd w:fill="D9E1F2"/>
+            <w:tcW w:type="dxa" w:w="2946"/>
+            <w:shd w:fill="4472C4"/>
           </w:tcPr>
           <w:p>
             <w:r>
               <w:rPr>
                 <w:b/>
+                <w:color w:val="FFFFFF"/>
               </w:rPr>
-              <w:t>Responsabilidad</w:t>
+              <w:t>Responsabilidad Principal</w:t>
             </w:r>
           </w:p>
         </w:tc>
@@ -270,20 +463,20 @@
       <w:tr>
         <w:tc>
           <w:tcPr>
-            <w:tcW w:type="dxa" w:w="3135"/>
+            <w:tcW w:type="dxa" w:w="2946"/>
           </w:tcPr>
           <w:p>
             <w:r>
               <w:rPr>
                 <w:b/>
               </w:rPr>
-              <w:t>Interfaz</w:t>
+              <w:t>Interfaz Gráfica</w:t>
             </w:r>
           </w:p>
         </w:tc>
         <w:tc>
           <w:tcPr>
-            <w:tcW w:type="dxa" w:w="3135"/>
+            <w:tcW w:type="dxa" w:w="2946"/>
           </w:tcPr>
           <w:p>
             <w:r>
@@ -293,11 +486,11 @@
         </w:tc>
         <w:tc>
           <w:tcPr>
-            <w:tcW w:type="dxa" w:w="3135"/>
+            <w:tcW w:type="dxa" w:w="2946"/>
           </w:tcPr>
           <w:p>
             <w:r>
-              <w:t>Interfaz gráfica y visualización en tiempo real</w:t>
+              <w:t>Visualización en tiempo real, panel de control, gráficos</w:t>
             </w:r>
           </w:p>
         </w:tc>
@@ -305,7 +498,7 @@
       <w:tr>
         <w:tc>
           <w:tcPr>
-            <w:tcW w:type="dxa" w:w="3135"/>
+            <w:tcW w:type="dxa" w:w="2946"/>
           </w:tcPr>
           <w:p>
             <w:r>
@@ -318,7 +511,7 @@
         </w:tc>
         <w:tc>
           <w:tcPr>
-            <w:tcW w:type="dxa" w:w="3135"/>
+            <w:tcW w:type="dxa" w:w="2946"/>
           </w:tcPr>
           <w:p>
             <w:r>
@@ -328,7 +521,7 @@
         </w:tc>
         <w:tc>
           <w:tcPr>
-            <w:tcW w:type="dxa" w:w="3135"/>
+            <w:tcW w:type="dxa" w:w="2946"/>
           </w:tcPr>
           <w:p>
             <w:r>
@@ -340,7 +533,7 @@
       <w:tr>
         <w:tc>
           <w:tcPr>
-            <w:tcW w:type="dxa" w:w="3135"/>
+            <w:tcW w:type="dxa" w:w="2946"/>
           </w:tcPr>
           <w:p>
             <w:r>
@@ -353,7 +546,7 @@
         </w:tc>
         <w:tc>
           <w:tcPr>
-            <w:tcW w:type="dxa" w:w="3135"/>
+            <w:tcW w:type="dxa" w:w="2946"/>
           </w:tcPr>
           <w:p>
             <w:r>
@@ -363,11 +556,11 @@
         </w:tc>
         <w:tc>
           <w:tcPr>
-            <w:tcW w:type="dxa" w:w="3135"/>
+            <w:tcW w:type="dxa" w:w="2946"/>
           </w:tcPr>
           <w:p>
             <w:r>
-              <w:t>Ejecución de procesos por ticks</w:t>
+              <w:t>Ejecución de procesos por ticks, manejo de quantum</w:t>
             </w:r>
           </w:p>
         </w:tc>
@@ -375,20 +568,20 @@
       <w:tr>
         <w:tc>
           <w:tcPr>
-            <w:tcW w:type="dxa" w:w="3135"/>
+            <w:tcW w:type="dxa" w:w="2946"/>
           </w:tcPr>
           <w:p>
             <w:r>
               <w:rPr>
                 <w:b/>
               </w:rPr>
-              <w:t>Procesos</w:t>
+              <w:t>Gestor de Procesos</w:t>
             </w:r>
           </w:p>
         </w:tc>
         <w:tc>
           <w:tcPr>
-            <w:tcW w:type="dxa" w:w="3135"/>
+            <w:tcW w:type="dxa" w:w="2946"/>
           </w:tcPr>
           <w:p>
             <w:r>
@@ -398,11 +591,11 @@
         </w:tc>
         <w:tc>
           <w:tcPr>
-            <w:tcW w:type="dxa" w:w="3135"/>
+            <w:tcW w:type="dxa" w:w="2946"/>
           </w:tcPr>
           <w:p>
             <w:r>
-              <w:t>Gestión de procesos y estados</w:t>
+              <w:t>Creación, estados y colas de procesos</w:t>
             </w:r>
           </w:p>
         </w:tc>
@@ -410,20 +603,20 @@
       <w:tr>
         <w:tc>
           <w:tcPr>
-            <w:tcW w:type="dxa" w:w="3135"/>
+            <w:tcW w:type="dxa" w:w="2946"/>
           </w:tcPr>
           <w:p>
             <w:r>
               <w:rPr>
                 <w:b/>
               </w:rPr>
-              <w:t>Memoria</w:t>
+              <w:t>Gestor de Memoria</w:t>
             </w:r>
           </w:p>
         </w:tc>
         <w:tc>
           <w:tcPr>
-            <w:tcW w:type="dxa" w:w="3135"/>
+            <w:tcW w:type="dxa" w:w="2946"/>
           </w:tcPr>
           <w:p>
             <w:r>
@@ -433,11 +626,11 @@
         </w:tc>
         <w:tc>
           <w:tcPr>
-            <w:tcW w:type="dxa" w:w="3135"/>
+            <w:tcW w:type="dxa" w:w="2946"/>
           </w:tcPr>
           <w:p>
             <w:r>
-              <w:t>Asignación y gestión de memoria</w:t>
+              <w:t>Asignación, liberación y compactación de memoria</w:t>
             </w:r>
           </w:p>
         </w:tc>
@@ -445,7 +638,7 @@
       <w:tr>
         <w:tc>
           <w:tcPr>
-            <w:tcW w:type="dxa" w:w="3135"/>
+            <w:tcW w:type="dxa" w:w="2946"/>
           </w:tcPr>
           <w:p>
             <w:r>
@@ -458,7 +651,7 @@
         </w:tc>
         <w:tc>
           <w:tcPr>
-            <w:tcW w:type="dxa" w:w="3135"/>
+            <w:tcW w:type="dxa" w:w="2946"/>
           </w:tcPr>
           <w:p>
             <w:r>
@@ -468,11 +661,11 @@
         </w:tc>
         <w:tc>
           <w:tcPr>
-            <w:tcW w:type="dxa" w:w="3135"/>
+            <w:tcW w:type="dxa" w:w="2946"/>
           </w:tcPr>
           <w:p>
             <w:r>
-              <w:t>Selección de procesos a ejecutar</w:t>
+              <w:t>Selección de procesos según algoritmo</w:t>
             </w:r>
           </w:p>
         </w:tc>
@@ -480,7 +673,7 @@
       <w:tr>
         <w:tc>
           <w:tcPr>
-            <w:tcW w:type="dxa" w:w="3135"/>
+            <w:tcW w:type="dxa" w:w="2946"/>
           </w:tcPr>
           <w:p>
             <w:r>
@@ -493,7 +686,7 @@
         </w:tc>
         <w:tc>
           <w:tcPr>
-            <w:tcW w:type="dxa" w:w="3135"/>
+            <w:tcW w:type="dxa" w:w="2946"/>
           </w:tcPr>
           <w:p>
             <w:r>
@@ -503,11 +696,11 @@
         </w:tc>
         <w:tc>
           <w:tcPr>
-            <w:tcW w:type="dxa" w:w="3135"/>
+            <w:tcW w:type="dxa" w:w="2946"/>
           </w:tcPr>
           <w:p>
             <w:r>
-              <w:t>Asignación de CPU a procesos</w:t>
+              <w:t>Asignación de CPU y cambio de contexto</w:t>
             </w:r>
           </w:p>
         </w:tc>
@@ -515,7 +708,7 @@
       <w:tr>
         <w:tc>
           <w:tcPr>
-            <w:tcW w:type="dxa" w:w="3135"/>
+            <w:tcW w:type="dxa" w:w="2946"/>
           </w:tcPr>
           <w:p>
             <w:r>
@@ -528,7 +721,7 @@
         </w:tc>
         <w:tc>
           <w:tcPr>
-            <w:tcW w:type="dxa" w:w="3135"/>
+            <w:tcW w:type="dxa" w:w="2946"/>
           </w:tcPr>
           <w:p>
             <w:r>
@@ -538,11 +731,11 @@
         </w:tc>
         <w:tc>
           <w:tcPr>
-            <w:tcW w:type="dxa" w:w="3135"/>
+            <w:tcW w:type="dxa" w:w="2946"/>
           </w:tcPr>
           <w:p>
             <w:r>
-              <w:t>Configuraciones y constantes del sistema</w:t>
+              <w:t>Configuraciones, colores y constantes del sistema</w:t>
             </w:r>
           </w:p>
         </w:tc>
@@ -551,19 +744,110 @@
     <w:p/>
     <w:p>
       <w:pPr>
+        <w:pStyle w:val="Heading2"/>
+      </w:pPr>
+      <w:r>
+        <w:t>1.3 Flujo de Ejecución</w:t>
+      </w:r>
+    </w:p>
+    <w:p>
+      <w:r>
+        <w:t>El sistema ejecuta ciclos continuos (ticks) con el siguiente flujo:</w:t>
+      </w:r>
+    </w:p>
+    <w:p>
+      <w:pPr>
+        <w:pStyle w:val="ListNumber"/>
+      </w:pPr>
+      <w:r>
+        <w:t>1. Coordinador recibe solicitud de ejecución</w:t>
+      </w:r>
+    </w:p>
+    <w:p>
+      <w:pPr>
+        <w:pStyle w:val="ListNumber"/>
+      </w:pPr>
+      <w:r>
+        <w:t>2. Gestor de Procesos carga procesos nuevos a memoria</w:t>
+      </w:r>
+    </w:p>
+    <w:p>
+      <w:pPr>
+        <w:pStyle w:val="ListNumber"/>
+      </w:pPr>
+      <w:r>
+        <w:t>3. Gestor de Memoria asigna espacio disponible según estrategia</w:t>
+      </w:r>
+    </w:p>
+    <w:p>
+      <w:pPr>
+        <w:pStyle w:val="ListNumber"/>
+      </w:pPr>
+      <w:r>
+        <w:t>4. Gestor de Procesos maneja retorno de procesos bloqueados (I/O)</w:t>
+      </w:r>
+    </w:p>
+    <w:p>
+      <w:pPr>
+        <w:pStyle w:val="ListNumber"/>
+      </w:pPr>
+      <w:r>
+        <w:t>5. CPU ejecuta un tick del proceso actual</w:t>
+      </w:r>
+    </w:p>
+    <w:p>
+      <w:pPr>
+        <w:pStyle w:val="ListNumber"/>
+      </w:pPr>
+      <w:r>
+        <w:t>6. Planificador selecciona próximo proceso según algoritmo configurado</w:t>
+      </w:r>
+    </w:p>
+    <w:p>
+      <w:pPr>
+        <w:pStyle w:val="ListNumber"/>
+      </w:pPr>
+      <w:r>
+        <w:t>7. Despachador asigna CPU al proceso seleccionado</w:t>
+      </w:r>
+    </w:p>
+    <w:p>
+      <w:pPr>
+        <w:pStyle w:val="ListNumber"/>
+      </w:pPr>
+      <w:r>
+        <w:t>8. Interfaz actualiza visualización en tiempo real (cada 200ms)</w:t>
+      </w:r>
+    </w:p>
+    <w:p>
+      <w:r>
+        <w:br w:type="page"/>
+      </w:r>
+    </w:p>
+    <w:p>
+      <w:pPr>
         <w:pStyle w:val="Heading1"/>
       </w:pPr>
       <w:r>
-        <w:rPr>
-          <w:color w:val="0066CC"/>
-        </w:rPr>
         <w:t>2. REQUERIMIENTOS ATENDIDOS</w:t>
+      </w:r>
+    </w:p>
+    <w:p>
+      <w:pPr>
+        <w:pStyle w:val="Heading2"/>
+      </w:pPr>
+      <w:r>
+        <w:t>2.1 Gestión de Procesos</w:t>
       </w:r>
     </w:p>
     <w:p/>
     <w:p>
       <w:r>
-        <w:t>A continuación se presenta un resumen de los requerimientos implementados:</w:t>
+        <w:rPr>
+          <w:b/>
+          <w:sz w:val="24"/>
+        </w:rPr>
+        <w:t>Funcionalidades de Gestión de Procesos:</w:t>
       </w:r>
     </w:p>
     <w:p/>
@@ -575,13 +859,14 @@
         <w:tblLook w:firstColumn="1" w:firstRow="1" w:lastColumn="0" w:lastRow="0" w:noHBand="0" w:noVBand="1" w:val="04A0"/>
       </w:tblPr>
       <w:tblGrid>
-        <w:gridCol w:w="4703"/>
-        <w:gridCol w:w="4703"/>
+        <w:gridCol w:w="2946"/>
+        <w:gridCol w:w="2946"/>
+        <w:gridCol w:w="2946"/>
       </w:tblGrid>
       <w:tr>
         <w:tc>
           <w:tcPr>
-            <w:tcW w:type="dxa" w:w="4703"/>
+            <w:tcW w:type="dxa" w:w="2946"/>
             <w:shd w:fill="4472C4"/>
           </w:tcPr>
           <w:p>
@@ -590,13 +875,13 @@
                 <w:b/>
                 <w:color w:val="FFFFFF"/>
               </w:rPr>
-              <w:t>Componente</w:t>
+              <w:t>Funcionalidad</w:t>
             </w:r>
           </w:p>
         </w:tc>
         <w:tc>
           <w:tcPr>
-            <w:tcW w:type="dxa" w:w="4703"/>
+            <w:tcW w:type="dxa" w:w="2946"/>
             <w:shd w:fill="4472C4"/>
           </w:tcPr>
           <w:p>
@@ -605,7 +890,22 @@
                 <w:b/>
                 <w:color w:val="FFFFFF"/>
               </w:rPr>
-              <w:t>Funcionalidad Implementada</w:t>
+              <w:t>Descripción</w:t>
+            </w:r>
+          </w:p>
+        </w:tc>
+        <w:tc>
+          <w:tcPr>
+            <w:tcW w:type="dxa" w:w="2946"/>
+            <w:shd w:fill="4472C4"/>
+          </w:tcPr>
+          <w:p>
+            <w:r>
+              <w:rPr>
+                <w:b/>
+                <w:color w:val="FFFFFF"/>
+              </w:rPr>
+              <w:t>Estado</w:t>
             </w:r>
           </w:p>
         </w:tc>
@@ -613,24 +913,34 @@
       <w:tr>
         <w:tc>
           <w:tcPr>
-            <w:tcW w:type="dxa" w:w="4703"/>
+            <w:tcW w:type="dxa" w:w="2946"/>
           </w:tcPr>
           <w:p>
             <w:r>
               <w:rPr>
                 <w:b/>
               </w:rPr>
-              <w:t>Gestión de Procesos</w:t>
+              <w:t>Creación de procesos</w:t>
             </w:r>
           </w:p>
         </w:tc>
         <w:tc>
           <w:tcPr>
-            <w:tcW w:type="dxa" w:w="4703"/>
+            <w:tcW w:type="dxa" w:w="2946"/>
           </w:tcPr>
           <w:p>
             <w:r>
-              <w:t>Creación de procesos, 5 estados clásicos, Colas de procesos, PCB, Transiciones automáticas</w:t>
+              <w:t>Permite crear procesos con tamaño, tiempo y prioridad</w:t>
+            </w:r>
+          </w:p>
+        </w:tc>
+        <w:tc>
+          <w:tcPr>
+            <w:tcW w:type="dxa" w:w="2946"/>
+          </w:tcPr>
+          <w:p>
+            <w:r>
+              <w:t>✅ Implementado</w:t>
             </w:r>
           </w:p>
         </w:tc>
@@ -638,24 +948,34 @@
       <w:tr>
         <w:tc>
           <w:tcPr>
-            <w:tcW w:type="dxa" w:w="4703"/>
+            <w:tcW w:type="dxa" w:w="2946"/>
           </w:tcPr>
           <w:p>
             <w:r>
               <w:rPr>
                 <w:b/>
               </w:rPr>
-              <w:t>Gestión de Memoria</w:t>
+              <w:t>Estados de proceso</w:t>
             </w:r>
           </w:p>
         </w:tc>
         <w:tc>
           <w:tcPr>
-            <w:tcW w:type="dxa" w:w="4703"/>
+            <w:tcW w:type="dxa" w:w="2946"/>
           </w:tcPr>
           <w:p>
             <w:r>
-              <w:t>Asignación dinámica, 3 algoritmos (First/Best/Worst Fit), Liberación automática, Compactación, Visualización en tiempo real</w:t>
+              <w:t>5 estados: NUEVO, LISTO, EJECUCION, BLOQUEADO, TERMINADO</w:t>
+            </w:r>
+          </w:p>
+        </w:tc>
+        <w:tc>
+          <w:tcPr>
+            <w:tcW w:type="dxa" w:w="2946"/>
+          </w:tcPr>
+          <w:p>
+            <w:r>
+              <w:t>✅ Implementado</w:t>
             </w:r>
           </w:p>
         </w:tc>
@@ -663,24 +983,34 @@
       <w:tr>
         <w:tc>
           <w:tcPr>
-            <w:tcW w:type="dxa" w:w="4703"/>
+            <w:tcW w:type="dxa" w:w="2946"/>
           </w:tcPr>
           <w:p>
             <w:r>
               <w:rPr>
                 <w:b/>
               </w:rPr>
-              <w:t>Planificación</w:t>
+              <w:t>Colas de procesos</w:t>
             </w:r>
           </w:p>
         </w:tc>
         <w:tc>
           <w:tcPr>
-            <w:tcW w:type="dxa" w:w="4703"/>
+            <w:tcW w:type="dxa" w:w="2946"/>
           </w:tcPr>
           <w:p>
             <w:r>
-              <w:t>4 algoritmos: Round Robin, FCFS, SJF, Prioridad. Cambio dinámico, Quantum configurable, Gráfico de Gantt</w:t>
+              <w:t>Gestiona colas separadas para cada estado</w:t>
+            </w:r>
+          </w:p>
+        </w:tc>
+        <w:tc>
+          <w:tcPr>
+            <w:tcW w:type="dxa" w:w="2946"/>
+          </w:tcPr>
+          <w:p>
+            <w:r>
+              <w:t>✅ Implementado</w:t>
             </w:r>
           </w:p>
         </w:tc>
@@ -688,24 +1018,34 @@
       <w:tr>
         <w:tc>
           <w:tcPr>
-            <w:tcW w:type="dxa" w:w="4703"/>
+            <w:tcW w:type="dxa" w:w="2946"/>
           </w:tcPr>
           <w:p>
             <w:r>
               <w:rPr>
                 <w:b/>
               </w:rPr>
-              <w:t>CPU</w:t>
+              <w:t>PCB (Process Control Block)</w:t>
             </w:r>
           </w:p>
         </w:tc>
         <w:tc>
           <w:tcPr>
-            <w:tcW w:type="dxa" w:w="4703"/>
+            <w:tcW w:type="dxa" w:w="2946"/>
           </w:tcPr>
           <w:p>
             <w:r>
-              <w:t>Ejecución por ticks, Manejo de quantum, Bloqueos por I/O, Retorno automático</w:t>
+              <w:t>Almacena toda la información de cada proceso</w:t>
+            </w:r>
+          </w:p>
+        </w:tc>
+        <w:tc>
+          <w:tcPr>
+            <w:tcW w:type="dxa" w:w="2946"/>
+          </w:tcPr>
+          <w:p>
+            <w:r>
+              <w:t>✅ Implementado</w:t>
             </w:r>
           </w:p>
         </w:tc>
@@ -713,24 +1053,254 @@
       <w:tr>
         <w:tc>
           <w:tcPr>
-            <w:tcW w:type="dxa" w:w="4703"/>
+            <w:tcW w:type="dxa" w:w="2946"/>
           </w:tcPr>
           <w:p>
             <w:r>
               <w:rPr>
                 <w:b/>
               </w:rPr>
-              <w:t>Interfaz Gráfica</w:t>
+              <w:t>Transiciones de estado</w:t>
             </w:r>
           </w:p>
         </w:tc>
         <w:tc>
           <w:tcPr>
-            <w:tcW w:type="dxa" w:w="4703"/>
+            <w:tcW w:type="dxa" w:w="2946"/>
           </w:tcPr>
           <w:p>
             <w:r>
-              <w:t>Panel de configuración, Tabla de procesos, Visualización de memoria, Gráfico de Gantt, Log de eventos, Tema oscuro futurista</w:t>
+              <w:t>Maneja automáticamente los cambios entre estados</w:t>
+            </w:r>
+          </w:p>
+        </w:tc>
+        <w:tc>
+          <w:tcPr>
+            <w:tcW w:type="dxa" w:w="2946"/>
+          </w:tcPr>
+          <w:p>
+            <w:r>
+              <w:t>✅ Implementado</w:t>
+            </w:r>
+          </w:p>
+        </w:tc>
+      </w:tr>
+      <w:tr>
+        <w:tc>
+          <w:tcPr>
+            <w:tcW w:type="dxa" w:w="2946"/>
+          </w:tcPr>
+          <w:p>
+            <w:r>
+              <w:rPr>
+                <w:b/>
+              </w:rPr>
+              <w:t>Bloqueos por I/O</w:t>
+            </w:r>
+          </w:p>
+        </w:tc>
+        <w:tc>
+          <w:tcPr>
+            <w:tcW w:type="dxa" w:w="2946"/>
+          </w:tcPr>
+          <w:p>
+            <w:r>
+              <w:t>Simula bloqueos aleatorios y retorno automático</w:t>
+            </w:r>
+          </w:p>
+        </w:tc>
+        <w:tc>
+          <w:tcPr>
+            <w:tcW w:type="dxa" w:w="2946"/>
+          </w:tcPr>
+          <w:p>
+            <w:r>
+              <w:t>✅ Implementado</w:t>
+            </w:r>
+          </w:p>
+        </w:tc>
+      </w:tr>
+    </w:tbl>
+    <w:p/>
+    <w:p>
+      <w:pPr>
+        <w:pStyle w:val="Heading2"/>
+      </w:pPr>
+      <w:r>
+        <w:t>2.2 Gestión de Memoria</w:t>
+      </w:r>
+    </w:p>
+    <w:p/>
+    <w:p>
+      <w:r>
+        <w:rPr>
+          <w:b/>
+          <w:sz w:val="24"/>
+        </w:rPr>
+        <w:t>Algoritmos de Asignación de Memoria:</w:t>
+      </w:r>
+    </w:p>
+    <w:p/>
+    <w:tbl>
+      <w:tblPr>
+        <w:tblStyle w:val="LightGrid-Accent1"/>
+        <w:tblW w:type="auto" w:w="0"/>
+        <w:jc w:val="center"/>
+        <w:tblLook w:firstColumn="1" w:firstRow="1" w:lastColumn="0" w:lastRow="0" w:noHBand="0" w:noVBand="1" w:val="04A0"/>
+      </w:tblPr>
+      <w:tblGrid>
+        <w:gridCol w:w="2946"/>
+        <w:gridCol w:w="2946"/>
+        <w:gridCol w:w="2946"/>
+      </w:tblGrid>
+      <w:tr>
+        <w:tc>
+          <w:tcPr>
+            <w:tcW w:type="dxa" w:w="2946"/>
+            <w:shd w:fill="4472C4"/>
+          </w:tcPr>
+          <w:p>
+            <w:r>
+              <w:rPr>
+                <w:b/>
+                <w:color w:val="FFFFFF"/>
+              </w:rPr>
+              <w:t>Algoritmo</w:t>
+            </w:r>
+          </w:p>
+        </w:tc>
+        <w:tc>
+          <w:tcPr>
+            <w:tcW w:type="dxa" w:w="2946"/>
+            <w:shd w:fill="4472C4"/>
+          </w:tcPr>
+          <w:p>
+            <w:r>
+              <w:rPr>
+                <w:b/>
+                <w:color w:val="FFFFFF"/>
+              </w:rPr>
+              <w:t>Descripción</w:t>
+            </w:r>
+          </w:p>
+        </w:tc>
+        <w:tc>
+          <w:tcPr>
+            <w:tcW w:type="dxa" w:w="2946"/>
+            <w:shd w:fill="4472C4"/>
+          </w:tcPr>
+          <w:p>
+            <w:r>
+              <w:rPr>
+                <w:b/>
+                <w:color w:val="FFFFFF"/>
+              </w:rPr>
+              <w:t>Ventajas</w:t>
+            </w:r>
+          </w:p>
+        </w:tc>
+      </w:tr>
+      <w:tr>
+        <w:tc>
+          <w:tcPr>
+            <w:tcW w:type="dxa" w:w="2946"/>
+          </w:tcPr>
+          <w:p>
+            <w:r>
+              <w:rPr>
+                <w:b/>
+              </w:rPr>
+              <w:t>First Fit</w:t>
+            </w:r>
+          </w:p>
+        </w:tc>
+        <w:tc>
+          <w:tcPr>
+            <w:tcW w:type="dxa" w:w="2946"/>
+          </w:tcPr>
+          <w:p>
+            <w:r>
+              <w:t>Primer bloque disponible que cumpla con el tamaño</w:t>
+            </w:r>
+          </w:p>
+        </w:tc>
+        <w:tc>
+          <w:tcPr>
+            <w:tcW w:type="dxa" w:w="2946"/>
+          </w:tcPr>
+          <w:p>
+            <w:r>
+              <w:t>Rápido, bajo overhead</w:t>
+            </w:r>
+          </w:p>
+        </w:tc>
+      </w:tr>
+      <w:tr>
+        <w:tc>
+          <w:tcPr>
+            <w:tcW w:type="dxa" w:w="2946"/>
+          </w:tcPr>
+          <w:p>
+            <w:r>
+              <w:rPr>
+                <w:b/>
+              </w:rPr>
+              <w:t>Best Fit</w:t>
+            </w:r>
+          </w:p>
+        </w:tc>
+        <w:tc>
+          <w:tcPr>
+            <w:tcW w:type="dxa" w:w="2946"/>
+          </w:tcPr>
+          <w:p>
+            <w:r>
+              <w:t>Bloque más pequeño que cumpla con el tamaño</w:t>
+            </w:r>
+          </w:p>
+        </w:tc>
+        <w:tc>
+          <w:tcPr>
+            <w:tcW w:type="dxa" w:w="2946"/>
+          </w:tcPr>
+          <w:p>
+            <w:r>
+              <w:t>Minimiza fragmentación interna</w:t>
+            </w:r>
+          </w:p>
+        </w:tc>
+      </w:tr>
+      <w:tr>
+        <w:tc>
+          <w:tcPr>
+            <w:tcW w:type="dxa" w:w="2946"/>
+          </w:tcPr>
+          <w:p>
+            <w:r>
+              <w:rPr>
+                <w:b/>
+              </w:rPr>
+              <w:t>Worst Fit</w:t>
+            </w:r>
+          </w:p>
+        </w:tc>
+        <w:tc>
+          <w:tcPr>
+            <w:tcW w:type="dxa" w:w="2946"/>
+          </w:tcPr>
+          <w:p>
+            <w:r>
+              <w:t>Bloque más grande disponible</w:t>
+            </w:r>
+          </w:p>
+        </w:tc>
+        <w:tc>
+          <w:tcPr>
+            <w:tcW w:type="dxa" w:w="2946"/>
+          </w:tcPr>
+          <w:p>
+            <w:r>
+              <w:t>Deja bloques grandes para futuros procesos</w:t>
             </w:r>
           </w:p>
         </w:tc>
@@ -739,7 +1309,31 @@
     <w:p/>
     <w:p>
       <w:r>
-        <w:t>Algoritmos de planificación implementados:</w:t>
+        <w:rPr>
+          <w:b/>
+        </w:rPr>
+        <w:t xml:space="preserve">Características adicionales: </w:t>
+      </w:r>
+      <w:r>
+        <w:t>Asignación dinámica, liberación automática, compactación de bloques libres adyacentes, visualización en tiempo real, configuración de tamaño total de memoria.</w:t>
+      </w:r>
+    </w:p>
+    <w:p>
+      <w:pPr>
+        <w:pStyle w:val="Heading2"/>
+      </w:pPr>
+      <w:r>
+        <w:t>2.3 Planificación de Procesos</w:t>
+      </w:r>
+    </w:p>
+    <w:p/>
+    <w:p>
+      <w:r>
+        <w:rPr>
+          <w:b/>
+          <w:sz w:val="24"/>
+        </w:rPr>
+        <w:t>Algoritmos de Planificación Implementados:</w:t>
       </w:r>
     </w:p>
     <w:p/>
@@ -747,22 +1341,26 @@
       <w:tblPr>
         <w:tblStyle w:val="ColorfulGrid-Accent2"/>
         <w:tblW w:type="auto" w:w="0"/>
+        <w:jc w:val="center"/>
         <w:tblLook w:firstColumn="1" w:firstRow="1" w:lastColumn="0" w:lastRow="0" w:noHBand="0" w:noVBand="1" w:val="04A0"/>
       </w:tblPr>
       <w:tblGrid>
-        <w:gridCol w:w="3135"/>
-        <w:gridCol w:w="3135"/>
-        <w:gridCol w:w="3135"/>
+        <w:gridCol w:w="2209"/>
+        <w:gridCol w:w="2209"/>
+        <w:gridCol w:w="2209"/>
+        <w:gridCol w:w="2209"/>
       </w:tblGrid>
       <w:tr>
         <w:tc>
           <w:tcPr>
-            <w:tcW w:type="dxa" w:w="3135"/>
+            <w:tcW w:type="dxa" w:w="2209"/>
+            <w:shd w:fill="4472C4"/>
           </w:tcPr>
           <w:p>
             <w:r>
               <w:rPr>
                 <w:b/>
+                <w:color w:val="FFFFFF"/>
               </w:rPr>
               <w:t>Algoritmo</w:t>
             </w:r>
@@ -770,27 +1368,46 @@
         </w:tc>
         <w:tc>
           <w:tcPr>
-            <w:tcW w:type="dxa" w:w="3135"/>
+            <w:tcW w:type="dxa" w:w="2209"/>
+            <w:shd w:fill="4472C4"/>
           </w:tcPr>
           <w:p>
             <w:r>
               <w:rPr>
                 <w:b/>
+                <w:color w:val="FFFFFF"/>
               </w:rPr>
-              <w:t>Descripción</w:t>
+              <w:t>Tipo</w:t>
             </w:r>
           </w:p>
         </w:tc>
         <w:tc>
           <w:tcPr>
-            <w:tcW w:type="dxa" w:w="3135"/>
+            <w:tcW w:type="dxa" w:w="2209"/>
+            <w:shd w:fill="4472C4"/>
           </w:tcPr>
           <w:p>
             <w:r>
               <w:rPr>
                 <w:b/>
+                <w:color w:val="FFFFFF"/>
               </w:rPr>
               <w:t>Características</w:t>
+            </w:r>
+          </w:p>
+        </w:tc>
+        <w:tc>
+          <w:tcPr>
+            <w:tcW w:type="dxa" w:w="2209"/>
+            <w:shd w:fill="4472C4"/>
+          </w:tcPr>
+          <w:p>
+            <w:r>
+              <w:rPr>
+                <w:b/>
+                <w:color w:val="FFFFFF"/>
+              </w:rPr>
+              <w:t>Uso Recomendado</w:t>
             </w:r>
           </w:p>
         </w:tc>
@@ -798,7 +1415,7 @@
       <w:tr>
         <w:tc>
           <w:tcPr>
-            <w:tcW w:type="dxa" w:w="3135"/>
+            <w:tcW w:type="dxa" w:w="2209"/>
           </w:tcPr>
           <w:p>
             <w:r>
@@ -811,21 +1428,31 @@
         </w:tc>
         <w:tc>
           <w:tcPr>
-            <w:tcW w:type="dxa" w:w="3135"/>
+            <w:tcW w:type="dxa" w:w="2209"/>
           </w:tcPr>
           <w:p>
             <w:r>
-              <w:t>FIFO con quantum</w:t>
+              <w:t>Con quantum</w:t>
             </w:r>
           </w:p>
         </w:tc>
         <w:tc>
           <w:tcPr>
-            <w:tcW w:type="dxa" w:w="3135"/>
+            <w:tcW w:type="dxa" w:w="2209"/>
           </w:tcPr>
           <w:p>
             <w:r>
-              <w:t>Quantum configurable, Cambio de contexto por tiempo</w:t>
+              <w:t>Quantum configurable, cambio de contexto por tiempo</w:t>
+            </w:r>
+          </w:p>
+        </w:tc>
+        <w:tc>
+          <w:tcPr>
+            <w:tcW w:type="dxa" w:w="2209"/>
+          </w:tcPr>
+          <w:p>
+            <w:r>
+              <w:t>Sistemas interactivos</w:t>
             </w:r>
           </w:p>
         </w:tc>
@@ -833,7 +1460,7 @@
       <w:tr>
         <w:tc>
           <w:tcPr>
-            <w:tcW w:type="dxa" w:w="3135"/>
+            <w:tcW w:type="dxa" w:w="2209"/>
           </w:tcPr>
           <w:p>
             <w:r>
@@ -846,21 +1473,31 @@
         </w:tc>
         <w:tc>
           <w:tcPr>
-            <w:tcW w:type="dxa" w:w="3135"/>
+            <w:tcW w:type="dxa" w:w="2209"/>
           </w:tcPr>
           <w:p>
             <w:r>
-              <w:t>First Come First Served</w:t>
+              <w:t>FIFO simple</w:t>
             </w:r>
           </w:p>
         </w:tc>
         <w:tc>
           <w:tcPr>
-            <w:tcW w:type="dxa" w:w="3135"/>
+            <w:tcW w:type="dxa" w:w="2209"/>
           </w:tcPr>
           <w:p>
             <w:r>
-              <w:t>FIFO simple, Sin preemption</w:t>
+              <w:t>Sin preemption, orden de llegada</w:t>
+            </w:r>
+          </w:p>
+        </w:tc>
+        <w:tc>
+          <w:tcPr>
+            <w:tcW w:type="dxa" w:w="2209"/>
+          </w:tcPr>
+          <w:p>
+            <w:r>
+              <w:t>Procesos batch cortos</w:t>
             </w:r>
           </w:p>
         </w:tc>
@@ -868,7 +1505,7 @@
       <w:tr>
         <w:tc>
           <w:tcPr>
-            <w:tcW w:type="dxa" w:w="3135"/>
+            <w:tcW w:type="dxa" w:w="2209"/>
           </w:tcPr>
           <w:p>
             <w:r>
@@ -881,21 +1518,31 @@
         </w:tc>
         <w:tc>
           <w:tcPr>
-            <w:tcW w:type="dxa" w:w="3135"/>
+            <w:tcW w:type="dxa" w:w="2209"/>
           </w:tcPr>
           <w:p>
             <w:r>
-              <w:t>Shortest Job First</w:t>
+              <w:t>Por tiempo</w:t>
             </w:r>
           </w:p>
         </w:tc>
         <w:tc>
           <w:tcPr>
-            <w:tcW w:type="dxa" w:w="3135"/>
+            <w:tcW w:type="dxa" w:w="2209"/>
           </w:tcPr>
           <w:p>
             <w:r>
-              <w:t>Ordena por tiempo de ejecución, Minimiza tiempo de espera</w:t>
+              <w:t>Ordena por tiempo de ejecución restante</w:t>
+            </w:r>
+          </w:p>
+        </w:tc>
+        <w:tc>
+          <w:tcPr>
+            <w:tcW w:type="dxa" w:w="2209"/>
+          </w:tcPr>
+          <w:p>
+            <w:r>
+              <w:t>Minimiza tiempo de espera</w:t>
             </w:r>
           </w:p>
         </w:tc>
@@ -903,7 +1550,7 @@
       <w:tr>
         <w:tc>
           <w:tcPr>
-            <w:tcW w:type="dxa" w:w="3135"/>
+            <w:tcW w:type="dxa" w:w="2209"/>
           </w:tcPr>
           <w:p>
             <w:r>
@@ -916,21 +1563,31 @@
         </w:tc>
         <w:tc>
           <w:tcPr>
-            <w:tcW w:type="dxa" w:w="3135"/>
+            <w:tcW w:type="dxa" w:w="2209"/>
           </w:tcPr>
           <w:p>
             <w:r>
-              <w:t>Por nivel de prioridad</w:t>
+              <w:t>Por nivel</w:t>
             </w:r>
           </w:p>
         </w:tc>
         <w:tc>
           <w:tcPr>
-            <w:tcW w:type="dxa" w:w="3135"/>
+            <w:tcW w:type="dxa" w:w="2209"/>
           </w:tcPr>
           <w:p>
             <w:r>
-              <w:t>Menor número = mayor prioridad, Puede ser preemptivo</w:t>
+              <w:t>Menor número = mayor prioridad, puede ser preemptivo</w:t>
+            </w:r>
+          </w:p>
+        </w:tc>
+        <w:tc>
+          <w:tcPr>
+            <w:tcW w:type="dxa" w:w="2209"/>
+          </w:tcPr>
+          <w:p>
+            <w:r>
+              <w:t>Sistemas con prioridades</w:t>
             </w:r>
           </w:p>
         </w:tc>
@@ -938,30 +1595,47 @@
     </w:tbl>
     <w:p/>
     <w:p>
+      <w:pPr>
+        <w:pStyle w:val="Heading2"/>
+      </w:pPr>
       <w:r>
-        <w:t>Estados de proceso implementados:</w:t>
+        <w:t>2.4 Estados de Proceso</w:t>
+      </w:r>
+    </w:p>
+    <w:p/>
+    <w:p>
+      <w:r>
+        <w:rPr>
+          <w:b/>
+          <w:sz w:val="24"/>
+        </w:rPr>
+        <w:t>Estados Implementados:</w:t>
       </w:r>
     </w:p>
     <w:p/>
     <w:tbl>
       <w:tblPr>
-        <w:tblStyle w:val="MediumShading1-Accent1"/>
+        <w:tblStyle w:val="LightGrid-Accent1"/>
         <w:tblW w:type="auto" w:w="0"/>
+        <w:jc w:val="center"/>
         <w:tblLook w:firstColumn="1" w:firstRow="1" w:lastColumn="0" w:lastRow="0" w:noHBand="0" w:noVBand="1" w:val="04A0"/>
       </w:tblPr>
       <w:tblGrid>
-        <w:gridCol w:w="4703"/>
-        <w:gridCol w:w="4703"/>
+        <w:gridCol w:w="2946"/>
+        <w:gridCol w:w="2946"/>
+        <w:gridCol w:w="2946"/>
       </w:tblGrid>
       <w:tr>
         <w:tc>
           <w:tcPr>
-            <w:tcW w:type="dxa" w:w="4703"/>
+            <w:tcW w:type="dxa" w:w="2946"/>
+            <w:shd w:fill="4472C4"/>
           </w:tcPr>
           <w:p>
             <w:r>
               <w:rPr>
                 <w:b/>
+                <w:color w:val="FFFFFF"/>
               </w:rPr>
               <w:t>Estado</w:t>
             </w:r>
@@ -969,14 +1643,31 @@
         </w:tc>
         <w:tc>
           <w:tcPr>
-            <w:tcW w:type="dxa" w:w="4703"/>
+            <w:tcW w:type="dxa" w:w="2946"/>
+            <w:shd w:fill="4472C4"/>
           </w:tcPr>
           <w:p>
             <w:r>
               <w:rPr>
                 <w:b/>
+                <w:color w:val="FFFFFF"/>
               </w:rPr>
               <w:t>Descripción</w:t>
+            </w:r>
+          </w:p>
+        </w:tc>
+        <w:tc>
+          <w:tcPr>
+            <w:tcW w:type="dxa" w:w="2946"/>
+            <w:shd w:fill="4472C4"/>
+          </w:tcPr>
+          <w:p>
+            <w:r>
+              <w:rPr>
+                <w:b/>
+                <w:color w:val="FFFFFF"/>
+              </w:rPr>
+              <w:t>Transiciones Posibles</w:t>
             </w:r>
           </w:p>
         </w:tc>
@@ -984,7 +1675,7 @@
       <w:tr>
         <w:tc>
           <w:tcPr>
-            <w:tcW w:type="dxa" w:w="4703"/>
+            <w:tcW w:type="dxa" w:w="2946"/>
           </w:tcPr>
           <w:p>
             <w:r>
@@ -997,7 +1688,7 @@
         </w:tc>
         <w:tc>
           <w:tcPr>
-            <w:tcW w:type="dxa" w:w="4703"/>
+            <w:tcW w:type="dxa" w:w="2946"/>
           </w:tcPr>
           <w:p>
             <w:r>
@@ -1005,11 +1696,21 @@
             </w:r>
           </w:p>
         </w:tc>
+        <w:tc>
+          <w:tcPr>
+            <w:tcW w:type="dxa" w:w="2946"/>
+          </w:tcPr>
+          <w:p>
+            <w:r>
+              <w:t>→ LISTO (cuando hay memoria)</w:t>
+            </w:r>
+          </w:p>
+        </w:tc>
       </w:tr>
       <w:tr>
         <w:tc>
           <w:tcPr>
-            <w:tcW w:type="dxa" w:w="4703"/>
+            <w:tcW w:type="dxa" w:w="2946"/>
           </w:tcPr>
           <w:p>
             <w:r>
@@ -1022,7 +1723,7 @@
         </w:tc>
         <w:tc>
           <w:tcPr>
-            <w:tcW w:type="dxa" w:w="4703"/>
+            <w:tcW w:type="dxa" w:w="2946"/>
           </w:tcPr>
           <w:p>
             <w:r>
@@ -1030,11 +1731,21 @@
             </w:r>
           </w:p>
         </w:tc>
+        <w:tc>
+          <w:tcPr>
+            <w:tcW w:type="dxa" w:w="2946"/>
+          </w:tcPr>
+          <w:p>
+            <w:r>
+              <w:t>→ EJECUCION (cuando se asigna CPU)</w:t>
+            </w:r>
+          </w:p>
+        </w:tc>
       </w:tr>
       <w:tr>
         <w:tc>
           <w:tcPr>
-            <w:tcW w:type="dxa" w:w="4703"/>
+            <w:tcW w:type="dxa" w:w="2946"/>
           </w:tcPr>
           <w:p>
             <w:r>
@@ -1047,7 +1758,7 @@
         </w:tc>
         <w:tc>
           <w:tcPr>
-            <w:tcW w:type="dxa" w:w="4703"/>
+            <w:tcW w:type="dxa" w:w="2946"/>
           </w:tcPr>
           <w:p>
             <w:r>
@@ -1055,11 +1766,21 @@
             </w:r>
           </w:p>
         </w:tc>
+        <w:tc>
+          <w:tcPr>
+            <w:tcW w:type="dxa" w:w="2946"/>
+          </w:tcPr>
+          <w:p>
+            <w:r>
+              <w:t>→ LISTO, BLOQUEADO, TERMINADO</w:t>
+            </w:r>
+          </w:p>
+        </w:tc>
       </w:tr>
       <w:tr>
         <w:tc>
           <w:tcPr>
-            <w:tcW w:type="dxa" w:w="4703"/>
+            <w:tcW w:type="dxa" w:w="2946"/>
           </w:tcPr>
           <w:p>
             <w:r>
@@ -1072,7 +1793,7 @@
         </w:tc>
         <w:tc>
           <w:tcPr>
-            <w:tcW w:type="dxa" w:w="4703"/>
+            <w:tcW w:type="dxa" w:w="2946"/>
           </w:tcPr>
           <w:p>
             <w:r>
@@ -1080,11 +1801,21 @@
             </w:r>
           </w:p>
         </w:tc>
+        <w:tc>
+          <w:tcPr>
+            <w:tcW w:type="dxa" w:w="2946"/>
+          </w:tcPr>
+          <w:p>
+            <w:r>
+              <w:t>→ LISTO (cuando termina I/O)</w:t>
+            </w:r>
+          </w:p>
+        </w:tc>
       </w:tr>
       <w:tr>
         <w:tc>
           <w:tcPr>
-            <w:tcW w:type="dxa" w:w="4703"/>
+            <w:tcW w:type="dxa" w:w="2946"/>
           </w:tcPr>
           <w:p>
             <w:r>
@@ -1097,7 +1828,7 @@
         </w:tc>
         <w:tc>
           <w:tcPr>
-            <w:tcW w:type="dxa" w:w="4703"/>
+            <w:tcW w:type="dxa" w:w="2946"/>
           </w:tcPr>
           <w:p>
             <w:r>
@@ -1105,21 +1836,32 @@
             </w:r>
           </w:p>
         </w:tc>
+        <w:tc>
+          <w:tcPr>
+            <w:tcW w:type="dxa" w:w="2946"/>
+          </w:tcPr>
+          <w:p>
+            <w:r>
+              <w:t>Memoria liberada</w:t>
+            </w:r>
+          </w:p>
+        </w:tc>
       </w:tr>
     </w:tbl>
     <w:p/>
+    <w:p>
+      <w:r>
+        <w:br w:type="page"/>
+      </w:r>
+    </w:p>
     <w:p>
       <w:pPr>
         <w:pStyle w:val="Heading1"/>
       </w:pPr>
       <w:r>
-        <w:rPr>
-          <w:color w:val="0066CC"/>
-        </w:rPr>
         <w:t>3. DESARROLLO DE LA INTERFAZ GRÁFICA</w:t>
       </w:r>
     </w:p>
-    <w:p/>
     <w:p>
       <w:pPr>
         <w:pStyle w:val="Heading2"/>
@@ -1154,24 +1896,70 @@
         <w:t>SimuladorApp</w:t>
       </w:r>
       <w:r>
-        <w:t xml:space="preserve"> gestiona todos los componentes visuales.</w:t>
+        <w:rPr>
+          <w:b w:val="0"/>
+        </w:rPr>
+        <w:t xml:space="preserve"> gestiona todos los componentes visuales y la comunicación con el coordinador del sistema operativo.</w:t>
+      </w:r>
+    </w:p>
+    <w:p/>
+    <w:p>
+      <w:r>
+        <w:rPr>
+          <w:b/>
+          <w:sz w:val="24"/>
+        </w:rPr>
+        <w:t>Características de la Interfaz:</w:t>
       </w:r>
     </w:p>
     <w:p/>
     <w:tbl>
       <w:tblPr>
-        <w:tblStyle w:val="LightList-Accent2"/>
+        <w:tblStyle w:val="LightGrid-Accent1"/>
         <w:tblW w:type="auto" w:w="0"/>
+        <w:jc w:val="center"/>
         <w:tblLook w:firstColumn="1" w:firstRow="1" w:lastColumn="0" w:lastRow="0" w:noHBand="0" w:noVBand="1" w:val="04A0"/>
       </w:tblPr>
       <w:tblGrid>
-        <w:gridCol w:w="4703"/>
-        <w:gridCol w:w="4703"/>
+        <w:gridCol w:w="4419"/>
+        <w:gridCol w:w="4419"/>
       </w:tblGrid>
       <w:tr>
         <w:tc>
           <w:tcPr>
-            <w:tcW w:type="dxa" w:w="4703"/>
+            <w:tcW w:type="dxa" w:w="4419"/>
+            <w:shd w:fill="4472C4"/>
+          </w:tcPr>
+          <w:p>
+            <w:r>
+              <w:rPr>
+                <w:b/>
+                <w:color w:val="FFFFFF"/>
+              </w:rPr>
+              <w:t>Característica</w:t>
+            </w:r>
+          </w:p>
+        </w:tc>
+        <w:tc>
+          <w:tcPr>
+            <w:tcW w:type="dxa" w:w="4419"/>
+            <w:shd w:fill="4472C4"/>
+          </w:tcPr>
+          <w:p>
+            <w:r>
+              <w:rPr>
+                <w:b/>
+                <w:color w:val="FFFFFF"/>
+              </w:rPr>
+              <w:t>Especificación</w:t>
+            </w:r>
+          </w:p>
+        </w:tc>
+      </w:tr>
+      <w:tr>
+        <w:tc>
+          <w:tcPr>
+            <w:tcW w:type="dxa" w:w="4419"/>
           </w:tcPr>
           <w:p>
             <w:r>
@@ -1184,11 +1972,11 @@
         </w:tc>
         <w:tc>
           <w:tcPr>
-            <w:tcW w:type="dxa" w:w="4703"/>
+            <w:tcW w:type="dxa" w:w="4419"/>
           </w:tcPr>
           <w:p>
             <w:r>
-              <w:t>1400x950 píxeles con tema oscuro futurista</w:t>
+              <w:t>1400x950 píxeles</w:t>
             </w:r>
           </w:p>
         </w:tc>
@@ -1196,7 +1984,32 @@
       <w:tr>
         <w:tc>
           <w:tcPr>
-            <w:tcW w:type="dxa" w:w="4703"/>
+            <w:tcW w:type="dxa" w:w="4419"/>
+          </w:tcPr>
+          <w:p>
+            <w:r>
+              <w:rPr>
+                <w:b/>
+              </w:rPr>
+              <w:t>Tema visual</w:t>
+            </w:r>
+          </w:p>
+        </w:tc>
+        <w:tc>
+          <w:tcPr>
+            <w:tcW w:type="dxa" w:w="4419"/>
+          </w:tcPr>
+          <w:p>
+            <w:r>
+              <w:t>Oscuro futurista con colores personalizados</w:t>
+            </w:r>
+          </w:p>
+        </w:tc>
+      </w:tr>
+      <w:tr>
+        <w:tc>
+          <w:tcPr>
+            <w:tcW w:type="dxa" w:w="4419"/>
           </w:tcPr>
           <w:p>
             <w:r>
@@ -1209,11 +2022,11 @@
         </w:tc>
         <w:tc>
           <w:tcPr>
-            <w:tcW w:type="dxa" w:w="4703"/>
+            <w:tcW w:type="dxa" w:w="4419"/>
           </w:tcPr>
           <w:p>
             <w:r>
-              <w:t>Componentes organizados en paneles independientes</w:t>
+              <w:t>Modular con paneles independientes</w:t>
             </w:r>
           </w:p>
         </w:tc>
@@ -1221,7 +2034,7 @@
       <w:tr>
         <w:tc>
           <w:tcPr>
-            <w:tcW w:type="dxa" w:w="4703"/>
+            <w:tcW w:type="dxa" w:w="4419"/>
           </w:tcPr>
           <w:p>
             <w:r>
@@ -1234,11 +2047,11 @@
         </w:tc>
         <w:tc>
           <w:tcPr>
-            <w:tcW w:type="dxa" w:w="4703"/>
+            <w:tcW w:type="dxa" w:w="4419"/>
           </w:tcPr>
           <w:p>
             <w:r>
-              <w:t>Bucle de simulación que actualiza la UI cada 200ms</w:t>
+              <w:t>Bucle de simulación cada 200ms (5 veces por segundo)</w:t>
             </w:r>
           </w:p>
         </w:tc>
@@ -1246,7 +2059,7 @@
       <w:tr>
         <w:tc>
           <w:tcPr>
-            <w:tcW w:type="dxa" w:w="4703"/>
+            <w:tcW w:type="dxa" w:w="4419"/>
           </w:tcPr>
           <w:p>
             <w:r>
@@ -1259,11 +2072,36 @@
         </w:tc>
         <w:tc>
           <w:tcPr>
-            <w:tcW w:type="dxa" w:w="4703"/>
+            <w:tcW w:type="dxa" w:w="4419"/>
           </w:tcPr>
           <w:p>
             <w:r>
               <w:t>Bidireccional: envía comandos y recibe actualizaciones</w:t>
+            </w:r>
+          </w:p>
+        </w:tc>
+      </w:tr>
+      <w:tr>
+        <w:tc>
+          <w:tcPr>
+            <w:tcW w:type="dxa" w:w="4419"/>
+          </w:tcPr>
+          <w:p>
+            <w:r>
+              <w:rPr>
+                <w:b/>
+              </w:rPr>
+              <w:t>Responsividad</w:t>
+            </w:r>
+          </w:p>
+        </w:tc>
+        <w:tc>
+          <w:tcPr>
+            <w:tcW w:type="dxa" w:w="4419"/>
+          </w:tcPr>
+          <w:p>
+            <w:r>
+              <w:t>Componentes que se adaptan al contenido</w:t>
             </w:r>
           </w:p>
         </w:tc>
@@ -1275,51 +2113,67 @@
         <w:pStyle w:val="Heading2"/>
       </w:pPr>
       <w:r>
-        <w:t>3.2 Componentes Principales</w:t>
+        <w:t>3.2 Componentes Principales de la Interfaz</w:t>
       </w:r>
     </w:p>
     <w:p>
+      <w:pPr>
+        <w:pStyle w:val="Heading3"/>
+      </w:pPr>
       <w:r>
-        <w:t>Componentes principales de la interfaz gráfica:</w:t>
+        <w:t>3.2.1 Panel de Configuración</w:t>
+      </w:r>
+    </w:p>
+    <w:p/>
+    <w:p>
+      <w:r>
+        <w:rPr>
+          <w:b/>
+          <w:sz w:val="24"/>
+        </w:rPr>
+        <w:t>Elementos del Panel de Configuración:</w:t>
       </w:r>
     </w:p>
     <w:p/>
     <w:tbl>
       <w:tblPr>
-        <w:tblStyle w:val="LightList-Accent1"/>
+        <w:tblStyle w:val="LightGrid-Accent1"/>
         <w:tblW w:type="auto" w:w="0"/>
+        <w:jc w:val="center"/>
         <w:tblLook w:firstColumn="1" w:firstRow="1" w:lastColumn="0" w:lastRow="0" w:noHBand="0" w:noVBand="1" w:val="04A0"/>
       </w:tblPr>
       <w:tblGrid>
-        <w:gridCol w:w="4703"/>
-        <w:gridCol w:w="4703"/>
+        <w:gridCol w:w="4419"/>
+        <w:gridCol w:w="4419"/>
       </w:tblGrid>
       <w:tr>
         <w:tc>
           <w:tcPr>
-            <w:tcW w:type="dxa" w:w="4703"/>
-            <w:shd w:fill="E7E6E6"/>
+            <w:tcW w:type="dxa" w:w="4419"/>
+            <w:shd w:fill="4472C4"/>
           </w:tcPr>
           <w:p>
             <w:r>
               <w:rPr>
                 <w:b/>
+                <w:color w:val="FFFFFF"/>
               </w:rPr>
-              <w:t>Componente</w:t>
+              <w:t>Elemento</w:t>
             </w:r>
           </w:p>
         </w:tc>
         <w:tc>
           <w:tcPr>
-            <w:tcW w:type="dxa" w:w="4703"/>
-            <w:shd w:fill="E7E6E6"/>
+            <w:tcW w:type="dxa" w:w="4419"/>
+            <w:shd w:fill="4472C4"/>
           </w:tcPr>
           <w:p>
             <w:r>
               <w:rPr>
                 <w:b/>
+                <w:color w:val="FFFFFF"/>
               </w:rPr>
-              <w:t>Descripción y Funcionalidades</w:t>
+              <w:t>Funcionalidad</w:t>
             </w:r>
           </w:p>
         </w:tc>
@@ -1327,32 +2181,24 @@
       <w:tr>
         <w:tc>
           <w:tcPr>
-            <w:tcW w:type="dxa" w:w="4703"/>
+            <w:tcW w:type="dxa" w:w="4419"/>
           </w:tcPr>
           <w:p>
             <w:r>
               <w:rPr>
                 <w:b/>
               </w:rPr>
-              <w:t>Panel de Configuración</w:t>
+              <w:t>Configuración de Memoria</w:t>
             </w:r>
           </w:p>
         </w:tc>
         <w:tc>
           <w:tcPr>
-            <w:tcW w:type="dxa" w:w="4703"/>
+            <w:tcW w:type="dxa" w:w="4419"/>
           </w:tcPr>
           <w:p>
             <w:r>
-              <w:t>• Configuración de memoria total (KB)</w:t>
-              <w:br/>
-              <w:t>• Selección de algoritmo de planificación</w:t>
-              <w:br/>
-              <w:t>• Ajuste de quantum (Round Robin)</w:t>
-              <w:br/>
-              <w:t>• Estrategia de asignación de memoria</w:t>
-              <w:br/>
-              <w:t>• Botones de acción (Agregar proceso, Test automático, Iniciar/Pausar)</w:t>
+              <w:t>Campo para establecer tamaño total de RAM (KB), botón para aplicar cambios</w:t>
             </w:r>
           </w:p>
         </w:tc>
@@ -1360,30 +2206,24 @@
       <w:tr>
         <w:tc>
           <w:tcPr>
-            <w:tcW w:type="dxa" w:w="4703"/>
+            <w:tcW w:type="dxa" w:w="4419"/>
           </w:tcPr>
           <w:p>
             <w:r>
               <w:rPr>
                 <w:b/>
               </w:rPr>
-              <w:t>Tabla de Procesos</w:t>
+              <w:t>Algoritmo de Planificación</w:t>
             </w:r>
           </w:p>
         </w:tc>
         <w:tc>
           <w:tcPr>
-            <w:tcW w:type="dxa" w:w="4703"/>
+            <w:tcW w:type="dxa" w:w="4419"/>
           </w:tcPr>
           <w:p>
             <w:r>
-              <w:t>• Muestra todos los procesos con estados actualizados</w:t>
-              <w:br/>
-              <w:t>• Columnas: PID, Estado (con iconos), Burst restante, Tamaño, Prioridad</w:t>
-              <w:br/>
-              <w:t>• Actualización en tiempo real</w:t>
-              <w:br/>
-              <w:t>• Resaltado del proceso en ejecución</w:t>
+              <w:t>ComboBox con 4 opciones: Round Robin, FCFS, SJF, Prioridad</w:t>
             </w:r>
           </w:p>
         </w:tc>
@@ -1391,32 +2231,24 @@
       <w:tr>
         <w:tc>
           <w:tcPr>
-            <w:tcW w:type="dxa" w:w="4703"/>
+            <w:tcW w:type="dxa" w:w="4419"/>
           </w:tcPr>
           <w:p>
             <w:r>
               <w:rPr>
                 <w:b/>
               </w:rPr>
-              <w:t>Visualización de Memoria</w:t>
+              <w:t>Configuración de Quantum</w:t>
             </w:r>
           </w:p>
         </w:tc>
         <w:tc>
           <w:tcPr>
-            <w:tcW w:type="dxa" w:w="4703"/>
+            <w:tcW w:type="dxa" w:w="4419"/>
           </w:tcPr>
           <w:p>
             <w:r>
-              <w:t>• Representación gráfica del mapa de memoria</w:t>
-              <w:br/>
-              <w:t>• Bloques con colores únicos por proceso</w:t>
-              <w:br/>
-              <w:t>• Resaltado dorado del proceso en ejecución</w:t>
-              <w:br/>
-              <w:t>• Hover informativo con detalles (PID, tamaño, dirección)</w:t>
-              <w:br/>
-              <w:t>• Escalado automático</w:t>
+              <w:t>Campo numérico para Round Robin, se deshabilita para otros algoritmos</w:t>
             </w:r>
           </w:p>
         </w:tc>
@@ -1424,32 +2256,24 @@
       <w:tr>
         <w:tc>
           <w:tcPr>
-            <w:tcW w:type="dxa" w:w="4703"/>
+            <w:tcW w:type="dxa" w:w="4419"/>
           </w:tcPr>
           <w:p>
             <w:r>
               <w:rPr>
                 <w:b/>
               </w:rPr>
-              <w:t>Gráfico de Gantt</w:t>
+              <w:t>Estrategia de Memoria</w:t>
             </w:r>
           </w:p>
         </w:tc>
         <w:tc>
           <w:tcPr>
-            <w:tcW w:type="dxa" w:w="4703"/>
+            <w:tcW w:type="dxa" w:w="4419"/>
           </w:tcPr>
           <w:p>
             <w:r>
-              <w:t>• Línea de tiempo de uso de CPU</w:t>
-              <w:br/>
-              <w:t>• Muestra últimos 60 ticks</w:t>
-              <w:br/>
-              <w:t>• Colores corresponden a procesos</w:t>
-              <w:br/>
-              <w:t>• Resaltado del proceso actual</w:t>
-              <w:br/>
-              <w:t>• Botón para limpiar historial</w:t>
+              <w:t>ComboBox: First Fit, Best Fit, Worst Fit</w:t>
             </w:r>
           </w:p>
         </w:tc>
@@ -1457,32 +2281,74 @@
       <w:tr>
         <w:tc>
           <w:tcPr>
-            <w:tcW w:type="dxa" w:w="4703"/>
+            <w:tcW w:type="dxa" w:w="4419"/>
           </w:tcPr>
           <w:p>
             <w:r>
               <w:rPr>
                 <w:b/>
               </w:rPr>
-              <w:t>Log de Eventos</w:t>
+              <w:t>Agregar Proceso Manual</w:t>
             </w:r>
           </w:p>
         </w:tc>
         <w:tc>
           <w:tcPr>
-            <w:tcW w:type="dxa" w:w="4703"/>
+            <w:tcW w:type="dxa" w:w="4419"/>
           </w:tcPr>
           <w:p>
             <w:r>
-              <w:t>• Registro textual de todas las operaciones</w:t>
-              <w:br/>
-              <w:t>• Timestamps (HH:MM:SS)</w:t>
-              <w:br/>
-              <w:t>• Scroll automático</w:t>
-              <w:br/>
-              <w:t>• Límite de 200 líneas</w:t>
-              <w:br/>
-              <w:t>• Fuente monospace para legibilidad</w:t>
+              <w:t>Botón que abre ventana modal para crear procesos personalizados</w:t>
+            </w:r>
+          </w:p>
+        </w:tc>
+      </w:tr>
+      <w:tr>
+        <w:tc>
+          <w:tcPr>
+            <w:tcW w:type="dxa" w:w="4419"/>
+          </w:tcPr>
+          <w:p>
+            <w:r>
+              <w:rPr>
+                <w:b/>
+              </w:rPr>
+              <w:t>Generar Test Automático</w:t>
+            </w:r>
+          </w:p>
+        </w:tc>
+        <w:tc>
+          <w:tcPr>
+            <w:tcW w:type="dxa" w:w="4419"/>
+          </w:tcPr>
+          <w:p>
+            <w:r>
+              <w:t>Crea 4 procesos de prueba predefinidos</w:t>
+            </w:r>
+          </w:p>
+        </w:tc>
+      </w:tr>
+      <w:tr>
+        <w:tc>
+          <w:tcPr>
+            <w:tcW w:type="dxa" w:w="4419"/>
+          </w:tcPr>
+          <w:p>
+            <w:r>
+              <w:rPr>
+                <w:b/>
+              </w:rPr>
+              <w:t>Iniciar/Pausar Simulación</w:t>
+            </w:r>
+          </w:p>
+        </w:tc>
+        <w:tc>
+          <w:tcPr>
+            <w:tcW w:type="dxa" w:w="4419"/>
+          </w:tcPr>
+          <w:p>
+            <w:r>
+              <w:t>Control principal de la ejecución</w:t>
             </w:r>
           </w:p>
         </w:tc>
@@ -1491,16 +2357,1188 @@
     <w:p/>
     <w:p>
       <w:pPr>
+        <w:pStyle w:val="Heading3"/>
+      </w:pPr>
+      <w:r>
+        <w:t>3.2.2 Tabla de Procesos</w:t>
+      </w:r>
+    </w:p>
+    <w:p/>
+    <w:p>
+      <w:r>
+        <w:rPr>
+          <w:b/>
+          <w:sz w:val="24"/>
+        </w:rPr>
+        <w:t>Columnas y Funcionalidades:</w:t>
+      </w:r>
+    </w:p>
+    <w:p/>
+    <w:tbl>
+      <w:tblPr>
+        <w:tblStyle w:val="LightGrid-Accent1"/>
+        <w:tblW w:type="auto" w:w="0"/>
+        <w:jc w:val="center"/>
+        <w:tblLook w:firstColumn="1" w:firstRow="1" w:lastColumn="0" w:lastRow="0" w:noHBand="0" w:noVBand="1" w:val="04A0"/>
+      </w:tblPr>
+      <w:tblGrid>
+        <w:gridCol w:w="4419"/>
+        <w:gridCol w:w="4419"/>
+      </w:tblGrid>
+      <w:tr>
+        <w:tc>
+          <w:tcPr>
+            <w:tcW w:type="dxa" w:w="4419"/>
+            <w:shd w:fill="4472C4"/>
+          </w:tcPr>
+          <w:p>
+            <w:r>
+              <w:rPr>
+                <w:b/>
+                <w:color w:val="FFFFFF"/>
+              </w:rPr>
+              <w:t>Columna</w:t>
+            </w:r>
+          </w:p>
+        </w:tc>
+        <w:tc>
+          <w:tcPr>
+            <w:tcW w:type="dxa" w:w="4419"/>
+            <w:shd w:fill="4472C4"/>
+          </w:tcPr>
+          <w:p>
+            <w:r>
+              <w:rPr>
+                <w:b/>
+                <w:color w:val="FFFFFF"/>
+              </w:rPr>
+              <w:t>Descripción</w:t>
+            </w:r>
+          </w:p>
+        </w:tc>
+      </w:tr>
+      <w:tr>
+        <w:tc>
+          <w:tcPr>
+            <w:tcW w:type="dxa" w:w="4419"/>
+          </w:tcPr>
+          <w:p>
+            <w:r>
+              <w:rPr>
+                <w:b/>
+              </w:rPr>
+              <w:t>PID</w:t>
+            </w:r>
+          </w:p>
+        </w:tc>
+        <w:tc>
+          <w:tcPr>
+            <w:tcW w:type="dxa" w:w="4419"/>
+          </w:tcPr>
+          <w:p>
+            <w:r>
+              <w:t>Identificador único del proceso</w:t>
+            </w:r>
+          </w:p>
+        </w:tc>
+      </w:tr>
+      <w:tr>
+        <w:tc>
+          <w:tcPr>
+            <w:tcW w:type="dxa" w:w="4419"/>
+          </w:tcPr>
+          <w:p>
+            <w:r>
+              <w:rPr>
+                <w:b/>
+              </w:rPr>
+              <w:t>Estado</w:t>
+            </w:r>
+          </w:p>
+        </w:tc>
+        <w:tc>
+          <w:tcPr>
+            <w:tcW w:type="dxa" w:w="4419"/>
+          </w:tcPr>
+          <w:p>
+            <w:r>
+              <w:t>Estado actual con iconos visuales (🆕 NUEVO, ✅ LISTO, ⚡ EJECUCION, ⏸️ BLOQUEADO, ✔️ TERMINADO)</w:t>
+            </w:r>
+          </w:p>
+        </w:tc>
+      </w:tr>
+      <w:tr>
+        <w:tc>
+          <w:tcPr>
+            <w:tcW w:type="dxa" w:w="4419"/>
+          </w:tcPr>
+          <w:p>
+            <w:r>
+              <w:rPr>
+                <w:b/>
+              </w:rPr>
+              <w:t>Burst</w:t>
+            </w:r>
+          </w:p>
+        </w:tc>
+        <w:tc>
+          <w:tcPr>
+            <w:tcW w:type="dxa" w:w="4419"/>
+          </w:tcPr>
+          <w:p>
+            <w:r>
+              <w:t>Tiempo de ejecución restante</w:t>
+            </w:r>
+          </w:p>
+        </w:tc>
+      </w:tr>
+      <w:tr>
+        <w:tc>
+          <w:tcPr>
+            <w:tcW w:type="dxa" w:w="4419"/>
+          </w:tcPr>
+          <w:p>
+            <w:r>
+              <w:rPr>
+                <w:b/>
+              </w:rPr>
+              <w:t>Size</w:t>
+            </w:r>
+          </w:p>
+        </w:tc>
+        <w:tc>
+          <w:tcPr>
+            <w:tcW w:type="dxa" w:w="4419"/>
+          </w:tcPr>
+          <w:p>
+            <w:r>
+              <w:t>Tamaño del proceso en KB</w:t>
+            </w:r>
+          </w:p>
+        </w:tc>
+      </w:tr>
+      <w:tr>
+        <w:tc>
+          <w:tcPr>
+            <w:tcW w:type="dxa" w:w="4419"/>
+          </w:tcPr>
+          <w:p>
+            <w:r>
+              <w:rPr>
+                <w:b/>
+              </w:rPr>
+              <w:t>Prio</w:t>
+            </w:r>
+          </w:p>
+        </w:tc>
+        <w:tc>
+          <w:tcPr>
+            <w:tcW w:type="dxa" w:w="4419"/>
+          </w:tcPr>
+          <w:p>
+            <w:r>
+              <w:t>Prioridad del proceso</w:t>
+            </w:r>
+          </w:p>
+        </w:tc>
+      </w:tr>
+    </w:tbl>
+    <w:p/>
+    <w:p>
+      <w:r>
+        <w:rPr>
+          <w:b/>
+        </w:rPr>
+        <w:t xml:space="preserve">Características: </w:t>
+      </w:r>
+      <w:r>
+        <w:t>Actualización en tiempo real, ordenamiento automático por PID, scrollbar para muchos procesos, resaltado visual del proceso en ejecución.</w:t>
+      </w:r>
+    </w:p>
+    <w:p>
+      <w:pPr>
+        <w:pStyle w:val="Heading3"/>
+      </w:pPr>
+      <w:r>
+        <w:t>3.2.3 Visualización de Memoria</w:t>
+      </w:r>
+    </w:p>
+    <w:p>
+      <w:r>
+        <w:t>Representación gráfica del mapa de memoria con las siguientes características:</w:t>
+      </w:r>
+    </w:p>
+    <w:p>
+      <w:pPr>
+        <w:pStyle w:val="ListBullet"/>
+      </w:pPr>
+      <w:r>
+        <w:t>Cada bloque de memoria se muestra como un rectángulo proporcional</w:t>
+      </w:r>
+    </w:p>
+    <w:p>
+      <w:pPr>
+        <w:pStyle w:val="ListBullet"/>
+      </w:pPr>
+      <w:r>
+        <w:t>Bloques ocupados tienen colores únicos por proceso para fácil identificación</w:t>
+      </w:r>
+    </w:p>
+    <w:p>
+      <w:pPr>
+        <w:pStyle w:val="ListBullet"/>
+      </w:pPr>
+      <w:r>
+        <w:t>Bloques libres se muestran en gris</w:t>
+      </w:r>
+    </w:p>
+    <w:p>
+      <w:pPr>
+        <w:pStyle w:val="ListBullet"/>
+      </w:pPr>
+      <w:r>
+        <w:t>El proceso en ejecución se resalta con color dorado y borde brillante</w:t>
+      </w:r>
+    </w:p>
+    <w:p>
+      <w:pPr>
+        <w:pStyle w:val="ListBullet"/>
+      </w:pPr>
+      <w:r>
+        <w:t>Etiquetas muestran PID y tamaño de cada bloque</w:t>
+      </w:r>
+    </w:p>
+    <w:p>
+      <w:pPr>
+        <w:pStyle w:val="ListBullet"/>
+      </w:pPr>
+      <w:r>
+        <w:t>Hover informativo: al pasar el mouse muestra estado, PID, tamaño y dirección</w:t>
+      </w:r>
+    </w:p>
+    <w:p>
+      <w:pPr>
+        <w:pStyle w:val="ListBullet"/>
+      </w:pPr>
+      <w:r>
+        <w:t>Escalado automático según el tamaño total de memoria</w:t>
+      </w:r>
+    </w:p>
+    <w:p>
+      <w:pPr>
+        <w:pStyle w:val="ListBullet"/>
+      </w:pPr>
+      <w:r>
+        <w:t>Visualización de direcciones de memoria en el lado izquierdo</w:t>
+      </w:r>
+    </w:p>
+    <w:p>
+      <w:pPr>
+        <w:pStyle w:val="Heading3"/>
+      </w:pPr>
+      <w:r>
+        <w:t>3.2.4 Gráfico de Gantt</w:t>
+      </w:r>
+    </w:p>
+    <w:p/>
+    <w:p>
+      <w:r>
+        <w:rPr>
+          <w:b/>
+          <w:sz w:val="24"/>
+        </w:rPr>
+        <w:t>Características del Gráfico de Gantt:</w:t>
+      </w:r>
+    </w:p>
+    <w:p/>
+    <w:tbl>
+      <w:tblPr>
+        <w:tblStyle w:val="LightGrid-Accent1"/>
+        <w:tblW w:type="auto" w:w="0"/>
+        <w:jc w:val="center"/>
+        <w:tblLook w:firstColumn="1" w:firstRow="1" w:lastColumn="0" w:lastRow="0" w:noHBand="0" w:noVBand="1" w:val="04A0"/>
+      </w:tblPr>
+      <w:tblGrid>
+        <w:gridCol w:w="4419"/>
+        <w:gridCol w:w="4419"/>
+      </w:tblGrid>
+      <w:tr>
+        <w:tc>
+          <w:tcPr>
+            <w:tcW w:type="dxa" w:w="4419"/>
+            <w:shd w:fill="4472C4"/>
+          </w:tcPr>
+          <w:p>
+            <w:r>
+              <w:rPr>
+                <w:b/>
+                <w:color w:val="FFFFFF"/>
+              </w:rPr>
+              <w:t>Característica</w:t>
+            </w:r>
+          </w:p>
+        </w:tc>
+        <w:tc>
+          <w:tcPr>
+            <w:tcW w:type="dxa" w:w="4419"/>
+            <w:shd w:fill="4472C4"/>
+          </w:tcPr>
+          <w:p>
+            <w:r>
+              <w:rPr>
+                <w:b/>
+                <w:color w:val="FFFFFF"/>
+              </w:rPr>
+              <w:t>Descripción</w:t>
+            </w:r>
+          </w:p>
+        </w:tc>
+      </w:tr>
+      <w:tr>
+        <w:tc>
+          <w:tcPr>
+            <w:tcW w:type="dxa" w:w="4419"/>
+          </w:tcPr>
+          <w:p>
+            <w:r>
+              <w:rPr>
+                <w:b/>
+              </w:rPr>
+              <w:t>Visualización</w:t>
+            </w:r>
+          </w:p>
+        </w:tc>
+        <w:tc>
+          <w:tcPr>
+            <w:tcW w:type="dxa" w:w="4419"/>
+          </w:tcPr>
+          <w:p>
+            <w:r>
+              <w:t>Línea de tiempo que muestra historial de uso de CPU</w:t>
+            </w:r>
+          </w:p>
+        </w:tc>
+      </w:tr>
+      <w:tr>
+        <w:tc>
+          <w:tcPr>
+            <w:tcW w:type="dxa" w:w="4419"/>
+          </w:tcPr>
+          <w:p>
+            <w:r>
+              <w:rPr>
+                <w:b/>
+              </w:rPr>
+              <w:t>Segmentos</w:t>
+            </w:r>
+          </w:p>
+        </w:tc>
+        <w:tc>
+          <w:tcPr>
+            <w:tcW w:type="dxa" w:w="4419"/>
+          </w:tcPr>
+          <w:p>
+            <w:r>
+              <w:t>Cada segmento representa un período de ejecución de un proceso</w:t>
+            </w:r>
+          </w:p>
+        </w:tc>
+      </w:tr>
+      <w:tr>
+        <w:tc>
+          <w:tcPr>
+            <w:tcW w:type="dxa" w:w="4419"/>
+          </w:tcPr>
+          <w:p>
+            <w:r>
+              <w:rPr>
+                <w:b/>
+              </w:rPr>
+              <w:t>Colores</w:t>
+            </w:r>
+          </w:p>
+        </w:tc>
+        <w:tc>
+          <w:tcPr>
+            <w:tcW w:type="dxa" w:w="4419"/>
+          </w:tcPr>
+          <w:p>
+            <w:r>
+              <w:t>Corresponden a los procesos (mismo color que en memoria)</w:t>
+            </w:r>
+          </w:p>
+        </w:tc>
+      </w:tr>
+      <w:tr>
+        <w:tc>
+          <w:tcPr>
+            <w:tcW w:type="dxa" w:w="4419"/>
+          </w:tcPr>
+          <w:p>
+            <w:r>
+              <w:rPr>
+                <w:b/>
+              </w:rPr>
+              <w:t>Resaltado</w:t>
+            </w:r>
+          </w:p>
+        </w:tc>
+        <w:tc>
+          <w:tcPr>
+            <w:tcW w:type="dxa" w:w="4419"/>
+          </w:tcPr>
+          <w:p>
+            <w:r>
+              <w:t>El proceso actual se resalta con color dorado</w:t>
+            </w:r>
+          </w:p>
+        </w:tc>
+      </w:tr>
+      <w:tr>
+        <w:tc>
+          <w:tcPr>
+            <w:tcW w:type="dxa" w:w="4419"/>
+          </w:tcPr>
+          <w:p>
+            <w:r>
+              <w:rPr>
+                <w:b/>
+              </w:rPr>
+              <w:t>Historial</w:t>
+            </w:r>
+          </w:p>
+        </w:tc>
+        <w:tc>
+          <w:tcPr>
+            <w:tcW w:type="dxa" w:w="4419"/>
+          </w:tcPr>
+          <w:p>
+            <w:r>
+              <w:t>Muestra los últimos 60 ticks de ejecución</w:t>
+            </w:r>
+          </w:p>
+        </w:tc>
+      </w:tr>
+      <w:tr>
+        <w:tc>
+          <w:tcPr>
+            <w:tcW w:type="dxa" w:w="4419"/>
+          </w:tcPr>
+          <w:p>
+            <w:r>
+              <w:rPr>
+                <w:b/>
+              </w:rPr>
+              <w:t>Escalado</w:t>
+            </w:r>
+          </w:p>
+        </w:tc>
+        <w:tc>
+          <w:tcPr>
+            <w:tcW w:type="dxa" w:w="4419"/>
+          </w:tcPr>
+          <w:p>
+            <w:r>
+              <w:t>Automático según el ancho disponible</w:t>
+            </w:r>
+          </w:p>
+        </w:tc>
+      </w:tr>
+      <w:tr>
+        <w:tc>
+          <w:tcPr>
+            <w:tcW w:type="dxa" w:w="4419"/>
+          </w:tcPr>
+          <w:p>
+            <w:r>
+              <w:rPr>
+                <w:b/>
+              </w:rPr>
+              <w:t>Etiquetas</w:t>
+            </w:r>
+          </w:p>
+        </w:tc>
+        <w:tc>
+          <w:tcPr>
+            <w:tcW w:type="dxa" w:w="4419"/>
+          </w:tcPr>
+          <w:p>
+            <w:r>
+              <w:t>Muestra PID en segmentos grandes</w:t>
+            </w:r>
+          </w:p>
+        </w:tc>
+      </w:tr>
+      <w:tr>
+        <w:tc>
+          <w:tcPr>
+            <w:tcW w:type="dxa" w:w="4419"/>
+          </w:tcPr>
+          <w:p>
+            <w:r>
+              <w:rPr>
+                <w:b/>
+              </w:rPr>
+              <w:t>Control</w:t>
+            </w:r>
+          </w:p>
+        </w:tc>
+        <w:tc>
+          <w:tcPr>
+            <w:tcW w:type="dxa" w:w="4419"/>
+          </w:tcPr>
+          <w:p>
+            <w:r>
+              <w:t>Botón para limpiar el historial</w:t>
+            </w:r>
+          </w:p>
+        </w:tc>
+      </w:tr>
+    </w:tbl>
+    <w:p/>
+    <w:p>
+      <w:pPr>
+        <w:pStyle w:val="Heading3"/>
+      </w:pPr>
+      <w:r>
+        <w:t>3.2.5 Log de Eventos</w:t>
+      </w:r>
+    </w:p>
+    <w:p/>
+    <w:p>
+      <w:r>
+        <w:rPr>
+          <w:b/>
+          <w:sz w:val="24"/>
+        </w:rPr>
+        <w:t>Funcionalidades del Log:</w:t>
+      </w:r>
+    </w:p>
+    <w:p/>
+    <w:tbl>
+      <w:tblPr>
+        <w:tblStyle w:val="LightGrid-Accent1"/>
+        <w:tblW w:type="auto" w:w="0"/>
+        <w:jc w:val="center"/>
+        <w:tblLook w:firstColumn="1" w:firstRow="1" w:lastColumn="0" w:lastRow="0" w:noHBand="0" w:noVBand="1" w:val="04A0"/>
+      </w:tblPr>
+      <w:tblGrid>
+        <w:gridCol w:w="4419"/>
+        <w:gridCol w:w="4419"/>
+      </w:tblGrid>
+      <w:tr>
+        <w:tc>
+          <w:tcPr>
+            <w:tcW w:type="dxa" w:w="4419"/>
+            <w:shd w:fill="4472C4"/>
+          </w:tcPr>
+          <w:p>
+            <w:r>
+              <w:rPr>
+                <w:b/>
+                <w:color w:val="FFFFFF"/>
+              </w:rPr>
+              <w:t>Funcionalidad</w:t>
+            </w:r>
+          </w:p>
+        </w:tc>
+        <w:tc>
+          <w:tcPr>
+            <w:tcW w:type="dxa" w:w="4419"/>
+            <w:shd w:fill="4472C4"/>
+          </w:tcPr>
+          <w:p>
+            <w:r>
+              <w:rPr>
+                <w:b/>
+                <w:color w:val="FFFFFF"/>
+              </w:rPr>
+              <w:t>Descripción</w:t>
+            </w:r>
+          </w:p>
+        </w:tc>
+      </w:tr>
+      <w:tr>
+        <w:tc>
+          <w:tcPr>
+            <w:tcW w:type="dxa" w:w="4419"/>
+          </w:tcPr>
+          <w:p>
+            <w:r>
+              <w:rPr>
+                <w:b/>
+              </w:rPr>
+              <w:t>Timestamps</w:t>
+            </w:r>
+          </w:p>
+        </w:tc>
+        <w:tc>
+          <w:tcPr>
+            <w:tcW w:type="dxa" w:w="4419"/>
+          </w:tcPr>
+          <w:p>
+            <w:r>
+              <w:t>Muestra todos los eventos con hora (HH:MM:SS)</w:t>
+            </w:r>
+          </w:p>
+        </w:tc>
+      </w:tr>
+      <w:tr>
+        <w:tc>
+          <w:tcPr>
+            <w:tcW w:type="dxa" w:w="4419"/>
+          </w:tcPr>
+          <w:p>
+            <w:r>
+              <w:rPr>
+                <w:b/>
+              </w:rPr>
+              <w:t>Scroll automático</w:t>
+            </w:r>
+          </w:p>
+        </w:tc>
+        <w:tc>
+          <w:tcPr>
+            <w:tcW w:type="dxa" w:w="4419"/>
+          </w:tcPr>
+          <w:p>
+            <w:r>
+              <w:t>Se desplaza automáticamente al final del log</w:t>
+            </w:r>
+          </w:p>
+        </w:tc>
+      </w:tr>
+      <w:tr>
+        <w:tc>
+          <w:tcPr>
+            <w:tcW w:type="dxa" w:w="4419"/>
+          </w:tcPr>
+          <w:p>
+            <w:r>
+              <w:rPr>
+                <w:b/>
+              </w:rPr>
+              <w:t>Límite de líneas</w:t>
+            </w:r>
+          </w:p>
+        </w:tc>
+        <w:tc>
+          <w:tcPr>
+            <w:tcW w:type="dxa" w:w="4419"/>
+          </w:tcPr>
+          <w:p>
+            <w:r>
+              <w:t>200 líneas máximo (elimina las más antiguas automáticamente)</w:t>
+            </w:r>
+          </w:p>
+        </w:tc>
+      </w:tr>
+      <w:tr>
+        <w:tc>
+          <w:tcPr>
+            <w:tcW w:type="dxa" w:w="4419"/>
+          </w:tcPr>
+          <w:p>
+            <w:r>
+              <w:rPr>
+                <w:b/>
+              </w:rPr>
+              <w:t>Fuente</w:t>
+            </w:r>
+          </w:p>
+        </w:tc>
+        <w:tc>
+          <w:tcPr>
+            <w:tcW w:type="dxa" w:w="4419"/>
+          </w:tcPr>
+          <w:p>
+            <w:r>
+              <w:t>Monospace (Consolas) para mejor legibilidad</w:t>
+            </w:r>
+          </w:p>
+        </w:tc>
+      </w:tr>
+      <w:tr>
+        <w:tc>
+          <w:tcPr>
+            <w:tcW w:type="dxa" w:w="4419"/>
+          </w:tcPr>
+          <w:p>
+            <w:r>
+              <w:rPr>
+                <w:b/>
+              </w:rPr>
+              <w:t>Navegación</w:t>
+            </w:r>
+          </w:p>
+        </w:tc>
+        <w:tc>
+          <w:tcPr>
+            <w:tcW w:type="dxa" w:w="4419"/>
+          </w:tcPr>
+          <w:p>
+            <w:r>
+              <w:t>Scrollbar vertical para navegar el historial</w:t>
+            </w:r>
+          </w:p>
+        </w:tc>
+      </w:tr>
+      <w:tr>
+        <w:tc>
+          <w:tcPr>
+            <w:tcW w:type="dxa" w:w="4419"/>
+          </w:tcPr>
+          <w:p>
+            <w:r>
+              <w:rPr>
+                <w:b/>
+              </w:rPr>
+              <w:t>Tipos de eventos</w:t>
+            </w:r>
+          </w:p>
+        </w:tc>
+        <w:tc>
+          <w:tcPr>
+            <w:tcW w:type="dxa" w:w="4419"/>
+          </w:tcPr>
+          <w:p>
+            <w:r>
+              <w:t>Carga de procesos, cambios de estado, asignación/liberación de memoria, cambios de algoritmo, terminación, bloqueos I/O, reinicios</w:t>
+            </w:r>
+          </w:p>
+        </w:tc>
+      </w:tr>
+    </w:tbl>
+    <w:p/>
+    <w:p>
+      <w:pPr>
+        <w:pStyle w:val="Heading2"/>
+      </w:pPr>
+      <w:r>
+        <w:t>3.3 Ventana de Agregar Proceso Manual</w:t>
+      </w:r>
+    </w:p>
+    <w:p/>
+    <w:p>
+      <w:r>
+        <w:rPr>
+          <w:b/>
+          <w:sz w:val="24"/>
+        </w:rPr>
+        <w:t>Campos de la Ventana:</w:t>
+      </w:r>
+    </w:p>
+    <w:p/>
+    <w:tbl>
+      <w:tblPr>
+        <w:tblStyle w:val="LightGrid-Accent1"/>
+        <w:tblW w:type="auto" w:w="0"/>
+        <w:jc w:val="center"/>
+        <w:tblLook w:firstColumn="1" w:firstRow="1" w:lastColumn="0" w:lastRow="0" w:noHBand="0" w:noVBand="1" w:val="04A0"/>
+      </w:tblPr>
+      <w:tblGrid>
+        <w:gridCol w:w="2946"/>
+        <w:gridCol w:w="2946"/>
+        <w:gridCol w:w="2946"/>
+      </w:tblGrid>
+      <w:tr>
+        <w:tc>
+          <w:tcPr>
+            <w:tcW w:type="dxa" w:w="2946"/>
+            <w:shd w:fill="4472C4"/>
+          </w:tcPr>
+          <w:p>
+            <w:r>
+              <w:rPr>
+                <w:b/>
+                <w:color w:val="FFFFFF"/>
+              </w:rPr>
+              <w:t>Campo</w:t>
+            </w:r>
+          </w:p>
+        </w:tc>
+        <w:tc>
+          <w:tcPr>
+            <w:tcW w:type="dxa" w:w="2946"/>
+            <w:shd w:fill="4472C4"/>
+          </w:tcPr>
+          <w:p>
+            <w:r>
+              <w:rPr>
+                <w:b/>
+                <w:color w:val="FFFFFF"/>
+              </w:rPr>
+              <w:t>Tipo</w:t>
+            </w:r>
+          </w:p>
+        </w:tc>
+        <w:tc>
+          <w:tcPr>
+            <w:tcW w:type="dxa" w:w="2946"/>
+            <w:shd w:fill="4472C4"/>
+          </w:tcPr>
+          <w:p>
+            <w:r>
+              <w:rPr>
+                <w:b/>
+                <w:color w:val="FFFFFF"/>
+              </w:rPr>
+              <w:t>Descripción</w:t>
+            </w:r>
+          </w:p>
+        </w:tc>
+      </w:tr>
+      <w:tr>
+        <w:tc>
+          <w:tcPr>
+            <w:tcW w:type="dxa" w:w="2946"/>
+          </w:tcPr>
+          <w:p>
+            <w:r>
+              <w:rPr>
+                <w:b/>
+              </w:rPr>
+              <w:t>Tamaño (KB)</w:t>
+            </w:r>
+          </w:p>
+        </w:tc>
+        <w:tc>
+          <w:tcPr>
+            <w:tcW w:type="dxa" w:w="2946"/>
+          </w:tcPr>
+          <w:p>
+            <w:r>
+              <w:t>Numérico</w:t>
+            </w:r>
+          </w:p>
+        </w:tc>
+        <w:tc>
+          <w:tcPr>
+            <w:tcW w:type="dxa" w:w="2946"/>
+          </w:tcPr>
+          <w:p>
+            <w:r>
+              <w:t>Tamaño del proceso en kilobytes</w:t>
+            </w:r>
+          </w:p>
+        </w:tc>
+      </w:tr>
+      <w:tr>
+        <w:tc>
+          <w:tcPr>
+            <w:tcW w:type="dxa" w:w="2946"/>
+          </w:tcPr>
+          <w:p>
+            <w:r>
+              <w:rPr>
+                <w:b/>
+              </w:rPr>
+              <w:t>Tiempo de Ejecución (Seg)</w:t>
+            </w:r>
+          </w:p>
+        </w:tc>
+        <w:tc>
+          <w:tcPr>
+            <w:tcW w:type="dxa" w:w="2946"/>
+          </w:tcPr>
+          <w:p>
+            <w:r>
+              <w:t>Numérico</w:t>
+            </w:r>
+          </w:p>
+        </w:tc>
+        <w:tc>
+          <w:tcPr>
+            <w:tcW w:type="dxa" w:w="2946"/>
+          </w:tcPr>
+          <w:p>
+            <w:r>
+              <w:t>Duración total del proceso</w:t>
+            </w:r>
+          </w:p>
+        </w:tc>
+      </w:tr>
+      <w:tr>
+        <w:tc>
+          <w:tcPr>
+            <w:tcW w:type="dxa" w:w="2946"/>
+          </w:tcPr>
+          <w:p>
+            <w:r>
+              <w:rPr>
+                <w:b/>
+              </w:rPr>
+              <w:t>Prioridad</w:t>
+            </w:r>
+          </w:p>
+        </w:tc>
+        <w:tc>
+          <w:tcPr>
+            <w:tcW w:type="dxa" w:w="2946"/>
+          </w:tcPr>
+          <w:p>
+            <w:r>
+              <w:t>Numérico</w:t>
+            </w:r>
+          </w:p>
+        </w:tc>
+        <w:tc>
+          <w:tcPr>
+            <w:tcW w:type="dxa" w:w="2946"/>
+          </w:tcPr>
+          <w:p>
+            <w:r>
+              <w:t>Nivel de prioridad (número entero)</w:t>
+            </w:r>
+          </w:p>
+        </w:tc>
+      </w:tr>
+    </w:tbl>
+    <w:p/>
+    <w:p>
+      <w:r>
+        <w:rPr>
+          <w:b/>
+        </w:rPr>
+        <w:t xml:space="preserve">Validación: </w:t>
+      </w:r>
+      <w:r>
+        <w:t>Verifica valores numéricos, valida que sean mayores a 0, muestra mensaje de confirmación antes de crear.</w:t>
+      </w:r>
+    </w:p>
+    <w:p>
+      <w:pPr>
+        <w:pStyle w:val="Heading2"/>
+      </w:pPr>
+      <w:r>
+        <w:t>3.4 Sistema de Estilos y Temas</w:t>
+      </w:r>
+    </w:p>
+    <w:p/>
+    <w:p>
+      <w:r>
+        <w:rPr>
+          <w:b/>
+          <w:sz w:val="24"/>
+        </w:rPr>
+        <w:t>Paleta de Colores:</w:t>
+      </w:r>
+    </w:p>
+    <w:p/>
+    <w:tbl>
+      <w:tblPr>
+        <w:tblStyle w:val="LightGrid-Accent1"/>
+        <w:tblW w:type="auto" w:w="0"/>
+        <w:jc w:val="center"/>
+        <w:tblLook w:firstColumn="1" w:firstRow="1" w:lastColumn="0" w:lastRow="0" w:noHBand="0" w:noVBand="1" w:val="04A0"/>
+      </w:tblPr>
+      <w:tblGrid>
+        <w:gridCol w:w="2946"/>
+        <w:gridCol w:w="2946"/>
+        <w:gridCol w:w="2946"/>
+      </w:tblGrid>
+      <w:tr>
+        <w:tc>
+          <w:tcPr>
+            <w:tcW w:type="dxa" w:w="2946"/>
+            <w:shd w:fill="4472C4"/>
+          </w:tcPr>
+          <w:p>
+            <w:r>
+              <w:rPr>
+                <w:b/>
+                <w:color w:val="FFFFFF"/>
+              </w:rPr>
+              <w:t>Elemento</w:t>
+            </w:r>
+          </w:p>
+        </w:tc>
+        <w:tc>
+          <w:tcPr>
+            <w:tcW w:type="dxa" w:w="2946"/>
+            <w:shd w:fill="4472C4"/>
+          </w:tcPr>
+          <w:p>
+            <w:r>
+              <w:rPr>
+                <w:b/>
+                <w:color w:val="FFFFFF"/>
+              </w:rPr>
+              <w:t>Color</w:t>
+            </w:r>
+          </w:p>
+        </w:tc>
+        <w:tc>
+          <w:tcPr>
+            <w:tcW w:type="dxa" w:w="2946"/>
+            <w:shd w:fill="4472C4"/>
+          </w:tcPr>
+          <w:p>
+            <w:r>
+              <w:rPr>
+                <w:b/>
+                <w:color w:val="FFFFFF"/>
+              </w:rPr>
+              <w:t>Código</w:t>
+            </w:r>
+          </w:p>
+        </w:tc>
+      </w:tr>
+      <w:tr>
+        <w:tc>
+          <w:tcPr>
+            <w:tcW w:type="dxa" w:w="2946"/>
+          </w:tcPr>
+          <w:p>
+            <w:r>
+              <w:rPr>
+                <w:b/>
+              </w:rPr>
+              <w:t>Fondo principal</w:t>
+            </w:r>
+          </w:p>
+        </w:tc>
+        <w:tc>
+          <w:tcPr>
+            <w:tcW w:type="dxa" w:w="2946"/>
+          </w:tcPr>
+          <w:p>
+            <w:r>
+              <w:t>Tonos oscuros</w:t>
+            </w:r>
+          </w:p>
+        </w:tc>
+        <w:tc>
+          <w:tcPr>
+            <w:tcW w:type="dxa" w:w="2946"/>
+          </w:tcPr>
+          <w:p>
+            <w:r>
+              <w:t>#1a2332, #2a3441</w:t>
+            </w:r>
+          </w:p>
+        </w:tc>
+      </w:tr>
+      <w:tr>
+        <w:tc>
+          <w:tcPr>
+            <w:tcW w:type="dxa" w:w="2946"/>
+          </w:tcPr>
+          <w:p>
+            <w:r>
+              <w:rPr>
+                <w:b/>
+              </w:rPr>
+              <w:t>Texto</w:t>
+            </w:r>
+          </w:p>
+        </w:tc>
+        <w:tc>
+          <w:tcPr>
+            <w:tcW w:type="dxa" w:w="2946"/>
+          </w:tcPr>
+          <w:p>
+            <w:r>
+              <w:t>Blanco y dorado</w:t>
+            </w:r>
+          </w:p>
+        </w:tc>
+        <w:tc>
+          <w:tcPr>
+            <w:tcW w:type="dxa" w:w="2946"/>
+          </w:tcPr>
+          <w:p>
+            <w:r>
+              <w:t>RGB(255,255,255), RGB(255,215,0)</w:t>
+            </w:r>
+          </w:p>
+        </w:tc>
+      </w:tr>
+      <w:tr>
+        <w:tc>
+          <w:tcPr>
+            <w:tcW w:type="dxa" w:w="2946"/>
+          </w:tcPr>
+          <w:p>
+            <w:r>
+              <w:rPr>
+                <w:b/>
+              </w:rPr>
+              <w:t>Proceso en ejecución</w:t>
+            </w:r>
+          </w:p>
+        </w:tc>
+        <w:tc>
+          <w:tcPr>
+            <w:tcW w:type="dxa" w:w="2946"/>
+          </w:tcPr>
+          <w:p>
+            <w:r>
+              <w:t>Dorado brillante</w:t>
+            </w:r>
+          </w:p>
+        </w:tc>
+        <w:tc>
+          <w:tcPr>
+            <w:tcW w:type="dxa" w:w="2946"/>
+          </w:tcPr>
+          <w:p>
+            <w:r>
+              <w:t>#FFD700</w:t>
+            </w:r>
+          </w:p>
+        </w:tc>
+      </w:tr>
+      <w:tr>
+        <w:tc>
+          <w:tcPr>
+            <w:tcW w:type="dxa" w:w="2946"/>
+          </w:tcPr>
+          <w:p>
+            <w:r>
+              <w:rPr>
+                <w:b/>
+              </w:rPr>
+              <w:t>Bordes importantes</w:t>
+            </w:r>
+          </w:p>
+        </w:tc>
+        <w:tc>
+          <w:tcPr>
+            <w:tcW w:type="dxa" w:w="2946"/>
+          </w:tcPr>
+          <w:p>
+            <w:r>
+              <w:t>Dorado</w:t>
+            </w:r>
+          </w:p>
+        </w:tc>
+        <w:tc>
+          <w:tcPr>
+            <w:tcW w:type="dxa" w:w="2946"/>
+          </w:tcPr>
+          <w:p>
+            <w:r>
+              <w:t>RGB(255,215,0)</w:t>
+            </w:r>
+          </w:p>
+        </w:tc>
+      </w:tr>
+    </w:tbl>
+    <w:p/>
+    <w:p>
+      <w:r>
+        <w:br w:type="page"/>
+      </w:r>
+    </w:p>
+    <w:p>
+      <w:pPr>
         <w:pStyle w:val="Heading1"/>
       </w:pPr>
       <w:r>
-        <w:rPr>
-          <w:color w:val="0066CC"/>
-        </w:rPr>
         <w:t>4. DEMOSTRACIÓN DEL MÓDULO DESARROLLADO</w:t>
       </w:r>
     </w:p>
-    <w:p/>
     <w:p>
       <w:pPr>
         <w:pStyle w:val="Heading2"/>
@@ -1511,7 +3549,71 @@
     </w:p>
     <w:p>
       <w:r>
-        <w:t>El simulador ejecuta ciclos continuos mientras la simulación está activa:</w:t>
+        <w:t>El simulador ejecuta ciclos continuos mientras la simulación está activa. A continuación se detalla el proceso completo:</w:t>
+      </w:r>
+    </w:p>
+    <w:p>
+      <w:pPr>
+        <w:pStyle w:val="Heading2"/>
+      </w:pPr>
+      <w:r>
+        <w:t>4.2 Ciclo de Vida de un Proceso</w:t>
+      </w:r>
+    </w:p>
+    <w:p>
+      <w:pPr>
+        <w:pStyle w:val="ListBullet"/>
+      </w:pPr>
+      <w:r>
+        <w:t>Creación: El proceso se crea y entra en estado NUEVO</w:t>
+      </w:r>
+    </w:p>
+    <w:p>
+      <w:pPr>
+        <w:pStyle w:val="ListBullet"/>
+      </w:pPr>
+      <w:r>
+        <w:t>Carga a memoria: Si hay espacio disponible, se asigna memoria y pasa a LISTO</w:t>
+      </w:r>
+    </w:p>
+    <w:p>
+      <w:pPr>
+        <w:pStyle w:val="ListBullet"/>
+      </w:pPr>
+      <w:r>
+        <w:t>Selección: El planificador lo selecciona según el algoritmo configurado</w:t>
+      </w:r>
+    </w:p>
+    <w:p>
+      <w:pPr>
+        <w:pStyle w:val="ListBullet"/>
+      </w:pPr>
+      <w:r>
+        <w:t>Ejecución: El despachador le asigna CPU, pasa a EJECUCION</w:t>
+      </w:r>
+    </w:p>
+    <w:p>
+      <w:pPr>
+        <w:pStyle w:val="ListBullet"/>
+      </w:pPr>
+      <w:r>
+        <w:t>Transiciones: El proceso puede terminar, bloquearse por I/O, o agotar su quantum</w:t>
+      </w:r>
+    </w:p>
+    <w:p>
+      <w:pPr>
+        <w:pStyle w:val="ListBullet"/>
+      </w:pPr>
+      <w:r>
+        <w:t>Liberación: Al terminar, se libera su memoria y se actualiza el estado</w:t>
+      </w:r>
+    </w:p>
+    <w:p>
+      <w:pPr>
+        <w:pStyle w:val="Heading2"/>
+      </w:pPr>
+      <w:r>
+        <w:t>4.3 Pasos para la Demostración</w:t>
       </w:r>
     </w:p>
     <w:p>
@@ -1519,7 +3621,7 @@
         <w:pStyle w:val="ListNumber"/>
       </w:pPr>
       <w:r>
-        <w:t>1. Carga de procesos nuevos a memoria</w:t>
+        <w:t>1. Inicio del Sistema: Ejecutar python main.py, mostrar interfaz inicial</w:t>
       </w:r>
     </w:p>
     <w:p>
@@ -1527,7 +3629,7 @@
         <w:pStyle w:val="ListNumber"/>
       </w:pPr>
       <w:r>
-        <w:t>2. Asignación de memoria según estrategia configurada</w:t>
+        <w:t>2. Configuración: Configurar tamaño de memoria, algoritmo, quantum, estrategia</w:t>
       </w:r>
     </w:p>
     <w:p>
@@ -1535,7 +3637,7 @@
         <w:pStyle w:val="ListNumber"/>
       </w:pPr>
       <w:r>
-        <w:t>3. Manejo de retorno de procesos bloqueados (I/O)</w:t>
+        <w:t>3. Creación de Procesos: Agregar manualmente o generar test automático</w:t>
       </w:r>
     </w:p>
     <w:p>
@@ -1543,7 +3645,7 @@
         <w:pStyle w:val="ListNumber"/>
       </w:pPr>
       <w:r>
-        <w:t>4. Ejecución de un tick en CPU</w:t>
+        <w:t>4. Iniciar Simulación: Presionar INICIAR, observar carga a memoria</w:t>
       </w:r>
     </w:p>
     <w:p>
@@ -1551,7 +3653,7 @@
         <w:pStyle w:val="ListNumber"/>
       </w:pPr>
       <w:r>
-        <w:t>5. Planificación del próximo proceso</w:t>
+        <w:t>5. Observar Ejecución: Ver cambios en memoria, tabla, Gantt y log</w:t>
       </w:r>
     </w:p>
     <w:p>
@@ -1559,7 +3661,7 @@
         <w:pStyle w:val="ListNumber"/>
       </w:pPr>
       <w:r>
-        <w:t>6. Despacho y asignación de CPU</w:t>
+        <w:t>6. Cambiar Algoritmo: Cambiar en tiempo real y observar diferencias</w:t>
       </w:r>
     </w:p>
     <w:p>
@@ -1567,7 +3669,52 @@
         <w:pStyle w:val="ListNumber"/>
       </w:pPr>
       <w:r>
-        <w:t>7. Actualización de la interfaz en tiempo real</w:t>
+        <w:t>7. Proceso en Ejecución: Identificar proceso dorado en memoria</w:t>
+      </w:r>
+    </w:p>
+    <w:p>
+      <w:pPr>
+        <w:pStyle w:val="ListNumber"/>
+      </w:pPr>
+      <w:r>
+        <w:t>8. Terminación: Observar liberación de memoria al terminar procesos</w:t>
+      </w:r>
+    </w:p>
+    <w:p>
+      <w:pPr>
+        <w:pStyle w:val="ListNumber"/>
+      </w:pPr>
+      <w:r>
+        <w:t>9. Bloqueos I/O: Esperar bloqueos y retorno automático</w:t>
+      </w:r>
+    </w:p>
+    <w:p>
+      <w:pPr>
+        <w:pStyle w:val="ListNumber"/>
+      </w:pPr>
+      <w:r>
+        <w:t>10. Cambiar Estrategia: Cambiar estrategia de memoria y agregar procesos</w:t>
+      </w:r>
+    </w:p>
+    <w:p>
+      <w:pPr>
+        <w:pStyle w:val="ListNumber"/>
+      </w:pPr>
+      <w:r>
+        <w:t>11. Reiniciar Sistema: Cambiar tamaño de memoria y observar reinicio</w:t>
+      </w:r>
+    </w:p>
+    <w:p>
+      <w:pPr>
+        <w:pStyle w:val="ListNumber"/>
+      </w:pPr>
+      <w:r>
+        <w:t>12. Hover en Memoria: Pasar mouse y ver información detallada</w:t>
+      </w:r>
+    </w:p>
+    <w:p>
+      <w:r>
+        <w:br w:type="page"/>
       </w:r>
     </w:p>
     <w:p>
@@ -1575,16 +3722,15 @@
         <w:pStyle w:val="Heading1"/>
       </w:pPr>
       <w:r>
-        <w:rPr>
-          <w:color w:val="0066CC"/>
-        </w:rPr>
         <w:t>5. RESUMEN EJECUTIVO</w:t>
       </w:r>
     </w:p>
-    <w:p/>
     <w:p>
+      <w:pPr>
+        <w:pStyle w:val="Heading2"/>
+      </w:pPr>
       <w:r>
-        <w:t>Características destacadas del proyecto:</w:t>
+        <w:t>5.1 Características Destacadas</w:t>
       </w:r>
     </w:p>
     <w:p>
@@ -1653,9 +3799,81 @@
         <w:t>Documentación completa de todos los módulos</w:t>
       </w:r>
     </w:p>
+    <w:p>
+      <w:pPr>
+        <w:pStyle w:val="ListBullet"/>
+      </w:pPr>
+      <w:r>
+        <w:rPr>
+          <w:sz w:val="22"/>
+        </w:rPr>
+        <w:t>Tema visual moderno y profesional</w:t>
+      </w:r>
+    </w:p>
+    <w:p>
+      <w:pPr>
+        <w:pStyle w:val="ListBullet"/>
+      </w:pPr>
+      <w:r>
+        <w:rPr>
+          <w:sz w:val="22"/>
+        </w:rPr>
+        <w:t>Sistema de log completo para seguimiento</w:t>
+      </w:r>
+    </w:p>
+    <w:p>
+      <w:pPr>
+        <w:pStyle w:val="ListBullet"/>
+      </w:pPr>
+      <w:r>
+        <w:rPr>
+          <w:sz w:val="22"/>
+        </w:rPr>
+        <w:t>Hover informativo en visualización de memoria</w:t>
+      </w:r>
+    </w:p>
+    <w:p>
+      <w:pPr>
+        <w:pStyle w:val="ListBullet"/>
+      </w:pPr>
+      <w:r>
+        <w:rPr>
+          <w:sz w:val="22"/>
+        </w:rPr>
+        <w:t>Gráfico de Gantt dinámico</w:t>
+      </w:r>
+    </w:p>
+    <w:p>
+      <w:pPr>
+        <w:pStyle w:val="Heading2"/>
+      </w:pPr>
+      <w:r>
+        <w:t>5.2 Valor del Proyecto</w:t>
+      </w:r>
+    </w:p>
+    <w:p>
+      <w:r>
+        <w:rPr>
+          <w:b w:val="0"/>
+        </w:rPr>
+        <w:t xml:space="preserve">Este simulador permite </w:t>
+      </w:r>
+      <w:r>
+        <w:rPr>
+          <w:b/>
+        </w:rPr>
+        <w:t>comprender visualmente</w:t>
+      </w:r>
+      <w:r>
+        <w:rPr>
+          <w:b w:val="0"/>
+        </w:rPr>
+        <w:t xml:space="preserve"> cómo funcionan los componentes fundamentales de un sistema operativo, facilitando el aprendizaje de conceptos complejos como planificación de procesos, gestión de memoria y cambio de contexto.</w:t>
+      </w:r>
+    </w:p>
     <w:sectPr>
       <w:pgSz w:w="12240" w:h="15840"/>
-      <w:pgMar w:top="1417" w:right="1417" w:bottom="1417" w:left="1417" w:header="720" w:footer="720" w:gutter="0"/>
+      <w:pgMar w:top="1417" w:right="1701" w:bottom="1417" w:left="1701" w:header="720" w:footer="720" w:gutter="0"/>
       <w:cols w:space="720"/>
       <w:docGrid w:linePitch="360"/>
     </w:sectPr>

</xml_diff>

<commit_message>
Agregar manual de uso completo y lista de imágenes requeridas
</commit_message>
<xml_diff>
--- a/PRESENTACION_PROYECTO.docx
+++ b/PRESENTACION_PROYECTO.docx
@@ -3871,6 +3871,1563 @@
         <w:t xml:space="preserve"> cómo funcionan los componentes fundamentales de un sistema operativo, facilitando el aprendizaje de conceptos complejos como planificación de procesos, gestión de memoria y cambio de contexto.</w:t>
       </w:r>
     </w:p>
+    <w:p>
+      <w:r>
+        <w:br w:type="page"/>
+      </w:r>
+    </w:p>
+    <w:p>
+      <w:pPr>
+        <w:pStyle w:val="Heading1"/>
+      </w:pPr>
+      <w:r>
+        <w:t>6. MANUAL DE USO DEL SIMULADOR</w:t>
+      </w:r>
+    </w:p>
+    <w:p>
+      <w:pPr>
+        <w:pStyle w:val="Heading2"/>
+      </w:pPr>
+      <w:r>
+        <w:t>6.1 Inicio Rápido</w:t>
+      </w:r>
+    </w:p>
+    <w:p>
+      <w:r>
+        <w:rPr>
+          <w:b/>
+        </w:rPr>
+        <w:t xml:space="preserve">PASO 1: </w:t>
+      </w:r>
+      <w:r>
+        <w:rPr>
+          <w:b w:val="0"/>
+        </w:rPr>
+        <w:t>Ejecutar el simulador</w:t>
+      </w:r>
+    </w:p>
+    <w:p>
+      <w:pPr>
+        <w:pStyle w:val="ListBullet2"/>
+      </w:pPr>
+      <w:r>
+        <w:t xml:space="preserve">   • Abrir una terminal en el directorio del proyecto</w:t>
+      </w:r>
+    </w:p>
+    <w:p>
+      <w:pPr>
+        <w:pStyle w:val="ListBullet2"/>
+      </w:pPr>
+      <w:r>
+        <w:t xml:space="preserve">   • Ejecutar el comando: python main.py</w:t>
+      </w:r>
+    </w:p>
+    <w:p>
+      <w:pPr>
+        <w:pStyle w:val="ListBullet2"/>
+      </w:pPr>
+      <w:r>
+        <w:t xml:space="preserve">   • Se abrirá la ventana principal del simulador</w:t>
+      </w:r>
+    </w:p>
+    <w:p/>
+    <w:p>
+      <w:r>
+        <w:rPr>
+          <w:b/>
+        </w:rPr>
+        <w:t xml:space="preserve">PASO 2: </w:t>
+      </w:r>
+      <w:r>
+        <w:rPr>
+          <w:b w:val="0"/>
+        </w:rPr>
+        <w:t>Configurar parámetros iniciales</w:t>
+      </w:r>
+    </w:p>
+    <w:p>
+      <w:pPr>
+        <w:pStyle w:val="ListBullet2"/>
+      </w:pPr>
+      <w:r>
+        <w:t xml:space="preserve">   • Establecer tamaño de memoria (ej: 1024 KB)</w:t>
+      </w:r>
+    </w:p>
+    <w:p>
+      <w:pPr>
+        <w:pStyle w:val="ListBullet2"/>
+      </w:pPr>
+      <w:r>
+        <w:t xml:space="preserve">   • Seleccionar algoritmo de planificación</w:t>
+      </w:r>
+    </w:p>
+    <w:p>
+      <w:pPr>
+        <w:pStyle w:val="ListBullet2"/>
+      </w:pPr>
+      <w:r>
+        <w:t xml:space="preserve">   • Si es Round Robin, configurar quantum (ej: 3)</w:t>
+      </w:r>
+    </w:p>
+    <w:p>
+      <w:pPr>
+        <w:pStyle w:val="ListBullet2"/>
+      </w:pPr>
+      <w:r>
+        <w:t xml:space="preserve">   • Seleccionar estrategia de asignación de memoria</w:t>
+      </w:r>
+    </w:p>
+    <w:p/>
+    <w:p>
+      <w:r>
+        <w:rPr>
+          <w:b/>
+        </w:rPr>
+        <w:t xml:space="preserve">PASO 3: </w:t>
+      </w:r>
+      <w:r>
+        <w:rPr>
+          <w:b w:val="0"/>
+        </w:rPr>
+        <w:t>Crear procesos</w:t>
+      </w:r>
+    </w:p>
+    <w:p>
+      <w:pPr>
+        <w:pStyle w:val="ListBullet2"/>
+      </w:pPr>
+      <w:r>
+        <w:t xml:space="preserve">   • Opción A: Agregar proceso manual (botón 'Agregar Proceso Manual')</w:t>
+      </w:r>
+    </w:p>
+    <w:p>
+      <w:pPr>
+        <w:pStyle w:val="ListBullet2"/>
+      </w:pPr>
+      <w:r>
+        <w:t xml:space="preserve">   • Opción B: Generar test automático (botón 'Generar Test Automático')</w:t>
+      </w:r>
+    </w:p>
+    <w:p/>
+    <w:p>
+      <w:r>
+        <w:rPr>
+          <w:b/>
+        </w:rPr>
+        <w:t xml:space="preserve">PASO 4: </w:t>
+      </w:r>
+      <w:r>
+        <w:rPr>
+          <w:b w:val="0"/>
+        </w:rPr>
+        <w:t>Iniciar simulación</w:t>
+      </w:r>
+    </w:p>
+    <w:p>
+      <w:pPr>
+        <w:pStyle w:val="ListBullet2"/>
+      </w:pPr>
+      <w:r>
+        <w:t xml:space="preserve">   • Presionar el botón 'INICIAR SIMULACIÓN'</w:t>
+      </w:r>
+    </w:p>
+    <w:p>
+      <w:pPr>
+        <w:pStyle w:val="ListBullet2"/>
+      </w:pPr>
+      <w:r>
+        <w:t xml:space="preserve">   • Observar cómo los procesos se cargan a memoria</w:t>
+      </w:r>
+    </w:p>
+    <w:p>
+      <w:pPr>
+        <w:pStyle w:val="ListBullet2"/>
+      </w:pPr>
+      <w:r>
+        <w:t xml:space="preserve">   • Ver cambios en tiempo real en todos los paneles</w:t>
+      </w:r>
+    </w:p>
+    <w:p>
+      <w:pPr>
+        <w:pStyle w:val="Heading2"/>
+      </w:pPr>
+      <w:r>
+        <w:t>6.2 Descripción de Componentes de la Interfaz</w:t>
+      </w:r>
+    </w:p>
+    <w:p>
+      <w:pPr>
+        <w:pStyle w:val="Heading3"/>
+      </w:pPr>
+      <w:r>
+        <w:t>6.2.1 Panel de Configuración (Lado Izquierdo)</w:t>
+      </w:r>
+    </w:p>
+    <w:p>
+      <w:r>
+        <w:t>El panel de configuración permite ajustar todos los parámetros del sistema:</w:t>
+      </w:r>
+    </w:p>
+    <w:p>
+      <w:r>
+        <w:rPr>
+          <w:b/>
+        </w:rPr>
+        <w:t xml:space="preserve">💾 Total RAM (KB): </w:t>
+      </w:r>
+      <w:r>
+        <w:rPr>
+          <w:b w:val="0"/>
+        </w:rPr>
+        <w:t>Campo numérico para establecer el tamaño total de memoria. Presionar 'Cambiar' para aplicar.</w:t>
+      </w:r>
+    </w:p>
+    <w:p>
+      <w:r>
+        <w:rPr>
+          <w:b/>
+        </w:rPr>
+        <w:t xml:space="preserve">🔄 Algoritmo de Planificación: </w:t>
+      </w:r>
+      <w:r>
+        <w:rPr>
+          <w:b w:val="0"/>
+        </w:rPr>
+        <w:t>ComboBox con 4 opciones: Round Robin, FCFS, SJF, Prioridad. El cambio se aplica inmediatamente.</w:t>
+      </w:r>
+    </w:p>
+    <w:p>
+      <w:r>
+        <w:rPr>
+          <w:b/>
+        </w:rPr>
+        <w:t xml:space="preserve">⏱️ Quantum: </w:t>
+      </w:r>
+      <w:r>
+        <w:rPr>
+          <w:b w:val="0"/>
+        </w:rPr>
+        <w:t>Solo visible para Round Robin. Establece el tiempo de ejecución antes del cambio de contexto.</w:t>
+      </w:r>
+    </w:p>
+    <w:p>
+      <w:r>
+        <w:rPr>
+          <w:b/>
+        </w:rPr>
+        <w:t xml:space="preserve">🧩 Estrategia de Asignación: </w:t>
+      </w:r>
+      <w:r>
+        <w:rPr>
+          <w:b w:val="0"/>
+        </w:rPr>
+        <w:t>ComboBox: First Fit, Best Fit, Worst Fit. Afecta cómo se asignan nuevos procesos.</w:t>
+      </w:r>
+    </w:p>
+    <w:p>
+      <w:r>
+        <w:rPr>
+          <w:b/>
+        </w:rPr>
+        <w:t xml:space="preserve">➕ Agregar Proceso Manual: </w:t>
+      </w:r>
+      <w:r>
+        <w:rPr>
+          <w:b w:val="0"/>
+        </w:rPr>
+        <w:t>Abre ventana modal para crear procesos personalizados con tamaño, tiempo y prioridad.</w:t>
+      </w:r>
+    </w:p>
+    <w:p>
+      <w:r>
+        <w:rPr>
+          <w:b/>
+        </w:rPr>
+        <w:t xml:space="preserve">🎲 Generar Test Automático: </w:t>
+      </w:r>
+      <w:r>
+        <w:rPr>
+          <w:b w:val="0"/>
+        </w:rPr>
+        <w:t>Crea 4 procesos de prueba predefinidos para demostración rápida.</w:t>
+      </w:r>
+    </w:p>
+    <w:p>
+      <w:r>
+        <w:rPr>
+          <w:b/>
+        </w:rPr>
+        <w:t xml:space="preserve">▶ INICIAR SIMULACIÓN: </w:t>
+      </w:r>
+      <w:r>
+        <w:rPr>
+          <w:b w:val="0"/>
+        </w:rPr>
+        <w:t>Botón principal que inicia/pausa la simulación. Cambia a '⏸ PAUSAR' durante la ejecución.</w:t>
+      </w:r>
+    </w:p>
+    <w:p>
+      <w:pPr>
+        <w:pStyle w:val="Heading3"/>
+      </w:pPr>
+      <w:r>
+        <w:t>6.2.2 Tabla de Procesos (Centro)</w:t>
+      </w:r>
+    </w:p>
+    <w:p>
+      <w:r>
+        <w:t>Muestra el estado actual de todos los procesos en el sistema:</w:t>
+      </w:r>
+    </w:p>
+    <w:p>
+      <w:pPr>
+        <w:pStyle w:val="ListBullet"/>
+      </w:pPr>
+      <w:r>
+        <w:t>• PID: Identificador único del proceso</w:t>
+      </w:r>
+    </w:p>
+    <w:p>
+      <w:pPr>
+        <w:pStyle w:val="ListBullet"/>
+      </w:pPr>
+      <w:r>
+        <w:t>• Estado: Estado actual con iconos (🆕 NUEVO, ✅ LISTO, ⚡ EJECUCION, ⏸️ BLOQUEADO, ✔️ TERMINADO)</w:t>
+      </w:r>
+    </w:p>
+    <w:p>
+      <w:pPr>
+        <w:pStyle w:val="ListBullet"/>
+      </w:pPr>
+      <w:r>
+        <w:t>• Burst: Tiempo de ejecución restante en segundos</w:t>
+      </w:r>
+    </w:p>
+    <w:p>
+      <w:pPr>
+        <w:pStyle w:val="ListBullet"/>
+      </w:pPr>
+      <w:r>
+        <w:t>• Size: Tamaño del proceso en KB</w:t>
+      </w:r>
+    </w:p>
+    <w:p>
+      <w:pPr>
+        <w:pStyle w:val="ListBullet"/>
+      </w:pPr>
+      <w:r>
+        <w:t>• Prio: Prioridad del proceso (menor número = mayor prioridad)</w:t>
+      </w:r>
+    </w:p>
+    <w:p/>
+    <w:p>
+      <w:r>
+        <w:t>La tabla se actualiza automáticamente cada 200ms durante la simulación.</w:t>
+      </w:r>
+    </w:p>
+    <w:p>
+      <w:pPr>
+        <w:pStyle w:val="Heading3"/>
+      </w:pPr>
+      <w:r>
+        <w:t>6.2.3 Visualización de Memoria (Lado Derecho)</w:t>
+      </w:r>
+    </w:p>
+    <w:p>
+      <w:r>
+        <w:t>Representación gráfica del mapa de memoria:</w:t>
+      </w:r>
+    </w:p>
+    <w:p>
+      <w:pPr>
+        <w:pStyle w:val="ListBullet"/>
+      </w:pPr>
+      <w:r>
+        <w:t>• Cada bloque se muestra como un rectángulo proporcional a su tamaño</w:t>
+      </w:r>
+    </w:p>
+    <w:p>
+      <w:pPr>
+        <w:pStyle w:val="ListBullet"/>
+      </w:pPr>
+      <w:r>
+        <w:t>• Bloques ocupados tienen colores únicos por proceso</w:t>
+      </w:r>
+    </w:p>
+    <w:p>
+      <w:pPr>
+        <w:pStyle w:val="ListBullet"/>
+      </w:pPr>
+      <w:r>
+        <w:t>• Bloques libres aparecen en gris</w:t>
+      </w:r>
+    </w:p>
+    <w:p>
+      <w:pPr>
+        <w:pStyle w:val="ListBullet"/>
+      </w:pPr>
+      <w:r>
+        <w:t>• El proceso en ejecución se resalta en dorado con borde brillante</w:t>
+      </w:r>
+    </w:p>
+    <w:p>
+      <w:pPr>
+        <w:pStyle w:val="ListBullet"/>
+      </w:pPr>
+      <w:r>
+        <w:t>• Al pasar el mouse sobre un bloque, se muestra información detallada abajo</w:t>
+      </w:r>
+    </w:p>
+    <w:p>
+      <w:pPr>
+        <w:pStyle w:val="ListBullet"/>
+      </w:pPr>
+      <w:r>
+        <w:t>• Las direcciones de memoria se muestran a la izquierda de cada bloque</w:t>
+      </w:r>
+    </w:p>
+    <w:p>
+      <w:pPr>
+        <w:pStyle w:val="Heading3"/>
+      </w:pPr>
+      <w:r>
+        <w:t>6.2.4 Gráfico de Gantt (Abajo)</w:t>
+      </w:r>
+    </w:p>
+    <w:p>
+      <w:r>
+        <w:t>Línea de tiempo que muestra el historial de uso de CPU:</w:t>
+      </w:r>
+    </w:p>
+    <w:p>
+      <w:pPr>
+        <w:pStyle w:val="ListBullet"/>
+      </w:pPr>
+      <w:r>
+        <w:t>• Cada segmento representa un período de ejecución</w:t>
+      </w:r>
+    </w:p>
+    <w:p>
+      <w:pPr>
+        <w:pStyle w:val="ListBullet"/>
+      </w:pPr>
+      <w:r>
+        <w:t>• Los colores corresponden a los procesos</w:t>
+      </w:r>
+    </w:p>
+    <w:p>
+      <w:pPr>
+        <w:pStyle w:val="ListBullet"/>
+      </w:pPr>
+      <w:r>
+        <w:t>• Muestra los últimos 60 ticks de ejecución</w:t>
+      </w:r>
+    </w:p>
+    <w:p>
+      <w:pPr>
+        <w:pStyle w:val="ListBullet"/>
+      </w:pPr>
+      <w:r>
+        <w:t>• El proceso actual se resalta en dorado</w:t>
+      </w:r>
+    </w:p>
+    <w:p>
+      <w:pPr>
+        <w:pStyle w:val="ListBullet"/>
+      </w:pPr>
+      <w:r>
+        <w:t>• Botón 'Limpiar Gantt' para reiniciar el historial</w:t>
+      </w:r>
+    </w:p>
+    <w:p>
+      <w:pPr>
+        <w:pStyle w:val="Heading3"/>
+      </w:pPr>
+      <w:r>
+        <w:t>6.2.5 Log de Eventos (Abajo)</w:t>
+      </w:r>
+    </w:p>
+    <w:p>
+      <w:r>
+        <w:t>Registro textual de todas las operaciones del sistema:</w:t>
+      </w:r>
+    </w:p>
+    <w:p>
+      <w:pPr>
+        <w:pStyle w:val="ListBullet"/>
+      </w:pPr>
+      <w:r>
+        <w:t>• Muestra eventos con timestamp (HH:MM:SS)</w:t>
+      </w:r>
+    </w:p>
+    <w:p>
+      <w:pPr>
+        <w:pStyle w:val="ListBullet"/>
+      </w:pPr>
+      <w:r>
+        <w:t>• Scroll automático al final</w:t>
+      </w:r>
+    </w:p>
+    <w:p>
+      <w:pPr>
+        <w:pStyle w:val="ListBullet"/>
+      </w:pPr>
+      <w:r>
+        <w:t>• Límite de 200 líneas (elimina las antiguas automáticamente)</w:t>
+      </w:r>
+    </w:p>
+    <w:p>
+      <w:pPr>
+        <w:pStyle w:val="ListBullet"/>
+      </w:pPr>
+      <w:r>
+        <w:t>• Fuente monospace para mejor legibilidad</w:t>
+      </w:r>
+    </w:p>
+    <w:p>
+      <w:pPr>
+        <w:pStyle w:val="Heading2"/>
+      </w:pPr>
+      <w:r>
+        <w:t>6.3 Operaciones Básicas</w:t>
+      </w:r>
+    </w:p>
+    <w:p>
+      <w:pPr>
+        <w:pStyle w:val="Heading3"/>
+      </w:pPr>
+      <w:r>
+        <w:t>6.3.1 Agregar un Proceso Manualmente</w:t>
+      </w:r>
+    </w:p>
+    <w:p>
+      <w:pPr>
+        <w:pStyle w:val="ListBullet"/>
+      </w:pPr>
+      <w:r>
+        <w:t>Hacer clic en el botón '➕ Agregar Proceso Manual'</w:t>
+      </w:r>
+    </w:p>
+    <w:p>
+      <w:pPr>
+        <w:pStyle w:val="ListBullet"/>
+      </w:pPr>
+      <w:r>
+        <w:t>Se abrirá una ventana modal con tres campos:</w:t>
+      </w:r>
+    </w:p>
+    <w:p>
+      <w:pPr>
+        <w:pStyle w:val="ListBullet"/>
+      </w:pPr>
+      <w:r>
+        <w:t xml:space="preserve">  - Tamaño (KB): Ingresar el tamaño del proceso en kilobytes</w:t>
+      </w:r>
+    </w:p>
+    <w:p>
+      <w:pPr>
+        <w:pStyle w:val="ListBullet"/>
+      </w:pPr>
+      <w:r>
+        <w:t xml:space="preserve">  - Tiempo de Ejecución (Seg): Duración total del proceso</w:t>
+      </w:r>
+    </w:p>
+    <w:p>
+      <w:pPr>
+        <w:pStyle w:val="ListBullet"/>
+      </w:pPr>
+      <w:r>
+        <w:t xml:space="preserve">  - Prioridad: Nivel de prioridad (número entero, menor = mayor prioridad)</w:t>
+      </w:r>
+    </w:p>
+    <w:p>
+      <w:pPr>
+        <w:pStyle w:val="ListBullet"/>
+      </w:pPr>
+      <w:r>
+        <w:t>Hacer clic en '✓ Confirmar y Agregar'</w:t>
+      </w:r>
+    </w:p>
+    <w:p>
+      <w:pPr>
+        <w:pStyle w:val="ListBullet"/>
+      </w:pPr>
+      <w:r>
+        <w:t>El proceso aparecerá en la tabla en estado NUEVO</w:t>
+      </w:r>
+    </w:p>
+    <w:p>
+      <w:pPr>
+        <w:pStyle w:val="ListBullet"/>
+      </w:pPr>
+      <w:r>
+        <w:t>Cuando haya memoria disponible, se cargará automáticamente</w:t>
+      </w:r>
+    </w:p>
+    <w:p>
+      <w:pPr>
+        <w:pStyle w:val="Heading3"/>
+      </w:pPr>
+      <w:r>
+        <w:t>6.3.2 Cambiar Algoritmo de Planificación</w:t>
+      </w:r>
+    </w:p>
+    <w:p>
+      <w:r>
+        <w:t>1. Seleccionar nuevo algoritmo en el ComboBox '🔄 Algoritmo de Planificación'</w:t>
+      </w:r>
+    </w:p>
+    <w:p>
+      <w:r>
+        <w:t>2. El cambio se aplica inmediatamente</w:t>
+      </w:r>
+    </w:p>
+    <w:p>
+      <w:r>
+        <w:t>3. Si se selecciona Round Robin, el campo Quantum se habilita</w:t>
+      </w:r>
+    </w:p>
+    <w:p>
+      <w:r>
+        <w:t>4. Si se selecciona otro algoritmo, el campo Quantum se deshabilita</w:t>
+      </w:r>
+    </w:p>
+    <w:p>
+      <w:r>
+        <w:t>5. Los procesos existentes se reordenan según el nuevo algoritmo</w:t>
+      </w:r>
+    </w:p>
+    <w:p>
+      <w:pPr>
+        <w:pStyle w:val="Heading3"/>
+      </w:pPr>
+      <w:r>
+        <w:t>6.3.3 Cambiar Estrategia de Memoria</w:t>
+      </w:r>
+    </w:p>
+    <w:p>
+      <w:r>
+        <w:t>1. Seleccionar nueva estrategia en el ComboBox '🧩 Estrategia de Asignación'</w:t>
+      </w:r>
+    </w:p>
+    <w:p>
+      <w:r>
+        <w:t>2. El cambio afecta solo a los nuevos procesos que se agreguen</w:t>
+      </w:r>
+    </w:p>
+    <w:p>
+      <w:r>
+        <w:t>3. Los procesos ya en memoria no se mueven</w:t>
+      </w:r>
+    </w:p>
+    <w:p>
+      <w:r>
+        <w:t>4. Las estrategias disponibles son:</w:t>
+      </w:r>
+    </w:p>
+    <w:p>
+      <w:pPr>
+        <w:pStyle w:val="ListBullet2"/>
+      </w:pPr>
+      <w:r>
+        <w:t xml:space="preserve">   • First Fit: Asigna el primer bloque que cumpla</w:t>
+      </w:r>
+    </w:p>
+    <w:p>
+      <w:pPr>
+        <w:pStyle w:val="ListBullet2"/>
+      </w:pPr>
+      <w:r>
+        <w:t xml:space="preserve">   • Best Fit: Asigna el bloque más pequeño que cumpla</w:t>
+      </w:r>
+    </w:p>
+    <w:p>
+      <w:pPr>
+        <w:pStyle w:val="ListBullet2"/>
+      </w:pPr>
+      <w:r>
+        <w:t xml:space="preserve">   • Worst Fit: Asigna el bloque más grande disponible</w:t>
+      </w:r>
+    </w:p>
+    <w:p>
+      <w:pPr>
+        <w:pStyle w:val="Heading3"/>
+      </w:pPr>
+      <w:r>
+        <w:t>6.3.4 Reiniciar el Sistema</w:t>
+      </w:r>
+    </w:p>
+    <w:p>
+      <w:r>
+        <w:t>1. Cambiar el valor en '💾 Total RAM (KB)'</w:t>
+      </w:r>
+    </w:p>
+    <w:p>
+      <w:r>
+        <w:t>2. Presionar el botón '🔄 Cambiar'</w:t>
+      </w:r>
+    </w:p>
+    <w:p>
+      <w:r>
+        <w:t>3. El sistema se reinicia completamente:</w:t>
+      </w:r>
+    </w:p>
+    <w:p>
+      <w:pPr>
+        <w:pStyle w:val="ListBullet2"/>
+      </w:pPr>
+      <w:r>
+        <w:t xml:space="preserve">   • Todos los procesos se eliminan</w:t>
+      </w:r>
+    </w:p>
+    <w:p>
+      <w:pPr>
+        <w:pStyle w:val="ListBullet2"/>
+      </w:pPr>
+      <w:r>
+        <w:t xml:space="preserve">   • La memoria se reinicia con el nuevo tamaño</w:t>
+      </w:r>
+    </w:p>
+    <w:p>
+      <w:pPr>
+        <w:pStyle w:val="ListBullet2"/>
+      </w:pPr>
+      <w:r>
+        <w:t xml:space="preserve">   • El Gantt se limpia</w:t>
+      </w:r>
+    </w:p>
+    <w:p>
+      <w:pPr>
+        <w:pStyle w:val="ListBullet2"/>
+      </w:pPr>
+      <w:r>
+        <w:t xml:space="preserve">   • El log muestra el mensaje de reinicio</w:t>
+      </w:r>
+    </w:p>
+    <w:p>
+      <w:pPr>
+        <w:pStyle w:val="Heading2"/>
+      </w:pPr>
+      <w:r>
+        <w:t>6.4 Interpretación de la Visualización</w:t>
+      </w:r>
+    </w:p>
+    <w:p>
+      <w:pPr>
+        <w:pStyle w:val="Heading3"/>
+      </w:pPr>
+      <w:r>
+        <w:t>6.4.1 Estados de Proceso</w:t>
+      </w:r>
+    </w:p>
+    <w:p>
+      <w:r>
+        <w:rPr>
+          <w:b/>
+        </w:rPr>
+        <w:t xml:space="preserve">🆕 NUEVO: </w:t>
+      </w:r>
+      <w:r>
+        <w:rPr>
+          <w:b w:val="0"/>
+        </w:rPr>
+        <w:t>Proceso recién creado, esperando memoria disponible</w:t>
+      </w:r>
+    </w:p>
+    <w:p>
+      <w:r>
+        <w:rPr>
+          <w:b/>
+        </w:rPr>
+        <w:t xml:space="preserve">✅ LISTO: </w:t>
+      </w:r>
+      <w:r>
+        <w:rPr>
+          <w:b w:val="0"/>
+        </w:rPr>
+        <w:t>Proceso en memoria, listo para ejecutarse, esperando CPU</w:t>
+      </w:r>
+    </w:p>
+    <w:p>
+      <w:r>
+        <w:rPr>
+          <w:b/>
+        </w:rPr>
+        <w:t xml:space="preserve">⚡ EJECUCION: </w:t>
+      </w:r>
+      <w:r>
+        <w:rPr>
+          <w:b w:val="0"/>
+        </w:rPr>
+        <w:t>Proceso actualmente ejecutándose en la CPU</w:t>
+      </w:r>
+    </w:p>
+    <w:p>
+      <w:r>
+        <w:rPr>
+          <w:b/>
+        </w:rPr>
+        <w:t xml:space="preserve">⏸️ BLOQUEADO: </w:t>
+      </w:r>
+      <w:r>
+        <w:rPr>
+          <w:b w:val="0"/>
+        </w:rPr>
+        <w:t>Proceso esperando I/O o algún recurso</w:t>
+      </w:r>
+    </w:p>
+    <w:p>
+      <w:r>
+        <w:rPr>
+          <w:b/>
+        </w:rPr>
+        <w:t xml:space="preserve">✔️ TERMINADO: </w:t>
+      </w:r>
+      <w:r>
+        <w:rPr>
+          <w:b w:val="0"/>
+        </w:rPr>
+        <w:t>Proceso que ha finalizado, su memoria será liberada</w:t>
+      </w:r>
+    </w:p>
+    <w:p>
+      <w:pPr>
+        <w:pStyle w:val="Heading3"/>
+      </w:pPr>
+      <w:r>
+        <w:t>6.4.2 Visualización de Memoria</w:t>
+      </w:r>
+    </w:p>
+    <w:p>
+      <w:r>
+        <w:t>• Los bloques de memoria se muestran de arriba hacia abajo</w:t>
+      </w:r>
+    </w:p>
+    <w:p>
+      <w:r>
+        <w:t>• El tamaño de cada bloque es proporcional a su tamaño real</w:t>
+      </w:r>
+    </w:p>
+    <w:p>
+      <w:r>
+        <w:t>• El proceso en ejecución tiene un resaltado dorado brillante</w:t>
+      </w:r>
+    </w:p>
+    <w:p>
+      <w:r>
+        <w:t>• Al pasar el mouse, el label inferior muestra: estado, PID, tamaño y dirección</w:t>
+      </w:r>
+    </w:p>
+    <w:p>
+      <w:r>
+        <w:t>• Los bloques libres aparecen en gris y pueden ser reutilizados</w:t>
+      </w:r>
+    </w:p>
+    <w:p>
+      <w:pPr>
+        <w:pStyle w:val="Heading3"/>
+      </w:pPr>
+      <w:r>
+        <w:t>6.4.3 Gráfico de Gantt</w:t>
+      </w:r>
+    </w:p>
+    <w:p>
+      <w:r>
+        <w:t>• El gráfico muestra el historial de ejecución de izquierda a derecha</w:t>
+      </w:r>
+    </w:p>
+    <w:p>
+      <w:r>
+        <w:t>• Cada segmento representa un tick de ejecución</w:t>
+      </w:r>
+    </w:p>
+    <w:p>
+      <w:r>
+        <w:t>• Los segmentos del mismo color pertenecen al mismo proceso</w:t>
+      </w:r>
+    </w:p>
+    <w:p>
+      <w:r>
+        <w:t>• El segmento actual (dorado) muestra qué proceso está ejecutándose ahora</w:t>
+      </w:r>
+    </w:p>
+    <w:p>
+      <w:r>
+        <w:t>• El ancho de cada segmento es proporcional a su duración</w:t>
+      </w:r>
+    </w:p>
+    <w:p>
+      <w:pPr>
+        <w:pStyle w:val="Heading2"/>
+      </w:pPr>
+      <w:r>
+        <w:t>6.5 Consejos y Mejores Prácticas</w:t>
+      </w:r>
+    </w:p>
+    <w:p>
+      <w:pPr>
+        <w:pStyle w:val="ListBullet"/>
+      </w:pPr>
+      <w:r>
+        <w:t>Usa 'Generar Test Automático' para ver una demostración rápida del sistema</w:t>
+      </w:r>
+    </w:p>
+    <w:p>
+      <w:pPr>
+        <w:pStyle w:val="ListBullet"/>
+      </w:pPr>
+      <w:r>
+        <w:t>Observa el log de eventos para entender el flujo completo del sistema</w:t>
+      </w:r>
+    </w:p>
+    <w:p>
+      <w:pPr>
+        <w:pStyle w:val="ListBullet"/>
+      </w:pPr>
+      <w:r>
+        <w:t>Pasa el mouse sobre la memoria para ver detalles específicos de cada bloque</w:t>
+      </w:r>
+    </w:p>
+    <w:p>
+      <w:pPr>
+        <w:pStyle w:val="ListBullet"/>
+      </w:pPr>
+      <w:r>
+        <w:t>Compara diferentes algoritmos de planificación con los mismos procesos</w:t>
+      </w:r>
+    </w:p>
+    <w:p>
+      <w:pPr>
+        <w:pStyle w:val="ListBullet"/>
+      </w:pPr>
+      <w:r>
+        <w:t>Experimenta con diferentes estrategias de memoria para ver cómo afectan la asignación</w:t>
+      </w:r>
+    </w:p>
+    <w:p>
+      <w:pPr>
+        <w:pStyle w:val="ListBullet"/>
+      </w:pPr>
+      <w:r>
+        <w:t>Usa procesos con diferentes tamaños y prioridades para ver el comportamiento</w:t>
+      </w:r>
+    </w:p>
+    <w:p>
+      <w:pPr>
+        <w:pStyle w:val="ListBullet"/>
+      </w:pPr>
+      <w:r>
+        <w:t>El proceso en ejecución siempre se resalta en dorado en memoria y Gantt</w:t>
+      </w:r>
+    </w:p>
+    <w:p>
+      <w:pPr>
+        <w:pStyle w:val="ListBullet"/>
+      </w:pPr>
+      <w:r>
+        <w:t>Puedes cambiar el algoritmo durante la ejecución para ver diferencias en tiempo real</w:t>
+      </w:r>
+    </w:p>
+    <w:p>
+      <w:pPr>
+        <w:pStyle w:val="Heading2"/>
+      </w:pPr>
+      <w:r>
+        <w:t>6.6 Solución de Problemas</w:t>
+      </w:r>
+    </w:p>
+    <w:p>
+      <w:r>
+        <w:rPr>
+          <w:b/>
+        </w:rPr>
+        <w:t>Problema: Proceso no se carga a memoria</w:t>
+      </w:r>
+    </w:p>
+    <w:p>
+      <w:pPr>
+        <w:pStyle w:val="ListBullet2"/>
+      </w:pPr>
+      <w:r>
+        <w:t xml:space="preserve">   Solución: Verificar que haya suficiente memoria disponible. El proceso permanecerá en estado NUEVO hasta que haya espacio.</w:t>
+      </w:r>
+    </w:p>
+    <w:p>
+      <w:r>
+        <w:rPr>
+          <w:b/>
+        </w:rPr>
+        <w:t>Problema: No veo cambios en la interfaz</w:t>
+      </w:r>
+    </w:p>
+    <w:p>
+      <w:pPr>
+        <w:pStyle w:val="ListBullet2"/>
+      </w:pPr>
+      <w:r>
+        <w:t xml:space="preserve">   Solución: Asegurarse de que la simulación esté iniciada (botón debe decir '⏸ PAUSAR').</w:t>
+      </w:r>
+    </w:p>
+    <w:p>
+      <w:r>
+        <w:rPr>
+          <w:b/>
+        </w:rPr>
+        <w:t>Problema: Quantum no funciona</w:t>
+      </w:r>
+    </w:p>
+    <w:p>
+      <w:pPr>
+        <w:pStyle w:val="ListBullet2"/>
+      </w:pPr>
+      <w:r>
+        <w:t xml:space="preserve">   Solución: Verificar que el algoritmo seleccionado sea 'Round Robin'. El quantum solo aplica a este algoritmo.</w:t>
+      </w:r>
+    </w:p>
+    <w:p>
+      <w:r>
+        <w:rPr>
+          <w:b/>
+        </w:rPr>
+        <w:t>Problema: Memoria no se actualiza</w:t>
+      </w:r>
+    </w:p>
+    <w:p>
+      <w:pPr>
+        <w:pStyle w:val="ListBullet2"/>
+      </w:pPr>
+      <w:r>
+        <w:t xml:space="preserve">   Solución: La memoria se actualiza automáticamente. Si no hay cambios, verificar que los procesos estén en ejecución.</w:t>
+      </w:r>
+    </w:p>
+    <w:p>
+      <w:r>
+        <w:rPr>
+          <w:b/>
+        </w:rPr>
+        <w:t>Problema: Gantt está vacío</w:t>
+      </w:r>
+    </w:p>
+    <w:p>
+      <w:pPr>
+        <w:pStyle w:val="ListBullet2"/>
+      </w:pPr>
+      <w:r>
+        <w:t xml:space="preserve">   Solución: El Gantt solo muestra ejecuciones. Esperar a que los procesos comiencen a ejecutarse.</w:t>
+      </w:r>
+    </w:p>
+    <w:p>
+      <w:r>
+        <w:br w:type="page"/>
+      </w:r>
+    </w:p>
+    <w:p>
+      <w:pPr>
+        <w:pStyle w:val="Heading1"/>
+      </w:pPr>
+      <w:r>
+        <w:t>7. IMÁGENES DE LA INTERFAZ</w:t>
+      </w:r>
+    </w:p>
+    <w:p>
+      <w:r>
+        <w:t>A continuación se listan las imágenes que deben capturarse de la interfaz para completar la documentación:</w:t>
+      </w:r>
+    </w:p>
+    <w:p/>
+    <w:p>
+      <w:pPr>
+        <w:pStyle w:val="Heading2"/>
+      </w:pPr>
+      <w:r>
+        <w:t>7.1 Lista de Imágenes Requeridas</w:t>
+      </w:r>
+    </w:p>
+    <w:tbl>
+      <w:tblPr>
+        <w:tblStyle w:val="LightGrid-Accent1"/>
+        <w:tblW w:type="auto" w:w="0"/>
+        <w:tblLook w:firstColumn="1" w:firstRow="1" w:lastColumn="0" w:lastRow="0" w:noHBand="0" w:noVBand="1" w:val="04A0"/>
+      </w:tblPr>
+      <w:tblGrid>
+        <w:gridCol w:w="2946"/>
+        <w:gridCol w:w="2946"/>
+        <w:gridCol w:w="2946"/>
+      </w:tblGrid>
+      <w:tr>
+        <w:tc>
+          <w:tcPr>
+            <w:tcW w:type="dxa" w:w="2946"/>
+            <w:shd w:fill="4472C4"/>
+          </w:tcPr>
+          <w:p>
+            <w:r>
+              <w:rPr>
+                <w:b/>
+                <w:color w:val="FFFFFF"/>
+              </w:rPr>
+              <w:t>Nombre del Archivo</w:t>
+            </w:r>
+          </w:p>
+        </w:tc>
+        <w:tc>
+          <w:tcPr>
+            <w:tcW w:type="dxa" w:w="2946"/>
+            <w:shd w:fill="4472C4"/>
+          </w:tcPr>
+          <w:p>
+            <w:r>
+              <w:rPr>
+                <w:b/>
+                <w:color w:val="FFFFFF"/>
+              </w:rPr>
+              <w:t>Descripción</w:t>
+            </w:r>
+          </w:p>
+        </w:tc>
+        <w:tc>
+          <w:tcPr>
+            <w:tcW w:type="dxa" w:w="2946"/>
+            <w:shd w:fill="4472C4"/>
+          </w:tcPr>
+          <w:p>
+            <w:r>
+              <w:rPr>
+                <w:b/>
+                <w:color w:val="FFFFFF"/>
+              </w:rPr>
+              <w:t>Instrucciones de Captura</w:t>
+            </w:r>
+          </w:p>
+        </w:tc>
+      </w:tr>
+      <w:tr>
+        <w:tc>
+          <w:tcPr>
+            <w:tcW w:type="dxa" w:w="2946"/>
+          </w:tcPr>
+          <w:p>
+            <w:r>
+              <w:rPr>
+                <w:b/>
+              </w:rPr>
+              <w:t>imagen_01_interfaz_completa.png</w:t>
+            </w:r>
+          </w:p>
+        </w:tc>
+        <w:tc>
+          <w:tcPr>
+            <w:tcW w:type="dxa" w:w="2946"/>
+          </w:tcPr>
+          <w:p>
+            <w:r>
+              <w:t>Vista completa de la interfaz del simulador mostrando todos los paneles</w:t>
+            </w:r>
+          </w:p>
+        </w:tc>
+        <w:tc>
+          <w:tcPr>
+            <w:tcW w:type="dxa" w:w="2946"/>
+          </w:tcPr>
+          <w:p>
+            <w:r>
+              <w:t>Capturar la pantalla completa cuando la interfaz está abierta, mostrando panel de configuración, tabla de procesos, memoria, Gantt y log</w:t>
+            </w:r>
+          </w:p>
+        </w:tc>
+      </w:tr>
+      <w:tr>
+        <w:tc>
+          <w:tcPr>
+            <w:tcW w:type="dxa" w:w="2946"/>
+          </w:tcPr>
+          <w:p>
+            <w:r>
+              <w:rPr>
+                <w:b/>
+              </w:rPr>
+              <w:t>imagen_02_panel_configuracion.png</w:t>
+            </w:r>
+          </w:p>
+        </w:tc>
+        <w:tc>
+          <w:tcPr>
+            <w:tcW w:type="dxa" w:w="2946"/>
+          </w:tcPr>
+          <w:p>
+            <w:r>
+              <w:t>Panel de configuración detallado</w:t>
+            </w:r>
+          </w:p>
+        </w:tc>
+        <w:tc>
+          <w:tcPr>
+            <w:tcW w:type="dxa" w:w="2946"/>
+          </w:tcPr>
+          <w:p>
+            <w:r>
+              <w:t>Zoom al panel izquierdo mostrando todos los controles: memoria, algoritmo, quantum, estrategia y botones</w:t>
+            </w:r>
+          </w:p>
+        </w:tc>
+      </w:tr>
+      <w:tr>
+        <w:tc>
+          <w:tcPr>
+            <w:tcW w:type="dxa" w:w="2946"/>
+          </w:tcPr>
+          <w:p>
+            <w:r>
+              <w:rPr>
+                <w:b/>
+              </w:rPr>
+              <w:t>imagen_03_tabla_procesos.png</w:t>
+            </w:r>
+          </w:p>
+        </w:tc>
+        <w:tc>
+          <w:tcPr>
+            <w:tcW w:type="dxa" w:w="2946"/>
+          </w:tcPr>
+          <w:p>
+            <w:r>
+              <w:t>Tabla de procesos con varios procesos en diferentes estados</w:t>
+            </w:r>
+          </w:p>
+        </w:tc>
+        <w:tc>
+          <w:tcPr>
+            <w:tcW w:type="dxa" w:w="2946"/>
+          </w:tcPr>
+          <w:p>
+            <w:r>
+              <w:t>Capturar la tabla de procesos mostrando procesos en diferentes estados (NUEVO, LISTO, EJECUCION, BLOQUEADO)</w:t>
+            </w:r>
+          </w:p>
+        </w:tc>
+      </w:tr>
+      <w:tr>
+        <w:tc>
+          <w:tcPr>
+            <w:tcW w:type="dxa" w:w="2946"/>
+          </w:tcPr>
+          <w:p>
+            <w:r>
+              <w:rPr>
+                <w:b/>
+              </w:rPr>
+              <w:t>imagen_04_memoria_ocupada.png</w:t>
+            </w:r>
+          </w:p>
+        </w:tc>
+        <w:tc>
+          <w:tcPr>
+            <w:tcW w:type="dxa" w:w="2946"/>
+          </w:tcPr>
+          <w:p>
+            <w:r>
+              <w:t>Visualización de memoria con procesos asignados</w:t>
+            </w:r>
+          </w:p>
+        </w:tc>
+        <w:tc>
+          <w:tcPr>
+            <w:tcW w:type="dxa" w:w="2946"/>
+          </w:tcPr>
+          <w:p>
+            <w:r>
+              <w:t>Capturar la visualización de memoria cuando hay varios procesos cargados, mostrando bloques de diferentes colores</w:t>
+            </w:r>
+          </w:p>
+        </w:tc>
+      </w:tr>
+      <w:tr>
+        <w:tc>
+          <w:tcPr>
+            <w:tcW w:type="dxa" w:w="2946"/>
+          </w:tcPr>
+          <w:p>
+            <w:r>
+              <w:rPr>
+                <w:b/>
+              </w:rPr>
+              <w:t>imagen_05_proceso_ejecutando.png</w:t>
+            </w:r>
+          </w:p>
+        </w:tc>
+        <w:tc>
+          <w:tcPr>
+            <w:tcW w:type="dxa" w:w="2946"/>
+          </w:tcPr>
+          <w:p>
+            <w:r>
+              <w:t>Memoria mostrando proceso en ejecución (resaltado dorado)</w:t>
+            </w:r>
+          </w:p>
+        </w:tc>
+        <w:tc>
+          <w:tcPr>
+            <w:tcW w:type="dxa" w:w="2946"/>
+          </w:tcPr>
+          <w:p>
+            <w:r>
+              <w:t>Capturar cuando hay un proceso en ejecución, mostrando el resaltado dorado brillante del proceso activo</w:t>
+            </w:r>
+          </w:p>
+        </w:tc>
+      </w:tr>
+      <w:tr>
+        <w:tc>
+          <w:tcPr>
+            <w:tcW w:type="dxa" w:w="2946"/>
+          </w:tcPr>
+          <w:p>
+            <w:r>
+              <w:rPr>
+                <w:b/>
+              </w:rPr>
+              <w:t>imagen_06_gantt_ejecutando.png</w:t>
+            </w:r>
+          </w:p>
+        </w:tc>
+        <w:tc>
+          <w:tcPr>
+            <w:tcW w:type="dxa" w:w="2946"/>
+          </w:tcPr>
+          <w:p>
+            <w:r>
+              <w:t>Gráfico de Gantt con historial de ejecución</w:t>
+            </w:r>
+          </w:p>
+        </w:tc>
+        <w:tc>
+          <w:tcPr>
+            <w:tcW w:type="dxa" w:w="2946"/>
+          </w:tcPr>
+          <w:p>
+            <w:r>
+              <w:t>Capturar el gráfico de Gantt cuando hay varios ticks de ejecución, mostrando diferentes colores por proceso</w:t>
+            </w:r>
+          </w:p>
+        </w:tc>
+      </w:tr>
+      <w:tr>
+        <w:tc>
+          <w:tcPr>
+            <w:tcW w:type="dxa" w:w="2946"/>
+          </w:tcPr>
+          <w:p>
+            <w:r>
+              <w:rPr>
+                <w:b/>
+              </w:rPr>
+              <w:t>imagen_07_log_eventos.png</w:t>
+            </w:r>
+          </w:p>
+        </w:tc>
+        <w:tc>
+          <w:tcPr>
+            <w:tcW w:type="dxa" w:w="2946"/>
+          </w:tcPr>
+          <w:p>
+            <w:r>
+              <w:t>Log de eventos mostrando mensajes del sistema</w:t>
+            </w:r>
+          </w:p>
+        </w:tc>
+        <w:tc>
+          <w:tcPr>
+            <w:tcW w:type="dxa" w:w="2946"/>
+          </w:tcPr>
+          <w:p>
+            <w:r>
+              <w:t>Capturar el log con varios mensajes visibles, mostrando timestamps y diferentes tipos de eventos</w:t>
+            </w:r>
+          </w:p>
+        </w:tc>
+      </w:tr>
+      <w:tr>
+        <w:tc>
+          <w:tcPr>
+            <w:tcW w:type="dxa" w:w="2946"/>
+          </w:tcPr>
+          <w:p>
+            <w:r>
+              <w:rPr>
+                <w:b/>
+              </w:rPr>
+              <w:t>imagen_08_ventana_agregar_proceso.png</w:t>
+            </w:r>
+          </w:p>
+        </w:tc>
+        <w:tc>
+          <w:tcPr>
+            <w:tcW w:type="dxa" w:w="2946"/>
+          </w:tcPr>
+          <w:p>
+            <w:r>
+              <w:t>Ventana modal para agregar proceso manualmente</w:t>
+            </w:r>
+          </w:p>
+        </w:tc>
+        <w:tc>
+          <w:tcPr>
+            <w:tcW w:type="dxa" w:w="2946"/>
+          </w:tcPr>
+          <w:p>
+            <w:r>
+              <w:t>Abrir la ventana de agregar proceso y capturar la ventana modal completa</w:t>
+            </w:r>
+          </w:p>
+        </w:tc>
+      </w:tr>
+      <w:tr>
+        <w:tc>
+          <w:tcPr>
+            <w:tcW w:type="dxa" w:w="2946"/>
+          </w:tcPr>
+          <w:p>
+            <w:r>
+              <w:rPr>
+                <w:b/>
+              </w:rPr>
+              <w:t>imagen_09_hover_memoria.png</w:t>
+            </w:r>
+          </w:p>
+        </w:tc>
+        <w:tc>
+          <w:tcPr>
+            <w:tcW w:type="dxa" w:w="2946"/>
+          </w:tcPr>
+          <w:p>
+            <w:r>
+              <w:t>Hover informativo sobre bloque de memoria</w:t>
+            </w:r>
+          </w:p>
+        </w:tc>
+        <w:tc>
+          <w:tcPr>
+            <w:tcW w:type="dxa" w:w="2946"/>
+          </w:tcPr>
+          <w:p>
+            <w:r>
+              <w:t>Pasar el mouse sobre un bloque de memoria y capturar cuando se muestra la información detallada en el label inferior</w:t>
+            </w:r>
+          </w:p>
+        </w:tc>
+      </w:tr>
+      <w:tr>
+        <w:tc>
+          <w:tcPr>
+            <w:tcW w:type="dxa" w:w="2946"/>
+          </w:tcPr>
+          <w:p>
+            <w:r>
+              <w:rPr>
+                <w:b/>
+              </w:rPr>
+              <w:t>imagen_10_comparacion_algoritmos.png</w:t>
+            </w:r>
+          </w:p>
+        </w:tc>
+        <w:tc>
+          <w:tcPr>
+            <w:tcW w:type="dxa" w:w="2946"/>
+          </w:tcPr>
+          <w:p>
+            <w:r>
+              <w:t>Comparación visual de diferentes algoritmos</w:t>
+            </w:r>
+          </w:p>
+        </w:tc>
+        <w:tc>
+          <w:tcPr>
+            <w:tcW w:type="dxa" w:w="2946"/>
+          </w:tcPr>
+          <w:p>
+            <w:r>
+              <w:t>Capturar la interfaz con Round Robin y luego con SJF, mostrando diferencias en el orden de ejecución</w:t>
+            </w:r>
+          </w:p>
+        </w:tc>
+      </w:tr>
+    </w:tbl>
+    <w:p/>
+    <w:p>
+      <w:pPr>
+        <w:pStyle w:val="Heading2"/>
+      </w:pPr>
+      <w:r>
+        <w:t>7.2 Instrucciones para Capturar Imágenes</w:t>
+      </w:r>
+    </w:p>
+    <w:p>
+      <w:r>
+        <w:t>Para capturar las imágenes de la interfaz:</w:t>
+      </w:r>
+    </w:p>
+    <w:p>
+      <w:pPr>
+        <w:pStyle w:val="ListNumber"/>
+      </w:pPr>
+      <w:r>
+        <w:t>1. Ejecutar el simulador: python main.py</w:t>
+      </w:r>
+    </w:p>
+    <w:p>
+      <w:pPr>
+        <w:pStyle w:val="ListNumber"/>
+      </w:pPr>
+      <w:r>
+        <w:t>2. Configurar parámetros iniciales (memoria, algoritmo, etc.)</w:t>
+      </w:r>
+    </w:p>
+    <w:p>
+      <w:pPr>
+        <w:pStyle w:val="ListNumber"/>
+      </w:pPr>
+      <w:r>
+        <w:t>3. Crear algunos procesos (manual o test automático)</w:t>
+      </w:r>
+    </w:p>
+    <w:p>
+      <w:pPr>
+        <w:pStyle w:val="ListNumber"/>
+      </w:pPr>
+      <w:r>
+        <w:t>4. Iniciar la simulación</w:t>
+      </w:r>
+    </w:p>
+    <w:p>
+      <w:pPr>
+        <w:pStyle w:val="ListNumber"/>
+      </w:pPr>
+      <w:r>
+        <w:t>5. Usar herramienta de captura de pantalla (Snipping Tool, Print Screen, etc.)</w:t>
+      </w:r>
+    </w:p>
+    <w:p>
+      <w:pPr>
+        <w:pStyle w:val="ListNumber"/>
+      </w:pPr>
+      <w:r>
+        <w:t>6. Guardar las imágenes con los nombres especificados en formato PNG</w:t>
+      </w:r>
+    </w:p>
+    <w:p>
+      <w:pPr>
+        <w:pStyle w:val="ListNumber"/>
+      </w:pPr>
+      <w:r>
+        <w:t>7. Insertar las imágenes en el documento Word en las secciones correspondientes</w:t>
+      </w:r>
+    </w:p>
+    <w:p/>
+    <w:p>
+      <w:r>
+        <w:t>NOTA: Las imágenes deben tener buena resolución y mostrar claramente los elementos de la interfaz. Se recomienda usar formato PNG para mantener calidad.</w:t>
+      </w:r>
+    </w:p>
     <w:sectPr>
       <w:pgSz w:w="12240" w:h="15840"/>
       <w:pgMar w:top="1417" w:right="1701" w:bottom="1417" w:left="1701" w:header="720" w:footer="720" w:gutter="0"/>

</xml_diff>

<commit_message>
Agregar imágenes de interfaz en sección 3.3 y eliminar sección 7 de imágenes requeridas
</commit_message>
<xml_diff>
--- a/PRESENTACION_PROYECTO.docx
+++ b/PRESENTACION_PROYECTO.docx
@@ -3111,6 +3111,647 @@
     </w:tbl>
     <w:p/>
     <w:p>
+      <w:r>
+        <w:t>A continuación se muestran capturas de pantalla de la interfaz:</w:t>
+      </w:r>
+    </w:p>
+    <w:p/>
+    <w:p/>
+    <w:p>
+      <w:pPr>
+        <w:jc w:val="center"/>
+      </w:pPr>
+      <w:r>
+        <w:drawing>
+          <wp:inline xmlns:a="http://schemas.openxmlformats.org/drawingml/2006/main" xmlns:pic="http://schemas.openxmlformats.org/drawingml/2006/picture">
+            <wp:extent cx="5943600" cy="286589"/>
+            <wp:docPr id="6" name="Picture 6"/>
+            <wp:cNvGraphicFramePr>
+              <a:graphicFrameLocks noChangeAspect="1"/>
+            </wp:cNvGraphicFramePr>
+            <a:graphic>
+              <a:graphicData uri="http://schemas.openxmlformats.org/drawingml/2006/picture">
+                <pic:pic>
+                  <pic:nvPicPr>
+                    <pic:cNvPr id="0" name="Captura de pantalla 2025-12-01 144023.png"/>
+                    <pic:cNvPicPr/>
+                  </pic:nvPicPr>
+                  <pic:blipFill>
+                    <a:blip r:embed="rId14"/>
+                    <a:stretch>
+                      <a:fillRect/>
+                    </a:stretch>
+                  </pic:blipFill>
+                  <pic:spPr>
+                    <a:xfrm>
+                      <a:off x="0" y="0"/>
+                      <a:ext cx="5943600" cy="286589"/>
+                    </a:xfrm>
+                    <a:prstGeom prst="rect"/>
+                  </pic:spPr>
+                </pic:pic>
+              </a:graphicData>
+            </a:graphic>
+          </wp:inline>
+        </w:drawing>
+      </w:r>
+    </w:p>
+    <w:p>
+      <w:pPr/>
+      <w:r>
+        <w:rPr>
+          <w:b/>
+        </w:rPr>
+        <w:t>Figura 6: Log de eventos y proceso en ejecución</w:t>
+      </w:r>
+    </w:p>
+    <w:p/>
+    <w:p/>
+    <w:p>
+      <w:pPr>
+        <w:jc w:val="center"/>
+      </w:pPr>
+      <w:r>
+        <w:drawing>
+          <wp:inline xmlns:a="http://schemas.openxmlformats.org/drawingml/2006/main" xmlns:pic="http://schemas.openxmlformats.org/drawingml/2006/picture">
+            <wp:extent cx="5943600" cy="702939"/>
+            <wp:docPr id="5" name="Picture 5"/>
+            <wp:cNvGraphicFramePr>
+              <a:graphicFrameLocks noChangeAspect="1"/>
+            </wp:cNvGraphicFramePr>
+            <a:graphic>
+              <a:graphicData uri="http://schemas.openxmlformats.org/drawingml/2006/picture">
+                <pic:pic>
+                  <pic:nvPicPr>
+                    <pic:cNvPr id="0" name="Captura de pantalla 2025-12-01 144017.png"/>
+                    <pic:cNvPicPr/>
+                  </pic:nvPicPr>
+                  <pic:blipFill>
+                    <a:blip r:embed="rId13"/>
+                    <a:stretch>
+                      <a:fillRect/>
+                    </a:stretch>
+                  </pic:blipFill>
+                  <pic:spPr>
+                    <a:xfrm>
+                      <a:off x="0" y="0"/>
+                      <a:ext cx="5943600" cy="702939"/>
+                    </a:xfrm>
+                    <a:prstGeom prst="rect"/>
+                  </pic:spPr>
+                </pic:pic>
+              </a:graphicData>
+            </a:graphic>
+          </wp:inline>
+        </w:drawing>
+      </w:r>
+    </w:p>
+    <w:p>
+      <w:pPr/>
+      <w:r>
+        <w:rPr>
+          <w:b/>
+        </w:rPr>
+        <w:t>Figura 5: Gráfico de Gantt con historial de ejecución</w:t>
+      </w:r>
+    </w:p>
+    <w:p/>
+    <w:p/>
+    <w:p>
+      <w:pPr>
+        <w:jc w:val="center"/>
+      </w:pPr>
+      <w:r>
+        <w:drawing>
+          <wp:inline xmlns:a="http://schemas.openxmlformats.org/drawingml/2006/main" xmlns:pic="http://schemas.openxmlformats.org/drawingml/2006/picture">
+            <wp:extent cx="5943600" cy="12319462"/>
+            <wp:docPr id="4" name="Picture 4"/>
+            <wp:cNvGraphicFramePr>
+              <a:graphicFrameLocks noChangeAspect="1"/>
+            </wp:cNvGraphicFramePr>
+            <a:graphic>
+              <a:graphicData uri="http://schemas.openxmlformats.org/drawingml/2006/picture">
+                <pic:pic>
+                  <pic:nvPicPr>
+                    <pic:cNvPr id="0" name="Captura de pantalla 2025-12-01 144009.png"/>
+                    <pic:cNvPicPr/>
+                  </pic:nvPicPr>
+                  <pic:blipFill>
+                    <a:blip r:embed="rId12"/>
+                    <a:stretch>
+                      <a:fillRect/>
+                    </a:stretch>
+                  </pic:blipFill>
+                  <pic:spPr>
+                    <a:xfrm>
+                      <a:off x="0" y="0"/>
+                      <a:ext cx="5943600" cy="12319462"/>
+                    </a:xfrm>
+                    <a:prstGeom prst="rect"/>
+                  </pic:spPr>
+                </pic:pic>
+              </a:graphicData>
+            </a:graphic>
+          </wp:inline>
+        </w:drawing>
+      </w:r>
+    </w:p>
+    <w:p>
+      <w:pPr/>
+      <w:r>
+        <w:rPr>
+          <w:b/>
+        </w:rPr>
+        <w:t>Figura 4: Visualización gráfica del mapa de memoria</w:t>
+      </w:r>
+    </w:p>
+    <w:p/>
+    <w:p/>
+    <w:p>
+      <w:pPr>
+        <w:jc w:val="center"/>
+      </w:pPr>
+      <w:r>
+        <w:drawing>
+          <wp:inline xmlns:a="http://schemas.openxmlformats.org/drawingml/2006/main" xmlns:pic="http://schemas.openxmlformats.org/drawingml/2006/picture">
+            <wp:extent cx="5943600" cy="3186742"/>
+            <wp:docPr id="3" name="Picture 3"/>
+            <wp:cNvGraphicFramePr>
+              <a:graphicFrameLocks noChangeAspect="1"/>
+            </wp:cNvGraphicFramePr>
+            <a:graphic>
+              <a:graphicData uri="http://schemas.openxmlformats.org/drawingml/2006/picture">
+                <pic:pic>
+                  <pic:nvPicPr>
+                    <pic:cNvPr id="0" name="Captura de pantalla 2025-12-01 144005.png"/>
+                    <pic:cNvPicPr/>
+                  </pic:nvPicPr>
+                  <pic:blipFill>
+                    <a:blip r:embed="rId11"/>
+                    <a:stretch>
+                      <a:fillRect/>
+                    </a:stretch>
+                  </pic:blipFill>
+                  <pic:spPr>
+                    <a:xfrm>
+                      <a:off x="0" y="0"/>
+                      <a:ext cx="5943600" cy="3186742"/>
+                    </a:xfrm>
+                    <a:prstGeom prst="rect"/>
+                  </pic:spPr>
+                </pic:pic>
+              </a:graphicData>
+            </a:graphic>
+          </wp:inline>
+        </w:drawing>
+      </w:r>
+    </w:p>
+    <w:p>
+      <w:pPr/>
+      <w:r>
+        <w:rPr>
+          <w:b/>
+        </w:rPr>
+        <w:t>Figura 3: Tabla de procesos con diferentes estados</w:t>
+      </w:r>
+    </w:p>
+    <w:p/>
+    <w:p/>
+    <w:p>
+      <w:pPr>
+        <w:jc w:val="center"/>
+      </w:pPr>
+      <w:r>
+        <w:drawing>
+          <wp:inline xmlns:a="http://schemas.openxmlformats.org/drawingml/2006/main" xmlns:pic="http://schemas.openxmlformats.org/drawingml/2006/picture">
+            <wp:extent cx="5943600" cy="15099366"/>
+            <wp:docPr id="2" name="Picture 2"/>
+            <wp:cNvGraphicFramePr>
+              <a:graphicFrameLocks noChangeAspect="1"/>
+            </wp:cNvGraphicFramePr>
+            <a:graphic>
+              <a:graphicData uri="http://schemas.openxmlformats.org/drawingml/2006/picture">
+                <pic:pic>
+                  <pic:nvPicPr>
+                    <pic:cNvPr id="0" name="Captura de pantalla 2025-12-01 144000.png"/>
+                    <pic:cNvPicPr/>
+                  </pic:nvPicPr>
+                  <pic:blipFill>
+                    <a:blip r:embed="rId10"/>
+                    <a:stretch>
+                      <a:fillRect/>
+                    </a:stretch>
+                  </pic:blipFill>
+                  <pic:spPr>
+                    <a:xfrm>
+                      <a:off x="0" y="0"/>
+                      <a:ext cx="5943600" cy="15099366"/>
+                    </a:xfrm>
+                    <a:prstGeom prst="rect"/>
+                  </pic:spPr>
+                </pic:pic>
+              </a:graphicData>
+            </a:graphic>
+          </wp:inline>
+        </w:drawing>
+      </w:r>
+    </w:p>
+    <w:p>
+      <w:pPr/>
+      <w:r>
+        <w:rPr>
+          <w:b/>
+        </w:rPr>
+        <w:t>Figura 2: Panel de configuración con todos los controles</w:t>
+      </w:r>
+    </w:p>
+    <w:p/>
+    <w:p/>
+    <w:p>
+      <w:pPr>
+        <w:jc w:val="center"/>
+      </w:pPr>
+      <w:r>
+        <w:drawing>
+          <wp:inline xmlns:a="http://schemas.openxmlformats.org/drawingml/2006/main" xmlns:pic="http://schemas.openxmlformats.org/drawingml/2006/picture">
+            <wp:extent cx="5943600" cy="3341920"/>
+            <wp:docPr id="1" name="Picture 1"/>
+            <wp:cNvGraphicFramePr>
+              <a:graphicFrameLocks noChangeAspect="1"/>
+            </wp:cNvGraphicFramePr>
+            <a:graphic>
+              <a:graphicData uri="http://schemas.openxmlformats.org/drawingml/2006/picture">
+                <pic:pic>
+                  <pic:nvPicPr>
+                    <pic:cNvPr id="0" name="Captura de pantalla 2025-12-01 143949.png"/>
+                    <pic:cNvPicPr/>
+                  </pic:nvPicPr>
+                  <pic:blipFill>
+                    <a:blip r:embed="rId9"/>
+                    <a:stretch>
+                      <a:fillRect/>
+                    </a:stretch>
+                  </pic:blipFill>
+                  <pic:spPr>
+                    <a:xfrm>
+                      <a:off x="0" y="0"/>
+                      <a:ext cx="5943600" cy="3341920"/>
+                    </a:xfrm>
+                    <a:prstGeom prst="rect"/>
+                  </pic:spPr>
+                </pic:pic>
+              </a:graphicData>
+            </a:graphic>
+          </wp:inline>
+        </w:drawing>
+      </w:r>
+    </w:p>
+    <w:p>
+      <w:pPr/>
+      <w:r>
+        <w:rPr>
+          <w:b/>
+        </w:rPr>
+        <w:t>Figura 1: Vista completa de la interfaz mostrando todos los paneles</w:t>
+      </w:r>
+    </w:p>
+    <w:p/>
+    <w:p>
+      <w:r>
+        <w:t>A continuación se presentan capturas de pantalla de los diferentes componentes de la interfaz del simulador:</w:t>
+      </w:r>
+    </w:p>
+    <w:p/>
+    <w:p/>
+    <w:p>
+      <w:pPr>
+        <w:jc w:val="center"/>
+      </w:pPr>
+      <w:r>
+        <w:drawing>
+          <wp:inline xmlns:a="http://schemas.openxmlformats.org/drawingml/2006/main" xmlns:pic="http://schemas.openxmlformats.org/drawingml/2006/picture">
+            <wp:extent cx="5486400" cy="264543"/>
+            <wp:docPr id="12" name="Picture 12"/>
+            <wp:cNvGraphicFramePr>
+              <a:graphicFrameLocks noChangeAspect="1"/>
+            </wp:cNvGraphicFramePr>
+            <a:graphic>
+              <a:graphicData uri="http://schemas.openxmlformats.org/drawingml/2006/picture">
+                <pic:pic>
+                  <pic:nvPicPr>
+                    <pic:cNvPr id="0" name="image.png"/>
+                    <pic:cNvPicPr/>
+                  </pic:nvPicPr>
+                  <pic:blipFill>
+                    <a:blip r:embed="rId14"/>
+                    <a:stretch>
+                      <a:fillRect/>
+                    </a:stretch>
+                  </pic:blipFill>
+                  <pic:spPr>
+                    <a:xfrm>
+                      <a:off x="0" y="0"/>
+                      <a:ext cx="5486400" cy="264543"/>
+                    </a:xfrm>
+                    <a:prstGeom prst="rect"/>
+                  </pic:spPr>
+                </pic:pic>
+              </a:graphicData>
+            </a:graphic>
+          </wp:inline>
+        </w:drawing>
+      </w:r>
+    </w:p>
+    <w:p/>
+    <w:p>
+      <w:r>
+        <w:rPr>
+          <w:b/>
+          <w:sz w:val="17"/>
+        </w:rPr>
+        <w:t>Figura 6: Log de eventos con mensajes del sistema mostrando timestamps y diferentes tipos de eventos registrados durante la simulación.</w:t>
+      </w:r>
+    </w:p>
+    <w:p/>
+    <w:p/>
+    <w:p>
+      <w:pPr>
+        <w:jc w:val="center"/>
+      </w:pPr>
+      <w:r>
+        <w:drawing>
+          <wp:inline xmlns:a="http://schemas.openxmlformats.org/drawingml/2006/main" xmlns:pic="http://schemas.openxmlformats.org/drawingml/2006/picture">
+            <wp:extent cx="5486400" cy="648867"/>
+            <wp:docPr id="11" name="Picture 11"/>
+            <wp:cNvGraphicFramePr>
+              <a:graphicFrameLocks noChangeAspect="1"/>
+            </wp:cNvGraphicFramePr>
+            <a:graphic>
+              <a:graphicData uri="http://schemas.openxmlformats.org/drawingml/2006/picture">
+                <pic:pic>
+                  <pic:nvPicPr>
+                    <pic:cNvPr id="0" name="image.png"/>
+                    <pic:cNvPicPr/>
+                  </pic:nvPicPr>
+                  <pic:blipFill>
+                    <a:blip r:embed="rId13"/>
+                    <a:stretch>
+                      <a:fillRect/>
+                    </a:stretch>
+                  </pic:blipFill>
+                  <pic:spPr>
+                    <a:xfrm>
+                      <a:off x="0" y="0"/>
+                      <a:ext cx="5486400" cy="648867"/>
+                    </a:xfrm>
+                    <a:prstGeom prst="rect"/>
+                  </pic:spPr>
+                </pic:pic>
+              </a:graphicData>
+            </a:graphic>
+          </wp:inline>
+        </w:drawing>
+      </w:r>
+    </w:p>
+    <w:p/>
+    <w:p>
+      <w:r>
+        <w:rPr>
+          <w:b/>
+          <w:sz w:val="17"/>
+        </w:rPr>
+        <w:t>Figura 5: Gráfico de Gantt mostrando el historial de ejecución de procesos con diferentes colores por proceso y el segmento actual resaltado.</w:t>
+      </w:r>
+    </w:p>
+    <w:p/>
+    <w:p/>
+    <w:p>
+      <w:pPr>
+        <w:jc w:val="center"/>
+      </w:pPr>
+      <w:r>
+        <w:drawing>
+          <wp:inline xmlns:a="http://schemas.openxmlformats.org/drawingml/2006/main" xmlns:pic="http://schemas.openxmlformats.org/drawingml/2006/picture">
+            <wp:extent cx="5486400" cy="11371811"/>
+            <wp:docPr id="10" name="Picture 10"/>
+            <wp:cNvGraphicFramePr>
+              <a:graphicFrameLocks noChangeAspect="1"/>
+            </wp:cNvGraphicFramePr>
+            <a:graphic>
+              <a:graphicData uri="http://schemas.openxmlformats.org/drawingml/2006/picture">
+                <pic:pic>
+                  <pic:nvPicPr>
+                    <pic:cNvPr id="0" name="image.png"/>
+                    <pic:cNvPicPr/>
+                  </pic:nvPicPr>
+                  <pic:blipFill>
+                    <a:blip r:embed="rId12"/>
+                    <a:stretch>
+                      <a:fillRect/>
+                    </a:stretch>
+                  </pic:blipFill>
+                  <pic:spPr>
+                    <a:xfrm>
+                      <a:off x="0" y="0"/>
+                      <a:ext cx="5486400" cy="11371811"/>
+                    </a:xfrm>
+                    <a:prstGeom prst="rect"/>
+                  </pic:spPr>
+                </pic:pic>
+              </a:graphicData>
+            </a:graphic>
+          </wp:inline>
+        </w:drawing>
+      </w:r>
+    </w:p>
+    <w:p/>
+    <w:p>
+      <w:r>
+        <w:rPr>
+          <w:b/>
+          <w:sz w:val="17"/>
+        </w:rPr>
+        <w:t>Figura 4: Visualización gráfica del mapa de memoria con procesos asignados, mostrando bloques de diferentes colores y el proceso en ejecución resaltado en dorado.</w:t>
+      </w:r>
+    </w:p>
+    <w:p/>
+    <w:p/>
+    <w:p>
+      <w:pPr>
+        <w:jc w:val="center"/>
+      </w:pPr>
+      <w:r>
+        <w:drawing>
+          <wp:inline xmlns:a="http://schemas.openxmlformats.org/drawingml/2006/main" xmlns:pic="http://schemas.openxmlformats.org/drawingml/2006/picture">
+            <wp:extent cx="5486400" cy="2941608"/>
+            <wp:docPr id="9" name="Picture 9"/>
+            <wp:cNvGraphicFramePr>
+              <a:graphicFrameLocks noChangeAspect="1"/>
+            </wp:cNvGraphicFramePr>
+            <a:graphic>
+              <a:graphicData uri="http://schemas.openxmlformats.org/drawingml/2006/picture">
+                <pic:pic>
+                  <pic:nvPicPr>
+                    <pic:cNvPr id="0" name="image.png"/>
+                    <pic:cNvPicPr/>
+                  </pic:nvPicPr>
+                  <pic:blipFill>
+                    <a:blip r:embed="rId11"/>
+                    <a:stretch>
+                      <a:fillRect/>
+                    </a:stretch>
+                  </pic:blipFill>
+                  <pic:spPr>
+                    <a:xfrm>
+                      <a:off x="0" y="0"/>
+                      <a:ext cx="5486400" cy="2941608"/>
+                    </a:xfrm>
+                    <a:prstGeom prst="rect"/>
+                  </pic:spPr>
+                </pic:pic>
+              </a:graphicData>
+            </a:graphic>
+          </wp:inline>
+        </w:drawing>
+      </w:r>
+    </w:p>
+    <w:p/>
+    <w:p>
+      <w:r>
+        <w:rPr>
+          <w:b/>
+          <w:sz w:val="17"/>
+        </w:rPr>
+        <w:t>Figura 3: Tabla de procesos mostrando diferentes estados: procesos en estado NUEVO, LISTO, EJECUCION y BLOQUEADO con sus respectivos iconos.</w:t>
+      </w:r>
+    </w:p>
+    <w:p/>
+    <w:p/>
+    <w:p>
+      <w:pPr>
+        <w:jc w:val="center"/>
+      </w:pPr>
+      <w:r>
+        <w:drawing>
+          <wp:inline xmlns:a="http://schemas.openxmlformats.org/drawingml/2006/main" xmlns:pic="http://schemas.openxmlformats.org/drawingml/2006/picture">
+            <wp:extent cx="5486400" cy="13937876"/>
+            <wp:docPr id="8" name="Picture 8"/>
+            <wp:cNvGraphicFramePr>
+              <a:graphicFrameLocks noChangeAspect="1"/>
+            </wp:cNvGraphicFramePr>
+            <a:graphic>
+              <a:graphicData uri="http://schemas.openxmlformats.org/drawingml/2006/picture">
+                <pic:pic>
+                  <pic:nvPicPr>
+                    <pic:cNvPr id="0" name="image.png"/>
+                    <pic:cNvPicPr/>
+                  </pic:nvPicPr>
+                  <pic:blipFill>
+                    <a:blip r:embed="rId10"/>
+                    <a:stretch>
+                      <a:fillRect/>
+                    </a:stretch>
+                  </pic:blipFill>
+                  <pic:spPr>
+                    <a:xfrm>
+                      <a:off x="0" y="0"/>
+                      <a:ext cx="5486400" cy="13937876"/>
+                    </a:xfrm>
+                    <a:prstGeom prst="rect"/>
+                  </pic:spPr>
+                </pic:pic>
+              </a:graphicData>
+            </a:graphic>
+          </wp:inline>
+        </w:drawing>
+      </w:r>
+    </w:p>
+    <w:p/>
+    <w:p>
+      <w:r>
+        <w:rPr>
+          <w:b/>
+          <w:sz w:val="17"/>
+        </w:rPr>
+        <w:t>Figura 2: Panel de configuración detallado con todos los controles: configuración de memoria, selección de algoritmo, quantum, estrategia de memoria y botones de acción.</w:t>
+      </w:r>
+    </w:p>
+    <w:p/>
+    <w:p/>
+    <w:p>
+      <w:pPr>
+        <w:jc w:val="center"/>
+      </w:pPr>
+      <w:r>
+        <w:drawing>
+          <wp:inline xmlns:a="http://schemas.openxmlformats.org/drawingml/2006/main" xmlns:pic="http://schemas.openxmlformats.org/drawingml/2006/picture">
+            <wp:extent cx="6400800" cy="3598991"/>
+            <wp:docPr id="7" name="Picture 7"/>
+            <wp:cNvGraphicFramePr>
+              <a:graphicFrameLocks noChangeAspect="1"/>
+            </wp:cNvGraphicFramePr>
+            <a:graphic>
+              <a:graphicData uri="http://schemas.openxmlformats.org/drawingml/2006/picture">
+                <pic:pic>
+                  <pic:nvPicPr>
+                    <pic:cNvPr id="0" name="image.png"/>
+                    <pic:cNvPicPr/>
+                  </pic:nvPicPr>
+                  <pic:blipFill>
+                    <a:blip r:embed="rId9"/>
+                    <a:stretch>
+                      <a:fillRect/>
+                    </a:stretch>
+                  </pic:blipFill>
+                  <pic:spPr>
+                    <a:xfrm>
+                      <a:off x="0" y="0"/>
+                      <a:ext cx="6400800" cy="3598991"/>
+                    </a:xfrm>
+                    <a:prstGeom prst="rect"/>
+                  </pic:spPr>
+                </pic:pic>
+              </a:graphicData>
+            </a:graphic>
+          </wp:inline>
+        </w:drawing>
+      </w:r>
+    </w:p>
+    <w:p/>
+    <w:p>
+      <w:r>
+        <w:rPr>
+          <w:b/>
+          <w:sz w:val="17"/>
+        </w:rPr>
+        <w:t>Figura 1: Vista completa de la interfaz mostrando todos los paneles: configuración, tabla de procesos, visualización de memoria, gráfico de Gantt y log de eventos.</w:t>
+      </w:r>
+    </w:p>
+    <w:p/>
+    <w:p>
+      <w:r>
+        <w:t>A continuación se presentan capturas de pantalla de los diferentes componentes de la interfaz del simulador:</w:t>
+      </w:r>
+    </w:p>
+    <w:p>
+      <w:pPr>
+        <w:pStyle w:val="Heading3"/>
+      </w:pPr>
+      <w:r>
+        <w:t>3.3 Capturas de Pantalla de la Interfaz</w:t>
+      </w:r>
+    </w:p>
+    <w:p/>
+    <w:p>
+      <w:pPr>
+        <w:pStyle w:val="Heading3"/>
+      </w:pPr>
+      <w:r>
+        <w:t>3.3 Capturas de Pantalla de la Interfaz</w:t>
+      </w:r>
+    </w:p>
+    <w:p/>
+    <w:p>
       <w:pPr>
         <w:pStyle w:val="Heading2"/>
       </w:pPr>
@@ -3306,6 +3947,12 @@
         <w:t>Verifica valores numéricos, valida que sean mayores a 0, muestra mensaje de confirmación antes de crear.</w:t>
       </w:r>
     </w:p>
+    <w:p>
+      <w:r>
+        <w:t>3.3 Capturas de Pantalla de la Interfaz</w:t>
+      </w:r>
+    </w:p>
+    <w:p/>
     <w:p>
       <w:pPr>
         <w:pStyle w:val="Heading2"/>
@@ -4919,28 +5566,6 @@
     <w:p>
       <w:r>
         <w:br w:type="page"/>
-      </w:r>
-    </w:p>
-    <w:p>
-      <w:pPr>
-        <w:pStyle w:val="Heading1"/>
-      </w:pPr>
-      <w:r>
-        <w:t>7. IMÁGENES DE LA INTERFAZ</w:t>
-      </w:r>
-    </w:p>
-    <w:p>
-      <w:r>
-        <w:t>A continuación se listan las imágenes que deben capturarse de la interfaz para completar la documentación:</w:t>
-      </w:r>
-    </w:p>
-    <w:p/>
-    <w:p>
-      <w:pPr>
-        <w:pStyle w:val="Heading2"/>
-      </w:pPr>
-      <w:r>
-        <w:t>7.1 Lista de Imágenes Requeridas</w:t>
       </w:r>
     </w:p>
     <w:tbl>
@@ -5352,82 +5977,6 @@
         </w:tc>
       </w:tr>
     </w:tbl>
-    <w:p/>
-    <w:p>
-      <w:pPr>
-        <w:pStyle w:val="Heading2"/>
-      </w:pPr>
-      <w:r>
-        <w:t>7.2 Instrucciones para Capturar Imágenes</w:t>
-      </w:r>
-    </w:p>
-    <w:p>
-      <w:r>
-        <w:t>Para capturar las imágenes de la interfaz:</w:t>
-      </w:r>
-    </w:p>
-    <w:p>
-      <w:pPr>
-        <w:pStyle w:val="ListNumber"/>
-      </w:pPr>
-      <w:r>
-        <w:t>1. Ejecutar el simulador: python main.py</w:t>
-      </w:r>
-    </w:p>
-    <w:p>
-      <w:pPr>
-        <w:pStyle w:val="ListNumber"/>
-      </w:pPr>
-      <w:r>
-        <w:t>2. Configurar parámetros iniciales (memoria, algoritmo, etc.)</w:t>
-      </w:r>
-    </w:p>
-    <w:p>
-      <w:pPr>
-        <w:pStyle w:val="ListNumber"/>
-      </w:pPr>
-      <w:r>
-        <w:t>3. Crear algunos procesos (manual o test automático)</w:t>
-      </w:r>
-    </w:p>
-    <w:p>
-      <w:pPr>
-        <w:pStyle w:val="ListNumber"/>
-      </w:pPr>
-      <w:r>
-        <w:t>4. Iniciar la simulación</w:t>
-      </w:r>
-    </w:p>
-    <w:p>
-      <w:pPr>
-        <w:pStyle w:val="ListNumber"/>
-      </w:pPr>
-      <w:r>
-        <w:t>5. Usar herramienta de captura de pantalla (Snipping Tool, Print Screen, etc.)</w:t>
-      </w:r>
-    </w:p>
-    <w:p>
-      <w:pPr>
-        <w:pStyle w:val="ListNumber"/>
-      </w:pPr>
-      <w:r>
-        <w:t>6. Guardar las imágenes con los nombres especificados en formato PNG</w:t>
-      </w:r>
-    </w:p>
-    <w:p>
-      <w:pPr>
-        <w:pStyle w:val="ListNumber"/>
-      </w:pPr>
-      <w:r>
-        <w:t>7. Insertar las imágenes en el documento Word en las secciones correspondientes</w:t>
-      </w:r>
-    </w:p>
-    <w:p/>
-    <w:p>
-      <w:r>
-        <w:t>NOTA: Las imágenes deben tener buena resolución y mostrar claramente los elementos de la interfaz. Se recomienda usar formato PNG para mantener calidad.</w:t>
-      </w:r>
-    </w:p>
     <w:sectPr>
       <w:pgSz w:w="12240" w:h="15840"/>
       <w:pgMar w:top="1417" w:right="1701" w:bottom="1417" w:left="1701" w:header="720" w:footer="720" w:gutter="0"/>

</xml_diff>